<commit_message>
Write doc.docx in English, and keep the Sinhala version buildable
The ten-step explanation now builds in either language from the same
script: no argument gives doc.docx in English, "si" gives
doc_sinhala.docx. Neither version is lost when the other is wanted.

The English text is not a translation of the Sinhala sentence by
sentence — it is the same explanation written for the same reader, which
means the analogies survive but the phrasing is native rather than
carried across. The rice pot, the phone battery, the restaurant with one
dish left and the drink-driving rule all remain, because those are what
made each idea land.

Nine figures checked against the result files, none retyped, and a check
confirms no Sinhala characters survived into the English file.
</commit_message>
<xml_diff>
--- a/doc.docx
+++ b/doc.docx
@@ -9,13 +9,13 @@
       </w:pPr>
       <w:r>
         <w:rPr>
-          <w:rFonts w:ascii="Nirmala UI" w:hAnsi="Nirmala UI" w:cs="Nirmala UI"/>
+          <w:rFonts w:ascii="Segoe UI" w:hAnsi="Segoe UI" w:cs="Segoe UI"/>
           <w:b/>
           <w:i w:val="0"/>
           <w:color w:val="1F4E79"/>
           <w:sz w:val="44"/>
         </w:rPr>
-        <w:t>මගේ පර්යේෂණය — මුල ඉඳන්</w:t>
+        <w:t>My Research — From the Beginning</w:t>
       </w:r>
     </w:p>
     <w:p>
@@ -25,13 +25,13 @@
       </w:pPr>
       <w:r>
         <w:rPr>
-          <w:rFonts w:ascii="Nirmala UI" w:hAnsi="Nirmala UI" w:cs="Nirmala UI"/>
+          <w:rFonts w:ascii="Segoe UI" w:hAnsi="Segoe UI" w:cs="Segoe UI"/>
           <w:b w:val="0"/>
           <w:i w:val="0"/>
           <w:color w:val="555555"/>
           <w:sz w:val="24"/>
         </w:rPr>
-        <w:t>Industry 5.0 සඳහා මිනිසා සහ යන්ත්‍රය එකට ආකෘතිගත කරන Digital Twin රාමුවක්</w:t>
+        <w:t>A digital twin framework that models the machine and the person together, for Industry 5.0</w:t>
       </w:r>
     </w:p>
     <w:p>
@@ -41,13 +41,13 @@
       </w:pPr>
       <w:r>
         <w:rPr>
-          <w:rFonts w:ascii="Nirmala UI" w:hAnsi="Nirmala UI" w:cs="Nirmala UI"/>
+          <w:rFonts w:ascii="Segoe UI" w:hAnsi="Segoe UI" w:cs="Segoe UI"/>
           <w:b w:val="0"/>
           <w:i/>
           <w:color w:val="555555"/>
           <w:sz w:val="21"/>
         </w:rPr>
-        <w:t>Chamini Maduwanthi  ·  පියවර 10කින්, සරලව</w:t>
+        <w:t>Chamini Maduwanthi   ·   explained in ten steps</w:t>
       </w:r>
     </w:p>
     <w:p>
@@ -58,13 +58,13 @@
       </w:pPr>
       <w:r>
         <w:rPr>
-          <w:rFonts w:ascii="Nirmala UI" w:hAnsi="Nirmala UI" w:cs="Nirmala UI"/>
+          <w:rFonts w:ascii="Segoe UI" w:hAnsi="Segoe UI" w:cs="Segoe UI"/>
           <w:b/>
           <w:i w:val="0"/>
           <w:color w:val="1F4E79"/>
           <w:sz w:val="22"/>
         </w:rPr>
-        <w:t>මේක කාටද?</w:t>
+        <w:t>Who is this for?</w:t>
       </w:r>
     </w:p>
     <w:p>
@@ -75,13 +75,13 @@
       </w:pPr>
       <w:r>
         <w:rPr>
-          <w:rFonts w:ascii="Nirmala UI" w:hAnsi="Nirmala UI" w:cs="Nirmala UI"/>
+          <w:rFonts w:ascii="Segoe UI" w:hAnsi="Segoe UI" w:cs="Segoe UI"/>
           <w:b w:val="0"/>
           <w:i w:val="0"/>
           <w:color w:val="1F4E79"/>
           <w:sz w:val="22"/>
         </w:rPr>
-        <w:t>පරිගණක විද්‍යාව හෝ කර්මාන්ත ඉංජිනේරු විද්‍යාව ගැන කිසිවක් නොදන්නා කෙනෙකුට තේරෙන විදිහට ලියා ඇත. පියවර 10ම පිළිවෙලට කියවන්න.</w:t>
+        <w:t>Anyone with no background in computing or industrial engineering. Read the ten steps in order; each one builds on the last.</w:t>
       </w:r>
     </w:p>
     <w:p>
@@ -90,28 +90,28 @@
       </w:pPr>
       <w:r>
         <w:rPr>
-          <w:rFonts w:ascii="Nirmala UI" w:hAnsi="Nirmala UI" w:cs="Nirmala UI"/>
+          <w:rFonts w:ascii="Segoe UI" w:hAnsi="Segoe UI" w:cs="Segoe UI"/>
           <w:b/>
           <w:i w:val="0"/>
           <w:color w:val="1F4E79"/>
           <w:sz w:val="32"/>
         </w:rPr>
-        <w:t xml:space="preserve">1️⃣   </w:t>
+        <w:t xml:space="preserve">1   </w:t>
       </w:r>
       <w:r>
         <w:rPr>
-          <w:rFonts w:ascii="Nirmala UI" w:hAnsi="Nirmala UI" w:cs="Nirmala UI"/>
+          <w:rFonts w:ascii="Segoe UI" w:hAnsi="Segoe UI" w:cs="Segoe UI"/>
           <w:b/>
           <w:i w:val="0"/>
           <w:color w:val="1F4E79"/>
           <w:sz w:val="30"/>
         </w:rPr>
-        <w:t>ප්‍රශ්නය මොකක්ද?</w:t>
+        <w:t>What is the problem?</w:t>
       </w:r>
     </w:p>
     <w:p>
       <w:pPr>
-        <w:spacing w:after="160" w:before="0"/>
+        <w:spacing w:after="160"/>
         <w:pBdr>
           <w:bottom w:val="single" w:sz="6" w:color="1F4E79"/>
         </w:pBdr>
@@ -123,13 +123,13 @@
       </w:pPr>
       <w:r>
         <w:rPr>
-          <w:rFonts w:ascii="Nirmala UI" w:hAnsi="Nirmala UI" w:cs="Nirmala UI"/>
+          <w:rFonts w:ascii="Segoe UI" w:hAnsi="Segoe UI" w:cs="Segoe UI"/>
           <w:b w:val="0"/>
           <w:i w:val="0"/>
           <w:color w:val="1A1A1A"/>
           <w:sz w:val="22"/>
         </w:rPr>
-        <w:t>කර්මාන්තශාලාවක් හිතන්න. යන්ත්‍ර 5ක්. සේවකයෝ 3ක්.</w:t>
+        <w:t>Picture a small factory. Five machines. Three workers.</w:t>
       </w:r>
     </w:p>
     <w:p>
@@ -138,13 +138,13 @@
       </w:pPr>
       <w:r>
         <w:rPr>
-          <w:rFonts w:ascii="Nirmala UI" w:hAnsi="Nirmala UI" w:cs="Nirmala UI"/>
+          <w:rFonts w:ascii="Segoe UI" w:hAnsi="Segoe UI" w:cs="Segoe UI"/>
           <w:b w:val="0"/>
           <w:i w:val="0"/>
           <w:color w:val="1A1A1A"/>
           <w:sz w:val="22"/>
         </w:rPr>
-        <w:t>හැම විනාඩි 15කට වරක්ම කවුරුහරි තීරණයක් ගන්න ඕන:</w:t>
+        <w:t>Every fifteen minutes, somebody has to make a decision:</w:t>
       </w:r>
     </w:p>
     <w:p>
@@ -155,13 +155,13 @@
       </w:pPr>
       <w:r>
         <w:rPr>
-          <w:rFonts w:ascii="Nirmala UI" w:hAnsi="Nirmala UI" w:cs="Nirmala UI"/>
+          <w:rFonts w:ascii="Segoe UI" w:hAnsi="Segoe UI" w:cs="Segoe UI"/>
           <w:b/>
           <w:i w:val="0"/>
           <w:color w:val="1A1A1A"/>
           <w:sz w:val="22"/>
         </w:rPr>
-        <w:t>“මේ අලුත් වැඩේ කාට දෙනවද? කුමන යන්ත්‍රයටද?”</w:t>
+        <w:t>“This new job — who should do it, and on which machine?”</w:t>
       </w:r>
     </w:p>
     <w:p>
@@ -170,13 +170,13 @@
       </w:pPr>
       <w:r>
         <w:rPr>
-          <w:rFonts w:ascii="Nirmala UI" w:hAnsi="Nirmala UI" w:cs="Nirmala UI"/>
+          <w:rFonts w:ascii="Segoe UI" w:hAnsi="Segoe UI" w:cs="Segoe UI"/>
           <w:b w:val="0"/>
           <w:i w:val="0"/>
           <w:color w:val="1A1A1A"/>
           <w:sz w:val="22"/>
         </w:rPr>
-        <w:t>සරලයි වගේ පේනවා. ඒත් ඒ එක තීරණයෙන් එකවර දේවල් තුනක් තීරණය වෙනවා:</w:t>
+        <w:t>It sounds simple. But that single decision settles three things at once:</w:t>
       </w:r>
     </w:p>
     <w:p>
@@ -193,7 +193,7 @@
           <w:color w:val="222222"/>
           <w:sz w:val="19"/>
         </w:rPr>
-        <w:t>👷   ඒ මිනිසා කොච්චර වෙහෙසෙනවද</w:t>
+        <w:t>PEOPLE   how tired that person becomes</w:t>
       </w:r>
     </w:p>
     <w:p>
@@ -210,7 +210,7 @@
           <w:color w:val="222222"/>
           <w:sz w:val="19"/>
         </w:rPr>
-        <w:t>🌱   කොච්චර විදුලියක් යනවද, කොච්චර නාස්ති වෙනවද</w:t>
+        <w:t>PLANET   how much electricity is used, how much is wasted</w:t>
       </w:r>
     </w:p>
     <w:p>
@@ -227,7 +227,7 @@
           <w:color w:val="222222"/>
           <w:sz w:val="19"/>
         </w:rPr>
-        <w:t>💰   කොච්චර නිෂ්පාදනය වෙනවද</w:t>
+        <w:t>PROFIT   how much gets produced</w:t>
       </w:r>
     </w:p>
     <w:p>
@@ -238,13 +238,13 @@
       </w:pPr>
       <w:r>
         <w:rPr>
-          <w:rFonts w:ascii="Nirmala UI" w:hAnsi="Nirmala UI" w:cs="Nirmala UI"/>
+          <w:rFonts w:ascii="Segoe UI" w:hAnsi="Segoe UI" w:cs="Segoe UI"/>
           <w:b/>
           <w:i w:val="0"/>
           <w:color w:val="B03A2B"/>
           <w:sz w:val="22"/>
         </w:rPr>
-        <w:t>දැන් තියෙන පරිගණක ක්‍රම බලන්නේ අන්තිම එක විතරයි — නිෂ්පාදනය.</w:t>
+        <w:t>Today's scheduling systems look at the third one only — output.</w:t>
       </w:r>
     </w:p>
     <w:p>
@@ -255,13 +255,13 @@
       </w:pPr>
       <w:r>
         <w:rPr>
-          <w:rFonts w:ascii="Nirmala UI" w:hAnsi="Nirmala UI" w:cs="Nirmala UI"/>
+          <w:rFonts w:ascii="Segoe UI" w:hAnsi="Segoe UI" w:cs="Segoe UI"/>
           <w:b w:val="0"/>
           <w:i w:val="0"/>
           <w:color w:val="B03A2B"/>
           <w:sz w:val="22"/>
         </w:rPr>
-        <w:t>මිනිසා ගැන බලන්නේ නෑ.</w:t>
+        <w:t>They do not look at the person at all.</w:t>
       </w:r>
     </w:p>
     <w:p>
@@ -270,13 +270,13 @@
       </w:pPr>
       <w:r>
         <w:rPr>
-          <w:rFonts w:ascii="Nirmala UI" w:hAnsi="Nirmala UI" w:cs="Nirmala UI"/>
+          <w:rFonts w:ascii="Segoe UI" w:hAnsi="Segoe UI" w:cs="Segoe UI"/>
           <w:b/>
           <w:i w:val="0"/>
           <w:color w:val="1A1A1A"/>
           <w:sz w:val="24"/>
         </w:rPr>
-        <w:t>ඇයි විනාඩි 15?</w:t>
+        <w:t>Why fifteen minutes?</w:t>
       </w:r>
     </w:p>
     <w:p>
@@ -285,13 +285,13 @@
       </w:pPr>
       <w:r>
         <w:rPr>
-          <w:rFonts w:ascii="Nirmala UI" w:hAnsi="Nirmala UI" w:cs="Nirmala UI"/>
+          <w:rFonts w:ascii="Segoe UI" w:hAnsi="Segoe UI" w:cs="Segoe UI"/>
           <w:b w:val="0"/>
           <w:i w:val="0"/>
           <w:color w:val="1A1A1A"/>
           <w:sz w:val="22"/>
         </w:rPr>
-        <w:t>බත් හැළිය කොච්චර වෙලාවකට වරක් බලනවද? තත්පර 10කට වරක් නම් නාස්තියි — කිසිවක් වෙනස් වෙලා නෑ. පැයකට වරක් නම් පිච්චිලා ඉවරයි. විනාඩි 10–15 හරි.</w:t>
+        <w:t>Think of checking a pot of rice. Every ten seconds is wasted effort — nothing has changed. Once an hour and it has burnt. Every ten or fifteen minutes is about right.</w:t>
       </w:r>
     </w:p>
     <w:p>
@@ -300,13 +300,13 @@
       </w:pPr>
       <w:r>
         <w:rPr>
-          <w:rFonts w:ascii="Nirmala UI" w:hAnsi="Nirmala UI" w:cs="Nirmala UI"/>
+          <w:rFonts w:ascii="Segoe UI" w:hAnsi="Segoe UI" w:cs="Segoe UI"/>
           <w:b w:val="0"/>
           <w:i w:val="0"/>
           <w:color w:val="1A1A1A"/>
           <w:sz w:val="22"/>
         </w:rPr>
-        <w:t>අපේ කර්මාන්තශාලාවේත් එහෙමයි: වැඩක් ගන්න විනාඩි 8–18ක් යනවා, සහ වෙහෙස වෙනස් වෙන්නත් විනාඩි 15ක් විතර යනවා. විනාඩි 1ක් නම් නාස්තියි; පැයක් නම් මිනිහෙක් වෙහෙසිලා ඉවර වුණත් අපි දැනගන්නේ පරක්කු වෙලා.</w:t>
+        <w:t>The factory is the same. A job takes eight to eighteen minutes, and tiredness takes about fifteen minutes to change noticeably. Deciding every minute would be pointless; deciding once an hour would mean somebody passes their limit and nobody notices until far too late.</w:t>
       </w:r>
     </w:p>
     <w:p>
@@ -315,13 +315,13 @@
       </w:pPr>
       <w:r>
         <w:rPr>
-          <w:rFonts w:ascii="Nirmala UI" w:hAnsi="Nirmala UI" w:cs="Nirmala UI"/>
+          <w:rFonts w:ascii="Segoe UI" w:hAnsi="Segoe UI" w:cs="Segoe UI"/>
           <w:b w:val="0"/>
           <w:i/>
           <w:color w:val="555555"/>
           <w:sz w:val="22"/>
         </w:rPr>
-        <w:t>පැය 8 = විනාඩි 480.  480 ÷ 15 = දවසකට තීරණ 32ක්.</w:t>
+        <w:t>An eight-hour shift is 480 minutes. 480 ÷ 15 = 32 decisions per day.</w:t>
       </w:r>
     </w:p>
     <w:p>
@@ -330,28 +330,28 @@
       </w:pPr>
       <w:r>
         <w:rPr>
-          <w:rFonts w:ascii="Nirmala UI" w:hAnsi="Nirmala UI" w:cs="Nirmala UI"/>
+          <w:rFonts w:ascii="Segoe UI" w:hAnsi="Segoe UI" w:cs="Segoe UI"/>
           <w:b/>
           <w:i w:val="0"/>
           <w:color w:val="1F4E79"/>
           <w:sz w:val="32"/>
         </w:rPr>
-        <w:t xml:space="preserve">2️⃣   </w:t>
+        <w:t xml:space="preserve">2   </w:t>
       </w:r>
       <w:r>
         <w:rPr>
-          <w:rFonts w:ascii="Nirmala UI" w:hAnsi="Nirmala UI" w:cs="Nirmala UI"/>
+          <w:rFonts w:ascii="Segoe UI" w:hAnsi="Segoe UI" w:cs="Segoe UI"/>
           <w:b/>
           <w:i w:val="0"/>
           <w:color w:val="1F4E79"/>
           <w:sz w:val="30"/>
         </w:rPr>
-        <w:t>Industry 4.0 සහ Industry 5.0</w:t>
+        <w:t>Industry 4.0 and Industry 5.0</w:t>
       </w:r>
     </w:p>
     <w:p>
       <w:pPr>
-        <w:spacing w:after="160" w:before="0"/>
+        <w:spacing w:after="160"/>
         <w:pBdr>
           <w:bottom w:val="single" w:sz="6" w:color="1F4E79"/>
         </w:pBdr>
@@ -386,10 +386,18 @@
               <w:spacing w:after="40" w:before="40"/>
               <w:shd w:val="clear" w:fill="1F4E79"/>
             </w:pPr>
-            <w:r/>
             <w:r>
               <w:rPr>
-                <w:rFonts w:ascii="Nirmala UI" w:hAnsi="Nirmala UI" w:cs="Nirmala UI"/>
+                <w:rFonts w:ascii="Segoe UI" w:hAnsi="Segoe UI" w:cs="Segoe UI"/>
+                <w:b w:val="0"/>
+                <w:i w:val="0"/>
+                <w:color w:val="1A1A1A"/>
+                <w:sz w:val="20"/>
+              </w:rPr>
+            </w:r>
+            <w:r>
+              <w:rPr>
+                <w:rFonts w:ascii="Segoe UI" w:hAnsi="Segoe UI" w:cs="Segoe UI"/>
                 <w:b/>
                 <w:i w:val="0"/>
                 <w:color w:val="FFFFFF"/>
@@ -408,16 +416,24 @@
               <w:spacing w:after="40" w:before="40"/>
               <w:shd w:val="clear" w:fill="1F4E79"/>
             </w:pPr>
-            <w:r/>
             <w:r>
               <w:rPr>
-                <w:rFonts w:ascii="Nirmala UI" w:hAnsi="Nirmala UI" w:cs="Nirmala UI"/>
+                <w:rFonts w:ascii="Segoe UI" w:hAnsi="Segoe UI" w:cs="Segoe UI"/>
+                <w:b w:val="0"/>
+                <w:i w:val="0"/>
+                <w:color w:val="1A1A1A"/>
+                <w:sz w:val="20"/>
+              </w:rPr>
+            </w:r>
+            <w:r>
+              <w:rPr>
+                <w:rFonts w:ascii="Segoe UI" w:hAnsi="Segoe UI" w:cs="Segoe UI"/>
                 <w:b/>
                 <w:i w:val="0"/>
                 <w:color w:val="FFFFFF"/>
                 <w:sz w:val="20"/>
               </w:rPr>
-              <w:t>අදහස</w:t>
+              <w:t>The idea</w:t>
             </w:r>
           </w:p>
         </w:tc>
@@ -431,10 +447,18 @@
             <w:pPr>
               <w:spacing w:after="40" w:before="40"/>
             </w:pPr>
-            <w:r/>
             <w:r>
               <w:rPr>
-                <w:rFonts w:ascii="Nirmala UI" w:hAnsi="Nirmala UI" w:cs="Nirmala UI"/>
+                <w:rFonts w:ascii="Segoe UI" w:hAnsi="Segoe UI" w:cs="Segoe UI"/>
+                <w:b w:val="0"/>
+                <w:i w:val="0"/>
+                <w:color w:val="1A1A1A"/>
+                <w:sz w:val="20"/>
+              </w:rPr>
+            </w:r>
+            <w:r>
+              <w:rPr>
+                <w:rFonts w:ascii="Segoe UI" w:hAnsi="Segoe UI" w:cs="Segoe UI"/>
                 <w:b w:val="0"/>
                 <w:i w:val="0"/>
                 <w:color w:val="1A1A1A"/>
@@ -452,16 +476,24 @@
             <w:pPr>
               <w:spacing w:after="40" w:before="40"/>
             </w:pPr>
-            <w:r/>
             <w:r>
               <w:rPr>
-                <w:rFonts w:ascii="Nirmala UI" w:hAnsi="Nirmala UI" w:cs="Nirmala UI"/>
+                <w:rFonts w:ascii="Segoe UI" w:hAnsi="Segoe UI" w:cs="Segoe UI"/>
                 <w:b w:val="0"/>
                 <w:i w:val="0"/>
                 <w:color w:val="1A1A1A"/>
                 <w:sz w:val="20"/>
               </w:rPr>
-              <w:t>“හැම දෙයක්ම automatic කරමු, ඉක්මන් කරමු” — කාර්යක්ෂමතාවය</w:t>
+            </w:r>
+            <w:r>
+              <w:rPr>
+                <w:rFonts w:ascii="Segoe UI" w:hAnsi="Segoe UI" w:cs="Segoe UI"/>
+                <w:b w:val="0"/>
+                <w:i w:val="0"/>
+                <w:color w:val="1A1A1A"/>
+                <w:sz w:val="20"/>
+              </w:rPr>
+              <w:t>“Automate everything, make it faster.” — efficiency</w:t>
             </w:r>
           </w:p>
         </w:tc>
@@ -475,10 +507,18 @@
             <w:pPr>
               <w:spacing w:after="40" w:before="40"/>
             </w:pPr>
-            <w:r/>
             <w:r>
               <w:rPr>
-                <w:rFonts w:ascii="Nirmala UI" w:hAnsi="Nirmala UI" w:cs="Nirmala UI"/>
+                <w:rFonts w:ascii="Segoe UI" w:hAnsi="Segoe UI" w:cs="Segoe UI"/>
+                <w:b w:val="0"/>
+                <w:i w:val="0"/>
+                <w:color w:val="1A1A1A"/>
+                <w:sz w:val="20"/>
+              </w:rPr>
+            </w:r>
+            <w:r>
+              <w:rPr>
+                <w:rFonts w:ascii="Segoe UI" w:hAnsi="Segoe UI" w:cs="Segoe UI"/>
                 <w:b w:val="0"/>
                 <w:i w:val="0"/>
                 <w:color w:val="1A1A1A"/>
@@ -496,16 +536,24 @@
             <w:pPr>
               <w:spacing w:after="40" w:before="40"/>
             </w:pPr>
-            <w:r/>
             <w:r>
               <w:rPr>
-                <w:rFonts w:ascii="Nirmala UI" w:hAnsi="Nirmala UI" w:cs="Nirmala UI"/>
+                <w:rFonts w:ascii="Segoe UI" w:hAnsi="Segoe UI" w:cs="Segoe UI"/>
                 <w:b w:val="0"/>
                 <w:i w:val="0"/>
                 <w:color w:val="1A1A1A"/>
                 <w:sz w:val="20"/>
               </w:rPr>
-              <w:t>“හොඳයි… ඒත් කාටද ඒක? මිනිසාට හොඳද? පරිසරයට හොඳද?”</w:t>
+            </w:r>
+            <w:r>
+              <w:rPr>
+                <w:rFonts w:ascii="Segoe UI" w:hAnsi="Segoe UI" w:cs="Segoe UI"/>
+                <w:b w:val="0"/>
+                <w:i w:val="0"/>
+                <w:color w:val="1A1A1A"/>
+                <w:sz w:val="20"/>
+              </w:rPr>
+              <w:t>“Fine… but who is it for? Is it good for the person? For the planet?”</w:t>
             </w:r>
           </w:p>
         </w:tc>
@@ -522,13 +570,13 @@
       </w:pPr>
       <w:r>
         <w:rPr>
-          <w:rFonts w:ascii="Nirmala UI" w:hAnsi="Nirmala UI" w:cs="Nirmala UI"/>
+          <w:rFonts w:ascii="Segoe UI" w:hAnsi="Segoe UI" w:cs="Segoe UI"/>
           <w:b w:val="0"/>
           <w:i w:val="0"/>
           <w:color w:val="1A1A1A"/>
           <w:sz w:val="22"/>
         </w:rPr>
-        <w:t>යුරෝපා කොමිසමේ නිල නිර්වචනය අනුව Industry 5.0 හි කුලුනු තුනක් තියෙනවා: මිනිසා · පරිසරය · ඔරොත්තු දීම.</w:t>
+        <w:t>The European Commission's official definition gives Industry 5.0 three pillars: people, sustainability and resilience.</w:t>
       </w:r>
     </w:p>
     <w:p>
@@ -539,13 +587,13 @@
       </w:pPr>
       <w:r>
         <w:rPr>
-          <w:rFonts w:ascii="Nirmala UI" w:hAnsi="Nirmala UI" w:cs="Nirmala UI"/>
+          <w:rFonts w:ascii="Segoe UI" w:hAnsi="Segoe UI" w:cs="Segoe UI"/>
           <w:b/>
           <w:i w:val="0"/>
           <w:color w:val="1F4E79"/>
           <w:sz w:val="22"/>
         </w:rPr>
-        <w:t>උපමාව</w:t>
+        <w:t>An analogy</w:t>
       </w:r>
     </w:p>
     <w:p>
@@ -556,13 +604,13 @@
       </w:pPr>
       <w:r>
         <w:rPr>
-          <w:rFonts w:ascii="Nirmala UI" w:hAnsi="Nirmala UI" w:cs="Nirmala UI"/>
+          <w:rFonts w:ascii="Segoe UI" w:hAnsi="Segoe UI" w:cs="Segoe UI"/>
           <w:b w:val="0"/>
           <w:i w:val="0"/>
           <w:color w:val="1F4E79"/>
           <w:sz w:val="22"/>
         </w:rPr>
-        <w:t>Industry 4.0 = වේගවත්ම කාර් එක.</w:t>
+        <w:t>Industry 4.0 = the fastest car.</w:t>
       </w:r>
     </w:p>
     <w:p>
@@ -573,13 +621,13 @@
       </w:pPr>
       <w:r>
         <w:rPr>
-          <w:rFonts w:ascii="Nirmala UI" w:hAnsi="Nirmala UI" w:cs="Nirmala UI"/>
+          <w:rFonts w:ascii="Segoe UI" w:hAnsi="Segoe UI" w:cs="Segoe UI"/>
           <w:b w:val="0"/>
           <w:i w:val="0"/>
           <w:color w:val="1F4E79"/>
           <w:sz w:val="22"/>
         </w:rPr>
-        <w:t>Industry 5.0 = වේගවත්, ඒත් රියදුරාට ආරක්ෂිත, ඉන්ධන අඩු කාර් එක.</w:t>
+        <w:t>Industry 5.0 = a fast car that is also safe for the driver and uses less fuel.</w:t>
       </w:r>
     </w:p>
     <w:p>
@@ -588,28 +636,28 @@
       </w:pPr>
       <w:r>
         <w:rPr>
-          <w:rFonts w:ascii="Nirmala UI" w:hAnsi="Nirmala UI" w:cs="Nirmala UI"/>
+          <w:rFonts w:ascii="Segoe UI" w:hAnsi="Segoe UI" w:cs="Segoe UI"/>
           <w:b/>
           <w:i w:val="0"/>
           <w:color w:val="1F4E79"/>
           <w:sz w:val="32"/>
         </w:rPr>
-        <w:t xml:space="preserve">3️⃣   </w:t>
+        <w:t xml:space="preserve">3   </w:t>
       </w:r>
       <w:r>
         <w:rPr>
-          <w:rFonts w:ascii="Nirmala UI" w:hAnsi="Nirmala UI" w:cs="Nirmala UI"/>
+          <w:rFonts w:ascii="Segoe UI" w:hAnsi="Segoe UI" w:cs="Segoe UI"/>
           <w:b/>
           <w:i w:val="0"/>
           <w:color w:val="1F4E79"/>
           <w:sz w:val="30"/>
         </w:rPr>
-        <w:t>Digital Twin කියන්නේ මොකක්ද?</w:t>
+        <w:t>What is a digital twin?</w:t>
       </w:r>
     </w:p>
     <w:p>
       <w:pPr>
-        <w:spacing w:after="160" w:before="0"/>
+        <w:spacing w:after="160"/>
         <w:pBdr>
           <w:bottom w:val="single" w:sz="6" w:color="1F4E79"/>
         </w:pBdr>
@@ -623,13 +671,13 @@
       </w:pPr>
       <w:r>
         <w:rPr>
-          <w:rFonts w:ascii="Nirmala UI" w:hAnsi="Nirmala UI" w:cs="Nirmala UI"/>
+          <w:rFonts w:ascii="Segoe UI" w:hAnsi="Segoe UI" w:cs="Segoe UI"/>
           <w:b/>
           <w:i w:val="0"/>
           <w:color w:val="1F4E79"/>
           <w:sz w:val="22"/>
         </w:rPr>
-        <w:t>යමකගේ සජීවී පරිගණක පිටපතක්.</w:t>
+        <w:t>A live computer copy of something real.</w:t>
       </w:r>
     </w:p>
     <w:p>
@@ -646,7 +694,7 @@
           <w:color w:val="222222"/>
           <w:sz w:val="19"/>
         </w:rPr>
-        <w:t>ඇත්ත යන්ත්‍රය   ←→   පරිගණකයේ ඒකේ පිටපත</w:t>
+        <w:t>the real machine   &lt;--&gt;   its copy inside the computer</w:t>
       </w:r>
     </w:p>
     <w:p>
@@ -663,7 +711,7 @@
           <w:color w:val="222222"/>
           <w:sz w:val="19"/>
         </w:rPr>
-        <w:t xml:space="preserve">                     (sensor වලින් හැම විටම update වෙනවා)</w:t>
+        <w:t xml:space="preserve">                          (updated constantly from sensors)</w:t>
       </w:r>
     </w:p>
     <w:p>
@@ -672,13 +720,13 @@
       </w:pPr>
       <w:r>
         <w:rPr>
-          <w:rFonts w:ascii="Nirmala UI" w:hAnsi="Nirmala UI" w:cs="Nirmala UI"/>
+          <w:rFonts w:ascii="Segoe UI" w:hAnsi="Segoe UI" w:cs="Segoe UI"/>
           <w:b w:val="0"/>
           <w:i w:val="0"/>
           <w:color w:val="1A1A1A"/>
           <w:sz w:val="22"/>
         </w:rPr>
-        <w:t>උදාහරණය: ඔබේ ෆෝන් එකේ battery indicator එක. ඒක බැටරියේ digital twin එකක් — ඇත්ත බැටරියේ තත්ත්වය තිරයේ පෙන්නනවා. පිටපත බලලා “charge කරන්න ඕන” කියලා තීරණයක් ගන්න පුළුවන්.</w:t>
+        <w:t>Example: the battery indicator on your phone. That is a digital twin of the battery — the real battery's state, shown on screen. You look at the copy and decide “time to charge”. You never open the phone.</w:t>
       </w:r>
     </w:p>
     <w:p>
@@ -687,28 +735,28 @@
       </w:pPr>
       <w:r>
         <w:rPr>
-          <w:rFonts w:ascii="Nirmala UI" w:hAnsi="Nirmala UI" w:cs="Nirmala UI"/>
+          <w:rFonts w:ascii="Segoe UI" w:hAnsi="Segoe UI" w:cs="Segoe UI"/>
           <w:b/>
           <w:i w:val="0"/>
           <w:color w:val="1F4E79"/>
           <w:sz w:val="32"/>
         </w:rPr>
-        <w:t xml:space="preserve">4️⃣   </w:t>
+        <w:t xml:space="preserve">4   </w:t>
       </w:r>
       <w:r>
         <w:rPr>
-          <w:rFonts w:ascii="Nirmala UI" w:hAnsi="Nirmala UI" w:cs="Nirmala UI"/>
+          <w:rFonts w:ascii="Segoe UI" w:hAnsi="Segoe UI" w:cs="Segoe UI"/>
           <w:b/>
           <w:i w:val="0"/>
           <w:color w:val="1F4E79"/>
           <w:sz w:val="30"/>
         </w:rPr>
-        <w:t>අපේ පරතරය — කවුරුවත් නොකළ දේ</w:t>
+        <w:t>The gap — what nobody had done</w:t>
       </w:r>
     </w:p>
     <w:p>
       <w:pPr>
-        <w:spacing w:after="160" w:before="0"/>
+        <w:spacing w:after="160"/>
         <w:pBdr>
           <w:bottom w:val="single" w:sz="6" w:color="1F4E79"/>
         </w:pBdr>
@@ -720,13 +768,13 @@
       </w:pPr>
       <w:r>
         <w:rPr>
-          <w:rFonts w:ascii="Nirmala UI" w:hAnsi="Nirmala UI" w:cs="Nirmala UI"/>
+          <w:rFonts w:ascii="Segoe UI" w:hAnsi="Segoe UI" w:cs="Segoe UI"/>
           <w:b w:val="0"/>
           <w:i w:val="0"/>
           <w:color w:val="1A1A1A"/>
           <w:sz w:val="22"/>
         </w:rPr>
-        <w:t>Digital twin ගැන පර්යේෂණ ගොඩක් තියෙනවා. අපි studies 46ක් කියෙව්වා. ක්ෂේත්‍රය දෙකට බෙදිලා තියෙනවා:</w:t>
+        <w:t>There is plenty of research on digital twins. Reading 46 studies showed the field is split in two:</w:t>
       </w:r>
     </w:p>
     <w:p>
@@ -743,7 +791,7 @@
           <w:color w:val="222222"/>
           <w:sz w:val="19"/>
         </w:rPr>
-        <w:t>කණ්ඩායම A  ─  යන්ත්‍රයට twin එකක් හදනවා                    ✅</w:t>
+        <w:t>Group A  -  builds a twin of the machine                    YES</w:t>
       </w:r>
     </w:p>
     <w:p>
@@ -760,7 +808,24 @@
           <w:color w:val="222222"/>
           <w:sz w:val="19"/>
         </w:rPr>
-        <w:t xml:space="preserve">              මිනිසාට “නම, වයස, දක්ෂතාව” වගේ ස්ථිතික දේ    ❌</w:t>
+        <w:t xml:space="preserve">            represents the person by fixed facts:</w:t>
+      </w:r>
+    </w:p>
+    <w:p>
+      <w:pPr>
+        <w:spacing w:before="0" w:after="0"/>
+        <w:ind w:left="230"/>
+        <w:shd w:val="clear" w:fill="F4F4F2"/>
+      </w:pPr>
+      <w:r>
+        <w:rPr>
+          <w:rFonts w:ascii="Consolas" w:hAnsi="Consolas" w:cs="Consolas"/>
+          <w:b w:val="0"/>
+          <w:i w:val="0"/>
+          <w:color w:val="222222"/>
+          <w:sz w:val="19"/>
+        </w:rPr>
+        <w:t xml:space="preserve">            name, age, skill level                          NO</w:t>
       </w:r>
     </w:p>
     <w:p>
@@ -793,7 +858,7 @@
           <w:color w:val="222222"/>
           <w:sz w:val="19"/>
         </w:rPr>
-        <w:t>කණ්ඩායම B  ─  මිනිසාගේ වෙහෙස මනිනවා                        ✅</w:t>
+        <w:t>Group B  -  measures the person's tiredness                 YES</w:t>
       </w:r>
     </w:p>
     <w:p>
@@ -810,7 +875,7 @@
           <w:color w:val="222222"/>
           <w:sz w:val="19"/>
         </w:rPr>
-        <w:t xml:space="preserve">              ඒත් ඒක බලලා තීරණයක් ගන්නේ නෑ                  ❌</w:t>
+        <w:t xml:space="preserve">            but never uses it to make a decision            NO</w:t>
       </w:r>
     </w:p>
     <w:p>
@@ -821,13 +886,13 @@
       </w:pPr>
       <w:r>
         <w:rPr>
-          <w:rFonts w:ascii="Nirmala UI" w:hAnsi="Nirmala UI" w:cs="Nirmala UI"/>
+          <w:rFonts w:ascii="Segoe UI" w:hAnsi="Segoe UI" w:cs="Segoe UI"/>
           <w:b/>
           <w:i w:val="0"/>
           <w:color w:val="1F4E79"/>
           <w:sz w:val="22"/>
         </w:rPr>
-        <w:t>studies 46න් එකක්වත් තුනම එකට කරලා නෑ:</w:t>
+        <w:t>Not one of the 46 studies does all three at once:</w:t>
       </w:r>
     </w:p>
     <w:p>
@@ -838,13 +903,13 @@
       </w:pPr>
       <w:r>
         <w:rPr>
-          <w:rFonts w:ascii="Nirmala UI" w:hAnsi="Nirmala UI" w:cs="Nirmala UI"/>
+          <w:rFonts w:ascii="Segoe UI" w:hAnsi="Segoe UI" w:cs="Segoe UI"/>
           <w:b w:val="0"/>
           <w:i w:val="0"/>
           <w:color w:val="1F4E79"/>
           <w:sz w:val="22"/>
         </w:rPr>
-        <w:t>①  මිනිසාගේ සජීවී තත්ත්වය    ②  යන්ත්‍රයේ twin එක    ③  මනින ලද පාරිසරික ඉලක්ක</w:t>
+        <w:t>(1) the person's live state    (2) a machine twin    (3) measured environmental goals</w:t>
       </w:r>
     </w:p>
     <w:p>
@@ -855,13 +920,13 @@
       </w:pPr>
       <w:r>
         <w:rPr>
-          <w:rFonts w:ascii="Nirmala UI" w:hAnsi="Nirmala UI" w:cs="Nirmala UI"/>
+          <w:rFonts w:ascii="Segoe UI" w:hAnsi="Segoe UI" w:cs="Segoe UI"/>
           <w:b w:val="0"/>
           <w:i w:val="0"/>
           <w:color w:val="1F4E79"/>
           <w:sz w:val="22"/>
         </w:rPr>
-        <w:t>ඒක තමයි අපේ පරතරය.</w:t>
+        <w:t>That is the gap this research fills.</w:t>
       </w:r>
     </w:p>
     <w:p>
@@ -870,28 +935,28 @@
       </w:pPr>
       <w:r>
         <w:rPr>
-          <w:rFonts w:ascii="Nirmala UI" w:hAnsi="Nirmala UI" w:cs="Nirmala UI"/>
+          <w:rFonts w:ascii="Segoe UI" w:hAnsi="Segoe UI" w:cs="Segoe UI"/>
           <w:b/>
           <w:i w:val="0"/>
           <w:color w:val="1F4E79"/>
           <w:sz w:val="32"/>
         </w:rPr>
-        <w:t xml:space="preserve">5️⃣   </w:t>
+        <w:t xml:space="preserve">5   </w:t>
       </w:r>
       <w:r>
         <w:rPr>
-          <w:rFonts w:ascii="Nirmala UI" w:hAnsi="Nirmala UI" w:cs="Nirmala UI"/>
+          <w:rFonts w:ascii="Segoe UI" w:hAnsi="Segoe UI" w:cs="Segoe UI"/>
           <w:b/>
           <w:i w:val="0"/>
           <w:color w:val="1F4E79"/>
           <w:sz w:val="30"/>
         </w:rPr>
-        <w:t>අපි හදපු දේ — කෑලි 4කින්</w:t>
+        <w:t>What was built — in four pieces</w:t>
       </w:r>
     </w:p>
     <w:p>
       <w:pPr>
-        <w:spacing w:after="160" w:before="0"/>
+        <w:spacing w:after="160"/>
         <w:pBdr>
           <w:bottom w:val="single" w:sz="6" w:color="1F4E79"/>
         </w:pBdr>
@@ -903,13 +968,13 @@
       </w:pPr>
       <w:r>
         <w:rPr>
-          <w:rFonts w:ascii="Nirmala UI" w:hAnsi="Nirmala UI" w:cs="Nirmala UI"/>
+          <w:rFonts w:ascii="Segoe UI" w:hAnsi="Segoe UI" w:cs="Segoe UI"/>
           <w:b/>
           <w:i w:val="0"/>
           <w:color w:val="1A1A1A"/>
           <w:sz w:val="24"/>
         </w:rPr>
-        <w:t>🔧  කෑල්ල 1 — යන්ත්‍රයේ Twin එක</w:t>
+        <w:t>Piece 1 — the machine's twin</w:t>
       </w:r>
     </w:p>
     <w:p>
@@ -918,13 +983,13 @@
       </w:pPr>
       <w:r>
         <w:rPr>
-          <w:rFonts w:ascii="Nirmala UI" w:hAnsi="Nirmala UI" w:cs="Nirmala UI"/>
+          <w:rFonts w:ascii="Segoe UI" w:hAnsi="Segoe UI" w:cs="Segoe UI"/>
           <w:b w:val="0"/>
           <w:i w:val="0"/>
           <w:color w:val="1A1A1A"/>
           <w:sz w:val="22"/>
         </w:rPr>
-        <w:t>යන්ත්‍රයක් ගැන දේවල් 5ක් මතක තියාගන්නවා: සෞඛ්‍යය · විදුලිය · දෝෂ අවදානම · ලබාගත හැකිද · භාවිතය.</w:t>
+        <w:t>Each machine keeps track of five things: health, energy use, defect risk, whether it is available, and how busy it has been.</w:t>
       </w:r>
     </w:p>
     <w:p>
@@ -941,7 +1006,24 @@
           <w:color w:val="222222"/>
           <w:sz w:val="19"/>
         </w:rPr>
-        <w:t>යන්ත්‍රයක් ඉවර වෙන්නේ 216 විනාඩියක වැඩෙන් (ඇත්ත දත්තවලින්)</w:t>
+        <w:t>a machine wears out after 216 minutes of work</w:t>
+      </w:r>
+    </w:p>
+    <w:p>
+      <w:pPr>
+        <w:spacing w:before="0" w:after="0"/>
+        <w:ind w:left="230"/>
+        <w:shd w:val="clear" w:fill="F4F4F2"/>
+      </w:pPr>
+      <w:r>
+        <w:rPr>
+          <w:rFonts w:ascii="Consolas" w:hAnsi="Consolas" w:cs="Consolas"/>
+          <w:b w:val="0"/>
+          <w:i w:val="0"/>
+          <w:color w:val="222222"/>
+          <w:sz w:val="19"/>
+        </w:rPr>
+        <w:t xml:space="preserve">                          (taken from real maintenance data)</w:t>
       </w:r>
     </w:p>
     <w:p>
@@ -974,7 +1056,7 @@
           <w:color w:val="222222"/>
           <w:sz w:val="19"/>
         </w:rPr>
-        <w:t>සැහැල්ලු වැඩ දුන්නොත්  →  291 විනාඩි යනවා     🙂</w:t>
+        <w:t>give it light work  -&gt;  291 minutes           :)</w:t>
       </w:r>
     </w:p>
     <w:p>
@@ -991,7 +1073,7 @@
           <w:color w:val="222222"/>
           <w:sz w:val="19"/>
         </w:rPr>
-        <w:t>බර වැඩ දුන්නොත්        →  145 විනාඩි විතරයි   😰   දෙගුණයක් ඉක්මනට</w:t>
+        <w:t>give it heavy work  -&gt;  145 minutes           :(   twice as fast</w:t>
       </w:r>
     </w:p>
     <w:p>
@@ -1000,13 +1082,13 @@
       </w:pPr>
       <w:r>
         <w:rPr>
-          <w:rFonts w:ascii="Nirmala UI" w:hAnsi="Nirmala UI" w:cs="Nirmala UI"/>
+          <w:rFonts w:ascii="Segoe UI" w:hAnsi="Segoe UI" w:cs="Segoe UI"/>
           <w:b/>
           <w:i w:val="0"/>
           <w:color w:val="1A1A1A"/>
           <w:sz w:val="24"/>
         </w:rPr>
-        <w:t>👷  කෑල්ල 2 — මිනිසාගේ Twin එක   ★ මේකයි අලුත් දේ</w:t>
+        <w:t>Piece 2 — the person's twin        &lt;-- this is the new part</w:t>
       </w:r>
     </w:p>
     <w:p>
@@ -1015,13 +1097,13 @@
       </w:pPr>
       <w:r>
         <w:rPr>
-          <w:rFonts w:ascii="Nirmala UI" w:hAnsi="Nirmala UI" w:cs="Nirmala UI"/>
+          <w:rFonts w:ascii="Segoe UI" w:hAnsi="Segoe UI" w:cs="Segoe UI"/>
           <w:b w:val="0"/>
           <w:i w:val="0"/>
           <w:color w:val="1A1A1A"/>
           <w:sz w:val="22"/>
         </w:rPr>
-        <w:t>අනිත් අය වෙහෙස ස්ථිර සංඛ්‍යාවක් විදිහට සලකනවා: “බර වැඩේට වෙහෙස = 8” — ඉවරයි.</w:t>
+        <w:t>Other researchers treat tiredness as a fixed number: “heavy job = 8 points of strain”. That is the end of it.</w:t>
       </w:r>
     </w:p>
     <w:p>
@@ -1032,13 +1114,13 @@
       </w:pPr>
       <w:r>
         <w:rPr>
-          <w:rFonts w:ascii="Nirmala UI" w:hAnsi="Nirmala UI" w:cs="Nirmala UI"/>
+          <w:rFonts w:ascii="Segoe UI" w:hAnsi="Segoe UI" w:cs="Segoe UI"/>
           <w:b/>
           <w:i w:val="0"/>
           <w:color w:val="B03A2B"/>
           <w:sz w:val="22"/>
         </w:rPr>
-        <w:t>ඒත් ඒක වැරදියි:</w:t>
+        <w:t>But that is wrong:</w:t>
       </w:r>
     </w:p>
     <w:p>
@@ -1049,13 +1131,13 @@
       </w:pPr>
       <w:r>
         <w:rPr>
-          <w:rFonts w:ascii="Nirmala UI" w:hAnsi="Nirmala UI" w:cs="Nirmala UI"/>
+          <w:rFonts w:ascii="Segoe UI" w:hAnsi="Segoe UI" w:cs="Segoe UI"/>
           <w:b w:val="0"/>
           <w:i w:val="0"/>
           <w:color w:val="B03A2B"/>
           <w:sz w:val="22"/>
         </w:rPr>
-        <w:t>උදේ 8ට බර වැඩක් කරන කෙනා   ≠   හවස 4ට එකම බර වැඩ කරන කෙනා</w:t>
+        <w:t>a person doing heavy work at 8 in the morning is not the same as the same person doing the same work at 4 in the afternoon</w:t>
       </w:r>
     </w:p>
     <w:p>
@@ -1064,13 +1146,13 @@
       </w:pPr>
       <w:r>
         <w:rPr>
-          <w:rFonts w:ascii="Nirmala UI" w:hAnsi="Nirmala UI" w:cs="Nirmala UI"/>
+          <w:rFonts w:ascii="Segoe UI" w:hAnsi="Segoe UI" w:cs="Segoe UI"/>
           <w:b w:val="0"/>
           <w:i w:val="0"/>
           <w:color w:val="1A1A1A"/>
           <w:sz w:val="22"/>
         </w:rPr>
-        <w:t>අපි වෙහෙස ජලය පිරෙන බාල්දියක් වගේ සලකනවා: වැඩ කරනකොට පිරෙනවා, විවේක ගන්නකොට හිස් වෙනවා.</w:t>
+        <w:t>Here, tiredness is treated like a bucket filling with water. Working fills it. Resting empties it.</w:t>
       </w:r>
     </w:p>
     <w:p>
@@ -1079,13 +1161,13 @@
       </w:pPr>
       <w:r>
         <w:rPr>
-          <w:rFonts w:ascii="Nirmala UI" w:hAnsi="Nirmala UI" w:cs="Nirmala UI"/>
+          <w:rFonts w:ascii="Segoe UI" w:hAnsi="Segoe UI" w:cs="Segoe UI"/>
           <w:b/>
           <w:i w:val="0"/>
           <w:color w:val="1A1A1A"/>
           <w:sz w:val="22"/>
         </w:rPr>
-        <w:t>ඊටත් වඩා වැදගත්: හැමෝගේම බාල්දිය එකම ප්‍රමාණය නෙවෙයි.</w:t>
+        <w:t>And more important still: not everybody's bucket is the same size.</w:t>
       </w:r>
     </w:p>
     <w:p>
@@ -1094,13 +1176,13 @@
       </w:pPr>
       <w:r>
         <w:rPr>
-          <w:rFonts w:ascii="Nirmala UI" w:hAnsi="Nirmala UI" w:cs="Nirmala UI"/>
+          <w:rFonts w:ascii="Segoe UI" w:hAnsi="Segoe UI" w:cs="Segoe UI"/>
           <w:b w:val="0"/>
           <w:i w:val="0"/>
           <w:color w:val="1A1A1A"/>
           <w:sz w:val="22"/>
         </w:rPr>
-        <w:t>වයස, බර, උස, ස්ත්‍රී/පුරුෂ අනුව “දිගටම දරාගන්න පුළුවන් උපරිමය” ගණනය කරනවා — ප්‍රකාශිත වෛද්‍ය සමීකරණවලින් (Mifflin 1990, Price 1990).</w:t>
+        <w:t>From age, weight, height and sex, the model computes the work rate each person can sustain all day — using published medical equations (Mifflin 1990, Price 1990).</w:t>
       </w:r>
     </w:p>
     <w:tbl>
@@ -1134,16 +1216,24 @@
               <w:spacing w:after="40" w:before="40"/>
               <w:shd w:val="clear" w:fill="1F4E79"/>
             </w:pPr>
-            <w:r/>
             <w:r>
               <w:rPr>
-                <w:rFonts w:ascii="Nirmala UI" w:hAnsi="Nirmala UI" w:cs="Nirmala UI"/>
+                <w:rFonts w:ascii="Segoe UI" w:hAnsi="Segoe UI" w:cs="Segoe UI"/>
+                <w:b w:val="0"/>
+                <w:i w:val="0"/>
+                <w:color w:val="1A1A1A"/>
+                <w:sz w:val="20"/>
+              </w:rPr>
+            </w:r>
+            <w:r>
+              <w:rPr>
+                <w:rFonts w:ascii="Segoe UI" w:hAnsi="Segoe UI" w:cs="Segoe UI"/>
                 <w:b/>
                 <w:i w:val="0"/>
                 <w:color w:val="FFFFFF"/>
                 <w:sz w:val="20"/>
               </w:rPr>
-              <w:t>සේවකයා</w:t>
+              <w:t>Worker</w:t>
             </w:r>
           </w:p>
         </w:tc>
@@ -1157,22 +1247,30 @@
               <w:spacing w:after="40" w:before="40"/>
               <w:shd w:val="clear" w:fill="1F4E79"/>
             </w:pPr>
-            <w:r/>
             <w:r>
               <w:rPr>
-                <w:rFonts w:ascii="Nirmala UI" w:hAnsi="Nirmala UI" w:cs="Nirmala UI"/>
+                <w:rFonts w:ascii="Segoe UI" w:hAnsi="Segoe UI" w:cs="Segoe UI"/>
+                <w:b w:val="0"/>
+                <w:i w:val="0"/>
+                <w:color w:val="1A1A1A"/>
+                <w:sz w:val="20"/>
+              </w:rPr>
+            </w:r>
+            <w:r>
+              <w:rPr>
+                <w:rFonts w:ascii="Segoe UI" w:hAnsi="Segoe UI" w:cs="Segoe UI"/>
                 <w:b/>
                 <w:i w:val="0"/>
                 <w:color w:val="FFFFFF"/>
                 <w:sz w:val="20"/>
               </w:rPr>
-              <w:t>වයස</w:t>
+              <w:t>Age</w:t>
             </w:r>
           </w:p>
         </w:tc>
         <w:tc>
           <w:tcPr>
-            <w:tcW w:type="dxa" w:w="2160"/>
+            <w:tcW w:type="dxa" w:w="2304"/>
             <w:shd w:val="clear" w:fill="1F4E79"/>
           </w:tcPr>
           <w:p>
@@ -1180,22 +1278,30 @@
               <w:spacing w:after="40" w:before="40"/>
               <w:shd w:val="clear" w:fill="1F4E79"/>
             </w:pPr>
-            <w:r/>
             <w:r>
               <w:rPr>
-                <w:rFonts w:ascii="Nirmala UI" w:hAnsi="Nirmala UI" w:cs="Nirmala UI"/>
+                <w:rFonts w:ascii="Segoe UI" w:hAnsi="Segoe UI" w:cs="Segoe UI"/>
+                <w:b w:val="0"/>
+                <w:i w:val="0"/>
+                <w:color w:val="1A1A1A"/>
+                <w:sz w:val="20"/>
+              </w:rPr>
+            </w:r>
+            <w:r>
+              <w:rPr>
+                <w:rFonts w:ascii="Segoe UI" w:hAnsi="Segoe UI" w:cs="Segoe UI"/>
                 <w:b/>
                 <w:i w:val="0"/>
                 <w:color w:val="FFFFFF"/>
                 <w:sz w:val="20"/>
               </w:rPr>
-              <w:t>දරාගත හැකි උපරිමය</w:t>
+              <w:t>Sustainable maximum</w:t>
             </w:r>
           </w:p>
         </w:tc>
         <w:tc>
           <w:tcPr>
-            <w:tcW w:type="dxa" w:w="4320"/>
+            <w:tcW w:type="dxa" w:w="4176"/>
             <w:shd w:val="clear" w:fill="1F4E79"/>
           </w:tcPr>
           <w:p>
@@ -1203,16 +1309,24 @@
               <w:spacing w:after="40" w:before="40"/>
               <w:shd w:val="clear" w:fill="1F4E79"/>
             </w:pPr>
-            <w:r/>
             <w:r>
               <w:rPr>
-                <w:rFonts w:ascii="Nirmala UI" w:hAnsi="Nirmala UI" w:cs="Nirmala UI"/>
+                <w:rFonts w:ascii="Segoe UI" w:hAnsi="Segoe UI" w:cs="Segoe UI"/>
+                <w:b w:val="0"/>
+                <w:i w:val="0"/>
+                <w:color w:val="1A1A1A"/>
+                <w:sz w:val="20"/>
+              </w:rPr>
+            </w:r>
+            <w:r>
+              <w:rPr>
+                <w:rFonts w:ascii="Segoe UI" w:hAnsi="Segoe UI" w:cs="Segoe UI"/>
                 <w:b/>
                 <w:i w:val="0"/>
                 <w:color w:val="FFFFFF"/>
                 <w:sz w:val="20"/>
               </w:rPr>
-              <w:t>මධ්‍යම වැඩ (4.26) දිගටම කරන්න පුළුවන්ද?</w:t>
+              <w:t>Can they do medium work (4.26) all day?</w:t>
             </w:r>
           </w:p>
         </w:tc>
@@ -1226,16 +1340,24 @@
             <w:pPr>
               <w:spacing w:after="40" w:before="40"/>
             </w:pPr>
-            <w:r/>
             <w:r>
               <w:rPr>
-                <w:rFonts w:ascii="Nirmala UI" w:hAnsi="Nirmala UI" w:cs="Nirmala UI"/>
+                <w:rFonts w:ascii="Segoe UI" w:hAnsi="Segoe UI" w:cs="Segoe UI"/>
                 <w:b w:val="0"/>
                 <w:i w:val="0"/>
                 <w:color w:val="1A1A1A"/>
                 <w:sz w:val="20"/>
               </w:rPr>
-              <w:t>OP1  පිරිමි</w:t>
+            </w:r>
+            <w:r>
+              <w:rPr>
+                <w:rFonts w:ascii="Segoe UI" w:hAnsi="Segoe UI" w:cs="Segoe UI"/>
+                <w:b w:val="0"/>
+                <w:i w:val="0"/>
+                <w:color w:val="1A1A1A"/>
+                <w:sz w:val="20"/>
+              </w:rPr>
+              <w:t>OP1  male</w:t>
             </w:r>
           </w:p>
         </w:tc>
@@ -1247,10 +1369,18 @@
             <w:pPr>
               <w:spacing w:after="40" w:before="40"/>
             </w:pPr>
-            <w:r/>
             <w:r>
               <w:rPr>
-                <w:rFonts w:ascii="Nirmala UI" w:hAnsi="Nirmala UI" w:cs="Nirmala UI"/>
+                <w:rFonts w:ascii="Segoe UI" w:hAnsi="Segoe UI" w:cs="Segoe UI"/>
+                <w:b w:val="0"/>
+                <w:i w:val="0"/>
+                <w:color w:val="1A1A1A"/>
+                <w:sz w:val="20"/>
+              </w:rPr>
+            </w:r>
+            <w:r>
+              <w:rPr>
+                <w:rFonts w:ascii="Segoe UI" w:hAnsi="Segoe UI" w:cs="Segoe UI"/>
                 <w:b w:val="0"/>
                 <w:i w:val="0"/>
                 <w:color w:val="1A1A1A"/>
@@ -1262,16 +1392,24 @@
         </w:tc>
         <w:tc>
           <w:tcPr>
-            <w:tcW w:type="dxa" w:w="2160"/>
+            <w:tcW w:type="dxa" w:w="2304"/>
           </w:tcPr>
           <w:p>
             <w:pPr>
               <w:spacing w:after="40" w:before="40"/>
             </w:pPr>
-            <w:r/>
             <w:r>
               <w:rPr>
-                <w:rFonts w:ascii="Nirmala UI" w:hAnsi="Nirmala UI" w:cs="Nirmala UI"/>
+                <w:rFonts w:ascii="Segoe UI" w:hAnsi="Segoe UI" w:cs="Segoe UI"/>
+                <w:b w:val="0"/>
+                <w:i w:val="0"/>
+                <w:color w:val="1A1A1A"/>
+                <w:sz w:val="20"/>
+              </w:rPr>
+            </w:r>
+            <w:r>
+              <w:rPr>
+                <w:rFonts w:ascii="Segoe UI" w:hAnsi="Segoe UI" w:cs="Segoe UI"/>
                 <w:b w:val="0"/>
                 <w:i w:val="0"/>
                 <w:color w:val="1A1A1A"/>
@@ -1283,22 +1421,30 @@
         </w:tc>
         <w:tc>
           <w:tcPr>
-            <w:tcW w:type="dxa" w:w="4320"/>
+            <w:tcW w:type="dxa" w:w="4176"/>
           </w:tcPr>
           <w:p>
             <w:pPr>
               <w:spacing w:after="40" w:before="40"/>
             </w:pPr>
-            <w:r/>
             <w:r>
               <w:rPr>
-                <w:rFonts w:ascii="Nirmala UI" w:hAnsi="Nirmala UI" w:cs="Nirmala UI"/>
+                <w:rFonts w:ascii="Segoe UI" w:hAnsi="Segoe UI" w:cs="Segoe UI"/>
                 <w:b w:val="0"/>
                 <w:i w:val="0"/>
                 <w:color w:val="1A1A1A"/>
                 <w:sz w:val="20"/>
               </w:rPr>
-              <w:t>✅  පුළුවන්</w:t>
+            </w:r>
+            <w:r>
+              <w:rPr>
+                <w:rFonts w:ascii="Segoe UI" w:hAnsi="Segoe UI" w:cs="Segoe UI"/>
+                <w:b w:val="0"/>
+                <w:i w:val="0"/>
+                <w:color w:val="1A1A1A"/>
+                <w:sz w:val="20"/>
+              </w:rPr>
+              <w:t>Yes</w:t>
             </w:r>
           </w:p>
         </w:tc>
@@ -1312,16 +1458,24 @@
             <w:pPr>
               <w:spacing w:after="40" w:before="40"/>
             </w:pPr>
-            <w:r/>
             <w:r>
               <w:rPr>
-                <w:rFonts w:ascii="Nirmala UI" w:hAnsi="Nirmala UI" w:cs="Nirmala UI"/>
+                <w:rFonts w:ascii="Segoe UI" w:hAnsi="Segoe UI" w:cs="Segoe UI"/>
                 <w:b w:val="0"/>
                 <w:i w:val="0"/>
                 <w:color w:val="1A1A1A"/>
                 <w:sz w:val="20"/>
               </w:rPr>
-              <w:t>OP3  පිරිමි</w:t>
+            </w:r>
+            <w:r>
+              <w:rPr>
+                <w:rFonts w:ascii="Segoe UI" w:hAnsi="Segoe UI" w:cs="Segoe UI"/>
+                <w:b w:val="0"/>
+                <w:i w:val="0"/>
+                <w:color w:val="1A1A1A"/>
+                <w:sz w:val="20"/>
+              </w:rPr>
+              <w:t>OP3  male</w:t>
             </w:r>
           </w:p>
         </w:tc>
@@ -1333,10 +1487,18 @@
             <w:pPr>
               <w:spacing w:after="40" w:before="40"/>
             </w:pPr>
-            <w:r/>
             <w:r>
               <w:rPr>
-                <w:rFonts w:ascii="Nirmala UI" w:hAnsi="Nirmala UI" w:cs="Nirmala UI"/>
+                <w:rFonts w:ascii="Segoe UI" w:hAnsi="Segoe UI" w:cs="Segoe UI"/>
+                <w:b w:val="0"/>
+                <w:i w:val="0"/>
+                <w:color w:val="1A1A1A"/>
+                <w:sz w:val="20"/>
+              </w:rPr>
+            </w:r>
+            <w:r>
+              <w:rPr>
+                <w:rFonts w:ascii="Segoe UI" w:hAnsi="Segoe UI" w:cs="Segoe UI"/>
                 <w:b w:val="0"/>
                 <w:i w:val="0"/>
                 <w:color w:val="1A1A1A"/>
@@ -1348,16 +1510,24 @@
         </w:tc>
         <w:tc>
           <w:tcPr>
-            <w:tcW w:type="dxa" w:w="2160"/>
+            <w:tcW w:type="dxa" w:w="2304"/>
           </w:tcPr>
           <w:p>
             <w:pPr>
               <w:spacing w:after="40" w:before="40"/>
             </w:pPr>
-            <w:r/>
             <w:r>
               <w:rPr>
-                <w:rFonts w:ascii="Nirmala UI" w:hAnsi="Nirmala UI" w:cs="Nirmala UI"/>
+                <w:rFonts w:ascii="Segoe UI" w:hAnsi="Segoe UI" w:cs="Segoe UI"/>
+                <w:b w:val="0"/>
+                <w:i w:val="0"/>
+                <w:color w:val="1A1A1A"/>
+                <w:sz w:val="20"/>
+              </w:rPr>
+            </w:r>
+            <w:r>
+              <w:rPr>
+                <w:rFonts w:ascii="Segoe UI" w:hAnsi="Segoe UI" w:cs="Segoe UI"/>
                 <w:b w:val="0"/>
                 <w:i w:val="0"/>
                 <w:color w:val="1A1A1A"/>
@@ -1369,22 +1539,30 @@
         </w:tc>
         <w:tc>
           <w:tcPr>
-            <w:tcW w:type="dxa" w:w="4320"/>
+            <w:tcW w:type="dxa" w:w="4176"/>
           </w:tcPr>
           <w:p>
             <w:pPr>
               <w:spacing w:after="40" w:before="40"/>
             </w:pPr>
-            <w:r/>
             <w:r>
               <w:rPr>
-                <w:rFonts w:ascii="Nirmala UI" w:hAnsi="Nirmala UI" w:cs="Nirmala UI"/>
+                <w:rFonts w:ascii="Segoe UI" w:hAnsi="Segoe UI" w:cs="Segoe UI"/>
                 <w:b w:val="0"/>
                 <w:i w:val="0"/>
                 <w:color w:val="1A1A1A"/>
                 <w:sz w:val="20"/>
               </w:rPr>
-              <w:t>✅  පුළුවන් (ලං වෙලා)</w:t>
+            </w:r>
+            <w:r>
+              <w:rPr>
+                <w:rFonts w:ascii="Segoe UI" w:hAnsi="Segoe UI" w:cs="Segoe UI"/>
+                <w:b w:val="0"/>
+                <w:i w:val="0"/>
+                <w:color w:val="1A1A1A"/>
+                <w:sz w:val="20"/>
+              </w:rPr>
+              <w:t>Yes, but close to the line</w:t>
             </w:r>
           </w:p>
         </w:tc>
@@ -1398,16 +1576,24 @@
             <w:pPr>
               <w:spacing w:after="40" w:before="40"/>
             </w:pPr>
-            <w:r/>
             <w:r>
               <w:rPr>
-                <w:rFonts w:ascii="Nirmala UI" w:hAnsi="Nirmala UI" w:cs="Nirmala UI"/>
+                <w:rFonts w:ascii="Segoe UI" w:hAnsi="Segoe UI" w:cs="Segoe UI"/>
                 <w:b w:val="0"/>
                 <w:i w:val="0"/>
                 <w:color w:val="1A1A1A"/>
                 <w:sz w:val="20"/>
               </w:rPr>
-              <w:t>OP2  ගැහැනු</w:t>
+            </w:r>
+            <w:r>
+              <w:rPr>
+                <w:rFonts w:ascii="Segoe UI" w:hAnsi="Segoe UI" w:cs="Segoe UI"/>
+                <w:b w:val="0"/>
+                <w:i w:val="0"/>
+                <w:color w:val="1A1A1A"/>
+                <w:sz w:val="20"/>
+              </w:rPr>
+              <w:t>OP2  female</w:t>
             </w:r>
           </w:p>
         </w:tc>
@@ -1419,10 +1605,18 @@
             <w:pPr>
               <w:spacing w:after="40" w:before="40"/>
             </w:pPr>
-            <w:r/>
             <w:r>
               <w:rPr>
-                <w:rFonts w:ascii="Nirmala UI" w:hAnsi="Nirmala UI" w:cs="Nirmala UI"/>
+                <w:rFonts w:ascii="Segoe UI" w:hAnsi="Segoe UI" w:cs="Segoe UI"/>
+                <w:b w:val="0"/>
+                <w:i w:val="0"/>
+                <w:color w:val="1A1A1A"/>
+                <w:sz w:val="20"/>
+              </w:rPr>
+            </w:r>
+            <w:r>
+              <w:rPr>
+                <w:rFonts w:ascii="Segoe UI" w:hAnsi="Segoe UI" w:cs="Segoe UI"/>
                 <w:b w:val="0"/>
                 <w:i w:val="0"/>
                 <w:color w:val="1A1A1A"/>
@@ -1434,16 +1628,24 @@
         </w:tc>
         <w:tc>
           <w:tcPr>
-            <w:tcW w:type="dxa" w:w="2160"/>
+            <w:tcW w:type="dxa" w:w="2304"/>
           </w:tcPr>
           <w:p>
             <w:pPr>
               <w:spacing w:after="40" w:before="40"/>
             </w:pPr>
-            <w:r/>
             <w:r>
               <w:rPr>
-                <w:rFonts w:ascii="Nirmala UI" w:hAnsi="Nirmala UI" w:cs="Nirmala UI"/>
+                <w:rFonts w:ascii="Segoe UI" w:hAnsi="Segoe UI" w:cs="Segoe UI"/>
+                <w:b w:val="0"/>
+                <w:i w:val="0"/>
+                <w:color w:val="1A1A1A"/>
+                <w:sz w:val="20"/>
+              </w:rPr>
+            </w:r>
+            <w:r>
+              <w:rPr>
+                <w:rFonts w:ascii="Segoe UI" w:hAnsi="Segoe UI" w:cs="Segoe UI"/>
                 <w:b w:val="0"/>
                 <w:i w:val="0"/>
                 <w:color w:val="1A1A1A"/>
@@ -1455,22 +1657,30 @@
         </w:tc>
         <w:tc>
           <w:tcPr>
-            <w:tcW w:type="dxa" w:w="4320"/>
+            <w:tcW w:type="dxa" w:w="4176"/>
           </w:tcPr>
           <w:p>
             <w:pPr>
               <w:spacing w:after="40" w:before="40"/>
             </w:pPr>
-            <w:r/>
             <w:r>
               <w:rPr>
-                <w:rFonts w:ascii="Nirmala UI" w:hAnsi="Nirmala UI" w:cs="Nirmala UI"/>
+                <w:rFonts w:ascii="Segoe UI" w:hAnsi="Segoe UI" w:cs="Segoe UI"/>
                 <w:b w:val="0"/>
                 <w:i w:val="0"/>
                 <w:color w:val="1A1A1A"/>
                 <w:sz w:val="20"/>
               </w:rPr>
-              <w:t>⛔  බෑ!</w:t>
+            </w:r>
+            <w:r>
+              <w:rPr>
+                <w:rFonts w:ascii="Segoe UI" w:hAnsi="Segoe UI" w:cs="Segoe UI"/>
+                <w:b w:val="0"/>
+                <w:i w:val="0"/>
+                <w:color w:val="1A1A1A"/>
+                <w:sz w:val="20"/>
+              </w:rPr>
+              <w:t>No</w:t>
             </w:r>
           </w:p>
         </w:tc>
@@ -1489,13 +1699,13 @@
       </w:pPr>
       <w:r>
         <w:rPr>
-          <w:rFonts w:ascii="Nirmala UI" w:hAnsi="Nirmala UI" w:cs="Nirmala UI"/>
+          <w:rFonts w:ascii="Segoe UI" w:hAnsi="Segoe UI" w:cs="Segoe UI"/>
           <w:b/>
           <w:i w:val="0"/>
           <w:color w:val="1E7A3C"/>
           <w:sz w:val="22"/>
         </w:rPr>
-        <w:t>මේක තමයි ලස්සනම කොටස.</w:t>
+        <w:t>This is the best part.</w:t>
       </w:r>
     </w:p>
     <w:p>
@@ -1506,13 +1716,13 @@
       </w:pPr>
       <w:r>
         <w:rPr>
-          <w:rFonts w:ascii="Nirmala UI" w:hAnsi="Nirmala UI" w:cs="Nirmala UI"/>
+          <w:rFonts w:ascii="Segoe UI" w:hAnsi="Segoe UI" w:cs="Segoe UI"/>
           <w:b w:val="0"/>
           <w:i w:val="0"/>
           <w:color w:val="1E7A3C"/>
           <w:sz w:val="22"/>
         </w:rPr>
-        <w:t>OP2 ට medium වැඩ දිගටම කරන්න බැරි බව අපි කොහෙවත් ලියලා නෑ. ඒක ඇගේ ශරීරයේ සංඛ්‍යාවලින්ම එනවා. System එක තනිවම එයාට වැඩිපුර විවේක දෙනවා.</w:t>
+        <w:t>Nowhere does the system say “OP2 cannot do medium work”. That falls out of the numbers describing her body. The system gives her extra rest on its own.</w:t>
       </w:r>
     </w:p>
     <w:p>
@@ -1523,13 +1733,13 @@
       </w:pPr>
       <w:r>
         <w:rPr>
-          <w:rFonts w:ascii="Nirmala UI" w:hAnsi="Nirmala UI" w:cs="Nirmala UI"/>
+          <w:rFonts w:ascii="Segoe UI" w:hAnsi="Segoe UI" w:cs="Segoe UI"/>
           <w:b w:val="0"/>
           <w:i w:val="0"/>
           <w:color w:val="1E7A3C"/>
           <w:sz w:val="22"/>
         </w:rPr>
-        <w:t>එකම නීතියක් — ඒත් හැමෝටම වෙනස් ආරක්ෂාවක්.</w:t>
+        <w:t>One rule for everyone — but different protection for each person.</w:t>
       </w:r>
     </w:p>
     <w:p>
@@ -1538,13 +1748,13 @@
       </w:pPr>
       <w:r>
         <w:rPr>
-          <w:rFonts w:ascii="Nirmala UI" w:hAnsi="Nirmala UI" w:cs="Nirmala UI"/>
+          <w:rFonts w:ascii="Segoe UI" w:hAnsi="Segoe UI" w:cs="Segoe UI"/>
           <w:b w:val="0"/>
           <w:i w:val="0"/>
           <w:color w:val="1A1A1A"/>
           <w:sz w:val="22"/>
         </w:rPr>
-        <w:t>“4.26” කියන්නේ මොකක්ද? විනාඩියකට ශරීරය පුළුස්සන කැලරි ගණන. ෆෝන් එකේ බැටරිය බහින වේගය වගේ. ඒක ISO 8996 කියන ජාත්‍යන්තර ප්‍රමිතියෙන් එනවා — අපි හදපු අංකයක් නෙවෙයි.</w:t>
+        <w:t>What is “4.26”? It is calories burnt per minute — the rate the body is being drained, like the rate a phone battery discharges. It comes from ISO 8996, an international standard, not from us.</w:t>
       </w:r>
     </w:p>
     <w:tbl>
@@ -1578,16 +1788,24 @@
               <w:spacing w:after="40" w:before="40"/>
               <w:shd w:val="clear" w:fill="1F4E79"/>
             </w:pPr>
-            <w:r/>
             <w:r>
               <w:rPr>
-                <w:rFonts w:ascii="Nirmala UI" w:hAnsi="Nirmala UI" w:cs="Nirmala UI"/>
+                <w:rFonts w:ascii="Segoe UI" w:hAnsi="Segoe UI" w:cs="Segoe UI"/>
+                <w:b w:val="0"/>
+                <w:i w:val="0"/>
+                <w:color w:val="1A1A1A"/>
+                <w:sz w:val="20"/>
+              </w:rPr>
+            </w:r>
+            <w:r>
+              <w:rPr>
+                <w:rFonts w:ascii="Segoe UI" w:hAnsi="Segoe UI" w:cs="Segoe UI"/>
                 <w:b/>
                 <w:i w:val="0"/>
                 <w:color w:val="FFFFFF"/>
                 <w:sz w:val="20"/>
               </w:rPr>
-              <w:t>වැඩේ</w:t>
+              <w:t>Work</w:t>
             </w:r>
           </w:p>
         </w:tc>
@@ -1601,16 +1819,24 @@
               <w:spacing w:after="40" w:before="40"/>
               <w:shd w:val="clear" w:fill="1F4E79"/>
             </w:pPr>
-            <w:r/>
             <w:r>
               <w:rPr>
-                <w:rFonts w:ascii="Nirmala UI" w:hAnsi="Nirmala UI" w:cs="Nirmala UI"/>
+                <w:rFonts w:ascii="Segoe UI" w:hAnsi="Segoe UI" w:cs="Segoe UI"/>
+                <w:b w:val="0"/>
+                <w:i w:val="0"/>
+                <w:color w:val="1A1A1A"/>
+                <w:sz w:val="20"/>
+              </w:rPr>
+            </w:r>
+            <w:r>
+              <w:rPr>
+                <w:rFonts w:ascii="Segoe UI" w:hAnsi="Segoe UI" w:cs="Segoe UI"/>
                 <w:b/>
                 <w:i w:val="0"/>
                 <w:color w:val="FFFFFF"/>
                 <w:sz w:val="20"/>
               </w:rPr>
-              <w:t>ISO පන්තිය</w:t>
+              <w:t>ISO class</w:t>
             </w:r>
           </w:p>
         </w:tc>
@@ -1624,10 +1850,18 @@
               <w:spacing w:after="40" w:before="40"/>
               <w:shd w:val="clear" w:fill="1F4E79"/>
             </w:pPr>
-            <w:r/>
             <w:r>
               <w:rPr>
-                <w:rFonts w:ascii="Nirmala UI" w:hAnsi="Nirmala UI" w:cs="Nirmala UI"/>
+                <w:rFonts w:ascii="Segoe UI" w:hAnsi="Segoe UI" w:cs="Segoe UI"/>
+                <w:b w:val="0"/>
+                <w:i w:val="0"/>
+                <w:color w:val="1A1A1A"/>
+                <w:sz w:val="20"/>
+              </w:rPr>
+            </w:r>
+            <w:r>
+              <w:rPr>
+                <w:rFonts w:ascii="Segoe UI" w:hAnsi="Segoe UI" w:cs="Segoe UI"/>
                 <w:b/>
                 <w:i w:val="0"/>
                 <w:color w:val="FFFFFF"/>
@@ -1647,16 +1881,24 @@
               <w:spacing w:after="40" w:before="40"/>
               <w:shd w:val="clear" w:fill="1F4E79"/>
             </w:pPr>
-            <w:r/>
             <w:r>
               <w:rPr>
-                <w:rFonts w:ascii="Nirmala UI" w:hAnsi="Nirmala UI" w:cs="Nirmala UI"/>
+                <w:rFonts w:ascii="Segoe UI" w:hAnsi="Segoe UI" w:cs="Segoe UI"/>
+                <w:b w:val="0"/>
+                <w:i w:val="0"/>
+                <w:color w:val="1A1A1A"/>
+                <w:sz w:val="20"/>
+              </w:rPr>
+            </w:r>
+            <w:r>
+              <w:rPr>
+                <w:rFonts w:ascii="Segoe UI" w:hAnsi="Segoe UI" w:cs="Segoe UI"/>
                 <w:b/>
                 <w:i w:val="0"/>
                 <w:color w:val="FFFFFF"/>
                 <w:sz w:val="20"/>
               </w:rPr>
-              <w:t>පැය 8ක shift එකකට</w:t>
+              <w:t>Over an 8-hour shift</w:t>
             </w:r>
           </w:p>
         </w:tc>
@@ -1670,16 +1912,24 @@
             <w:pPr>
               <w:spacing w:after="40" w:before="40"/>
             </w:pPr>
-            <w:r/>
             <w:r>
               <w:rPr>
-                <w:rFonts w:ascii="Nirmala UI" w:hAnsi="Nirmala UI" w:cs="Nirmala UI"/>
+                <w:rFonts w:ascii="Segoe UI" w:hAnsi="Segoe UI" w:cs="Segoe UI"/>
                 <w:b w:val="0"/>
                 <w:i w:val="0"/>
                 <w:color w:val="1A1A1A"/>
                 <w:sz w:val="20"/>
               </w:rPr>
-              <w:t>සැහැල්ලු</w:t>
+            </w:r>
+            <w:r>
+              <w:rPr>
+                <w:rFonts w:ascii="Segoe UI" w:hAnsi="Segoe UI" w:cs="Segoe UI"/>
+                <w:b w:val="0"/>
+                <w:i w:val="0"/>
+                <w:color w:val="1A1A1A"/>
+                <w:sz w:val="20"/>
+              </w:rPr>
+              <w:t>Light</w:t>
             </w:r>
           </w:p>
         </w:tc>
@@ -1691,10 +1941,18 @@
             <w:pPr>
               <w:spacing w:after="40" w:before="40"/>
             </w:pPr>
-            <w:r/>
             <w:r>
               <w:rPr>
-                <w:rFonts w:ascii="Nirmala UI" w:hAnsi="Nirmala UI" w:cs="Nirmala UI"/>
+                <w:rFonts w:ascii="Segoe UI" w:hAnsi="Segoe UI" w:cs="Segoe UI"/>
+                <w:b w:val="0"/>
+                <w:i w:val="0"/>
+                <w:color w:val="1A1A1A"/>
+                <w:sz w:val="20"/>
+              </w:rPr>
+            </w:r>
+            <w:r>
+              <w:rPr>
+                <w:rFonts w:ascii="Segoe UI" w:hAnsi="Segoe UI" w:cs="Segoe UI"/>
                 <w:b w:val="0"/>
                 <w:i w:val="0"/>
                 <w:color w:val="1A1A1A"/>
@@ -1712,10 +1970,18 @@
             <w:pPr>
               <w:spacing w:after="40" w:before="40"/>
             </w:pPr>
-            <w:r/>
             <w:r>
               <w:rPr>
-                <w:rFonts w:ascii="Nirmala UI" w:hAnsi="Nirmala UI" w:cs="Nirmala UI"/>
+                <w:rFonts w:ascii="Segoe UI" w:hAnsi="Segoe UI" w:cs="Segoe UI"/>
+                <w:b w:val="0"/>
+                <w:i w:val="0"/>
+                <w:color w:val="1A1A1A"/>
+                <w:sz w:val="20"/>
+              </w:rPr>
+            </w:r>
+            <w:r>
+              <w:rPr>
+                <w:rFonts w:ascii="Segoe UI" w:hAnsi="Segoe UI" w:cs="Segoe UI"/>
                 <w:b w:val="0"/>
                 <w:i w:val="0"/>
                 <w:color w:val="1A1A1A"/>
@@ -1733,10 +1999,18 @@
             <w:pPr>
               <w:spacing w:after="40" w:before="40"/>
             </w:pPr>
-            <w:r/>
             <w:r>
               <w:rPr>
-                <w:rFonts w:ascii="Nirmala UI" w:hAnsi="Nirmala UI" w:cs="Nirmala UI"/>
+                <w:rFonts w:ascii="Segoe UI" w:hAnsi="Segoe UI" w:cs="Segoe UI"/>
+                <w:b w:val="0"/>
+                <w:i w:val="0"/>
+                <w:color w:val="1A1A1A"/>
+                <w:sz w:val="20"/>
+              </w:rPr>
+            </w:r>
+            <w:r>
+              <w:rPr>
+                <w:rFonts w:ascii="Segoe UI" w:hAnsi="Segoe UI" w:cs="Segoe UI"/>
                 <w:b w:val="0"/>
                 <w:i w:val="0"/>
                 <w:color w:val="1A1A1A"/>
@@ -1756,16 +2030,24 @@
             <w:pPr>
               <w:spacing w:after="40" w:before="40"/>
             </w:pPr>
-            <w:r/>
             <w:r>
               <w:rPr>
-                <w:rFonts w:ascii="Nirmala UI" w:hAnsi="Nirmala UI" w:cs="Nirmala UI"/>
+                <w:rFonts w:ascii="Segoe UI" w:hAnsi="Segoe UI" w:cs="Segoe UI"/>
                 <w:b w:val="0"/>
                 <w:i w:val="0"/>
                 <w:color w:val="1A1A1A"/>
                 <w:sz w:val="20"/>
               </w:rPr>
-              <w:t>මධ්‍යම</w:t>
+            </w:r>
+            <w:r>
+              <w:rPr>
+                <w:rFonts w:ascii="Segoe UI" w:hAnsi="Segoe UI" w:cs="Segoe UI"/>
+                <w:b w:val="0"/>
+                <w:i w:val="0"/>
+                <w:color w:val="1A1A1A"/>
+                <w:sz w:val="20"/>
+              </w:rPr>
+              <w:t>Medium</w:t>
             </w:r>
           </w:p>
         </w:tc>
@@ -1777,10 +2059,18 @@
             <w:pPr>
               <w:spacing w:after="40" w:before="40"/>
             </w:pPr>
-            <w:r/>
             <w:r>
               <w:rPr>
-                <w:rFonts w:ascii="Nirmala UI" w:hAnsi="Nirmala UI" w:cs="Nirmala UI"/>
+                <w:rFonts w:ascii="Segoe UI" w:hAnsi="Segoe UI" w:cs="Segoe UI"/>
+                <w:b w:val="0"/>
+                <w:i w:val="0"/>
+                <w:color w:val="1A1A1A"/>
+                <w:sz w:val="20"/>
+              </w:rPr>
+            </w:r>
+            <w:r>
+              <w:rPr>
+                <w:rFonts w:ascii="Segoe UI" w:hAnsi="Segoe UI" w:cs="Segoe UI"/>
                 <w:b w:val="0"/>
                 <w:i w:val="0"/>
                 <w:color w:val="1A1A1A"/>
@@ -1798,10 +2088,18 @@
             <w:pPr>
               <w:spacing w:after="40" w:before="40"/>
             </w:pPr>
-            <w:r/>
             <w:r>
               <w:rPr>
-                <w:rFonts w:ascii="Nirmala UI" w:hAnsi="Nirmala UI" w:cs="Nirmala UI"/>
+                <w:rFonts w:ascii="Segoe UI" w:hAnsi="Segoe UI" w:cs="Segoe UI"/>
+                <w:b w:val="0"/>
+                <w:i w:val="0"/>
+                <w:color w:val="1A1A1A"/>
+                <w:sz w:val="20"/>
+              </w:rPr>
+            </w:r>
+            <w:r>
+              <w:rPr>
+                <w:rFonts w:ascii="Segoe UI" w:hAnsi="Segoe UI" w:cs="Segoe UI"/>
                 <w:b w:val="0"/>
                 <w:i w:val="0"/>
                 <w:color w:val="1A1A1A"/>
@@ -1819,10 +2117,18 @@
             <w:pPr>
               <w:spacing w:after="40" w:before="40"/>
             </w:pPr>
-            <w:r/>
             <w:r>
               <w:rPr>
-                <w:rFonts w:ascii="Nirmala UI" w:hAnsi="Nirmala UI" w:cs="Nirmala UI"/>
+                <w:rFonts w:ascii="Segoe UI" w:hAnsi="Segoe UI" w:cs="Segoe UI"/>
+                <w:b w:val="0"/>
+                <w:i w:val="0"/>
+                <w:color w:val="1A1A1A"/>
+                <w:sz w:val="20"/>
+              </w:rPr>
+            </w:r>
+            <w:r>
+              <w:rPr>
+                <w:rFonts w:ascii="Segoe UI" w:hAnsi="Segoe UI" w:cs="Segoe UI"/>
                 <w:b w:val="0"/>
                 <w:i w:val="0"/>
                 <w:color w:val="1A1A1A"/>
@@ -1842,16 +2148,24 @@
             <w:pPr>
               <w:spacing w:after="40" w:before="40"/>
             </w:pPr>
-            <w:r/>
             <w:r>
               <w:rPr>
-                <w:rFonts w:ascii="Nirmala UI" w:hAnsi="Nirmala UI" w:cs="Nirmala UI"/>
+                <w:rFonts w:ascii="Segoe UI" w:hAnsi="Segoe UI" w:cs="Segoe UI"/>
                 <w:b w:val="0"/>
                 <w:i w:val="0"/>
                 <w:color w:val="1A1A1A"/>
                 <w:sz w:val="20"/>
               </w:rPr>
-              <w:t>බර</w:t>
+            </w:r>
+            <w:r>
+              <w:rPr>
+                <w:rFonts w:ascii="Segoe UI" w:hAnsi="Segoe UI" w:cs="Segoe UI"/>
+                <w:b w:val="0"/>
+                <w:i w:val="0"/>
+                <w:color w:val="1A1A1A"/>
+                <w:sz w:val="20"/>
+              </w:rPr>
+              <w:t>Heavy</w:t>
             </w:r>
           </w:p>
         </w:tc>
@@ -1863,10 +2177,18 @@
             <w:pPr>
               <w:spacing w:after="40" w:before="40"/>
             </w:pPr>
-            <w:r/>
             <w:r>
               <w:rPr>
-                <w:rFonts w:ascii="Nirmala UI" w:hAnsi="Nirmala UI" w:cs="Nirmala UI"/>
+                <w:rFonts w:ascii="Segoe UI" w:hAnsi="Segoe UI" w:cs="Segoe UI"/>
+                <w:b w:val="0"/>
+                <w:i w:val="0"/>
+                <w:color w:val="1A1A1A"/>
+                <w:sz w:val="20"/>
+              </w:rPr>
+            </w:r>
+            <w:r>
+              <w:rPr>
+                <w:rFonts w:ascii="Segoe UI" w:hAnsi="Segoe UI" w:cs="Segoe UI"/>
                 <w:b w:val="0"/>
                 <w:i w:val="0"/>
                 <w:color w:val="1A1A1A"/>
@@ -1884,10 +2206,18 @@
             <w:pPr>
               <w:spacing w:after="40" w:before="40"/>
             </w:pPr>
-            <w:r/>
             <w:r>
               <w:rPr>
-                <w:rFonts w:ascii="Nirmala UI" w:hAnsi="Nirmala UI" w:cs="Nirmala UI"/>
+                <w:rFonts w:ascii="Segoe UI" w:hAnsi="Segoe UI" w:cs="Segoe UI"/>
+                <w:b w:val="0"/>
+                <w:i w:val="0"/>
+                <w:color w:val="1A1A1A"/>
+                <w:sz w:val="20"/>
+              </w:rPr>
+            </w:r>
+            <w:r>
+              <w:rPr>
+                <w:rFonts w:ascii="Segoe UI" w:hAnsi="Segoe UI" w:cs="Segoe UI"/>
                 <w:b w:val="0"/>
                 <w:i w:val="0"/>
                 <w:color w:val="1A1A1A"/>
@@ -1905,10 +2235,18 @@
             <w:pPr>
               <w:spacing w:after="40" w:before="40"/>
             </w:pPr>
-            <w:r/>
             <w:r>
               <w:rPr>
-                <w:rFonts w:ascii="Nirmala UI" w:hAnsi="Nirmala UI" w:cs="Nirmala UI"/>
+                <w:rFonts w:ascii="Segoe UI" w:hAnsi="Segoe UI" w:cs="Segoe UI"/>
+                <w:b w:val="0"/>
+                <w:i w:val="0"/>
+                <w:color w:val="1A1A1A"/>
+                <w:sz w:val="20"/>
+              </w:rPr>
+            </w:r>
+            <w:r>
+              <w:rPr>
+                <w:rFonts w:ascii="Segoe UI" w:hAnsi="Segoe UI" w:cs="Segoe UI"/>
                 <w:b w:val="0"/>
                 <w:i w:val="0"/>
                 <w:color w:val="1A1A1A"/>
@@ -1931,13 +2269,13 @@
       </w:pPr>
       <w:r>
         <w:rPr>
-          <w:rFonts w:ascii="Nirmala UI" w:hAnsi="Nirmala UI" w:cs="Nirmala UI"/>
+          <w:rFonts w:ascii="Segoe UI" w:hAnsi="Segoe UI" w:cs="Segoe UI"/>
           <w:b/>
           <w:i w:val="0"/>
           <w:color w:val="1A1A1A"/>
           <w:sz w:val="24"/>
         </w:rPr>
-        <w:t>🔗  කෑල්ල 3 — Twin දෙක එකිනෙකට කතා කරනවා</w:t>
+        <w:t>Piece 3 — the two twins talk to each other</w:t>
       </w:r>
     </w:p>
     <w:p>
@@ -1954,7 +2292,7 @@
           <w:color w:val="222222"/>
           <w:sz w:val="19"/>
         </w:rPr>
-        <w:t>මිනිසා → යන්ත්‍රය :  වෙහෙසුණු කෙනා     →  වැඩිපුර දෝෂ</w:t>
+        <w:t>person  -&gt; machine :  a tired worker      -&gt;  more defects</w:t>
       </w:r>
     </w:p>
     <w:p>
@@ -1971,7 +2309,7 @@
           <w:color w:val="222222"/>
           <w:sz w:val="19"/>
         </w:rPr>
-        <w:t xml:space="preserve">                     දක්ෂතාව අඩු කෙනා   →  වැඩිපුර දෝෂ</w:t>
+        <w:t xml:space="preserve">                      a less skilled one  -&gt;  more defects</w:t>
       </w:r>
     </w:p>
     <w:p>
@@ -2004,7 +2342,7 @@
           <w:color w:val="222222"/>
           <w:sz w:val="19"/>
         </w:rPr>
-        <w:t>යන්ත්‍රය → මිනිසා :  ගෙවුණු යන්ත්‍රයක්   →  වැඩි මානසික බර</w:t>
+        <w:t>machine -&gt; person  :  a worn machine      -&gt;  more mental load</w:t>
       </w:r>
     </w:p>
     <w:p>
@@ -2021,7 +2359,7 @@
           <w:color w:val="222222"/>
           <w:sz w:val="19"/>
         </w:rPr>
-        <w:t xml:space="preserve">                     බර වැඩක්           →  වේගෙන් වෙහෙසෙනවා</w:t>
+        <w:t xml:space="preserve">                      a heavy job         -&gt;  tires faster</w:t>
       </w:r>
     </w:p>
     <w:p>
@@ -2038,7 +2376,7 @@
           <w:color w:val="222222"/>
           <w:sz w:val="19"/>
         </w:rPr>
-        <w:t xml:space="preserve">                     වේගවත් යන්ත්‍රයක්   →  නරක ඉරියව්ව</w:t>
+        <w:t xml:space="preserve">                      a fast machine      -&gt;  worse posture</w:t>
       </w:r>
     </w:p>
     <w:p>
@@ -2047,13 +2385,13 @@
       </w:pPr>
       <w:r>
         <w:rPr>
-          <w:rFonts w:ascii="Nirmala UI" w:hAnsi="Nirmala UI" w:cs="Nirmala UI"/>
+          <w:rFonts w:ascii="Segoe UI" w:hAnsi="Segoe UI" w:cs="Segoe UI"/>
           <w:b w:val="0"/>
           <w:i w:val="0"/>
           <w:color w:val="1A1A1A"/>
           <w:sz w:val="22"/>
         </w:rPr>
-        <w:t>උදාහරණය: වෙහෙසුණු කෙනෙක් වැරදි කරනවා → නිෂ්පාදනය නරක් වෙනවා → ඒක යන්ත්‍රයේ ප්‍රතිඵලයක් වගේ පේනවා. ඇත්තටම ඒක මිනිසාගේ ප්‍රතිඵලයක්. අපේ system එකට ඒක පේනවා.</w:t>
+        <w:t>Example: a tired worker makes mistakes, so the product comes out faulty. That looks like a machine problem. It is really a people problem. This system can see that.</w:t>
       </w:r>
     </w:p>
     <w:p>
@@ -2062,13 +2400,13 @@
       </w:pPr>
       <w:r>
         <w:rPr>
-          <w:rFonts w:ascii="Nirmala UI" w:hAnsi="Nirmala UI" w:cs="Nirmala UI"/>
+          <w:rFonts w:ascii="Segoe UI" w:hAnsi="Segoe UI" w:cs="Segoe UI"/>
           <w:b/>
           <w:i w:val="0"/>
           <w:color w:val="1A1A1A"/>
           <w:sz w:val="24"/>
         </w:rPr>
-        <w:t>⚖️  කෑල්ල 4 — තීරණය ගන්න විදිහ   ★★★ ප්‍රධානම අදහස</w:t>
+        <w:t>Piece 4 — how the decision is made        &lt;-- the central idea</w:t>
       </w:r>
     </w:p>
     <w:p>
@@ -2077,13 +2415,13 @@
       </w:pPr>
       <w:r>
         <w:rPr>
-          <w:rFonts w:ascii="Nirmala UI" w:hAnsi="Nirmala UI" w:cs="Nirmala UI"/>
+          <w:rFonts w:ascii="Segoe UI" w:hAnsi="Segoe UI" w:cs="Segoe UI"/>
           <w:b/>
           <w:i w:val="0"/>
           <w:color w:val="1A1A1A"/>
           <w:sz w:val="22"/>
         </w:rPr>
-        <w:t>ක්‍රම දෙකක් තියෙනවා.</w:t>
+        <w:t>There are two ways to do it.</w:t>
       </w:r>
     </w:p>
     <w:p>
@@ -2092,13 +2430,13 @@
       </w:pPr>
       <w:r>
         <w:rPr>
-          <w:rFonts w:ascii="Nirmala UI" w:hAnsi="Nirmala UI" w:cs="Nirmala UI"/>
+          <w:rFonts w:ascii="Segoe UI" w:hAnsi="Segoe UI" w:cs="Segoe UI"/>
           <w:b w:val="0"/>
           <w:i w:val="0"/>
           <w:color w:val="1A1A1A"/>
           <w:sz w:val="22"/>
         </w:rPr>
-        <w:t>❌  ක්‍රමය 1 — “දඩය” (soft penalty).  අනිත් අය කරන්නේ මේක:</w:t>
+        <w:t>Way 1 — a “fine” (a penalty). This is what others do:</w:t>
       </w:r>
     </w:p>
     <w:p>
@@ -2115,7 +2453,7 @@
           <w:color w:val="222222"/>
           <w:sz w:val="19"/>
         </w:rPr>
-        <w:t>නිෂ්පාදනය වැඩියි    →  +100 ලකුණු</w:t>
+        <w:t>high output          -&gt;  +100 points</w:t>
       </w:r>
     </w:p>
     <w:p>
@@ -2132,7 +2470,7 @@
           <w:color w:val="222222"/>
           <w:sz w:val="19"/>
         </w:rPr>
-        <w:t>මිනිසා වෙහෙසෙනවා   →   −30 ලකුණු  (දඩයක්)</w:t>
+        <w:t>the worker gets tired -&gt;   -30 points   (the fine)</w:t>
       </w:r>
     </w:p>
     <w:p>
@@ -2149,7 +2487,7 @@
           <w:color w:val="222222"/>
           <w:sz w:val="19"/>
         </w:rPr>
-        <w:t xml:space="preserve">                      ─────────</w:t>
+        <w:t xml:space="preserve">                         ---------</w:t>
       </w:r>
     </w:p>
     <w:p>
@@ -2166,7 +2504,7 @@
           <w:color w:val="222222"/>
           <w:sz w:val="19"/>
         </w:rPr>
-        <w:t>එකතුව              =  +70   →  “හොඳයි, කරමු!”</w:t>
+        <w:t>total                 =   +70   -&gt;  “good enough, do it”</w:t>
       </w:r>
     </w:p>
     <w:p>
@@ -2177,13 +2515,13 @@
       </w:pPr>
       <w:r>
         <w:rPr>
-          <w:rFonts w:ascii="Nirmala UI" w:hAnsi="Nirmala UI" w:cs="Nirmala UI"/>
+          <w:rFonts w:ascii="Segoe UI" w:hAnsi="Segoe UI" w:cs="Segoe UI"/>
           <w:b/>
           <w:i w:val="0"/>
           <w:color w:val="B03A2B"/>
           <w:sz w:val="22"/>
         </w:rPr>
-        <w:t>ප්‍රශ්නය: නිෂ්පාදනයේ ලාභය ලොකු නම්, වෙහෙසේ දඩය හැමවිටම ගෙවන්න පුළුවන්. මිනිසා විකුණන්න පුළුවන් දෙයක් වෙනවා.</w:t>
+        <w:t>The problem: if the profit is large enough, the fine on tiredness can always be paid. The person becomes something you can trade away.</w:t>
       </w:r>
     </w:p>
     <w:p>
@@ -2192,13 +2530,13 @@
       </w:pPr>
       <w:r>
         <w:rPr>
-          <w:rFonts w:ascii="Nirmala UI" w:hAnsi="Nirmala UI" w:cs="Nirmala UI"/>
+          <w:rFonts w:ascii="Segoe UI" w:hAnsi="Segoe UI" w:cs="Segoe UI"/>
           <w:b w:val="0"/>
           <w:i w:val="0"/>
           <w:color w:val="1A1A1A"/>
           <w:sz w:val="22"/>
         </w:rPr>
-        <w:t>✅  ක්‍රමය 2 — “පෙරහන” (hard constraint).  අපි කරන්නේ මේක:</w:t>
+        <w:t>Way 2 — a “filter” (a hard constraint). This is what was built:</w:t>
       </w:r>
     </w:p>
     <w:p>
@@ -2215,7 +2553,7 @@
           <w:color w:val="222222"/>
           <w:sz w:val="19"/>
         </w:rPr>
-        <w:t>පියවර 1 :  මිනිසාට හානියක් වෙන විකල්ප ඔක්කොම අයින් කරන්න   ← මුලින්ම</w:t>
+        <w:t>step 1 :  remove every option that would harm the person   &lt;- first</w:t>
       </w:r>
     </w:p>
     <w:p>
@@ -2232,7 +2570,7 @@
           <w:color w:val="222222"/>
           <w:sz w:val="19"/>
         </w:rPr>
-        <w:t>පියවර 2 :  ඉතුරු ඒවා අතරින් හොඳම එක තෝරන්න</w:t>
+        <w:t>step 2 :  pick the best of whatever is left</w:t>
       </w:r>
     </w:p>
     <w:p>
@@ -2243,13 +2581,13 @@
       </w:pPr>
       <w:r>
         <w:rPr>
-          <w:rFonts w:ascii="Nirmala UI" w:hAnsi="Nirmala UI" w:cs="Nirmala UI"/>
+          <w:rFonts w:ascii="Segoe UI" w:hAnsi="Segoe UI" w:cs="Segoe UI"/>
           <w:b/>
           <w:i w:val="0"/>
           <w:color w:val="1E7A3C"/>
           <w:sz w:val="22"/>
         </w:rPr>
-        <w:t>වෙනස</w:t>
+        <w:t>The difference</w:t>
       </w:r>
     </w:p>
     <w:p>
@@ -2260,13 +2598,13 @@
       </w:pPr>
       <w:r>
         <w:rPr>
-          <w:rFonts w:ascii="Nirmala UI" w:hAnsi="Nirmala UI" w:cs="Nirmala UI"/>
+          <w:rFonts w:ascii="Segoe UI" w:hAnsi="Segoe UI" w:cs="Segoe UI"/>
           <w:b w:val="0"/>
           <w:i w:val="0"/>
           <w:color w:val="1E7A3C"/>
           <w:sz w:val="22"/>
         </w:rPr>
-        <w:t>පෙරහනකින් අයින් වුණු විකල්පයක් කිසිම මිලකට ආපහු ගන්න බෑ. ලාභය කොච්චර ලොකු වුණත් නෑ.</w:t>
+        <w:t>An option removed by the filter cannot be bought back at any price, no matter how large the profit.</w:t>
       </w:r>
     </w:p>
     <w:p>
@@ -2277,13 +2615,13 @@
       </w:pPr>
       <w:r>
         <w:rPr>
-          <w:rFonts w:ascii="Nirmala UI" w:hAnsi="Nirmala UI" w:cs="Nirmala UI"/>
+          <w:rFonts w:ascii="Segoe UI" w:hAnsi="Segoe UI" w:cs="Segoe UI"/>
           <w:b w:val="0"/>
           <w:i w:val="0"/>
           <w:color w:val="1E7A3C"/>
           <w:sz w:val="22"/>
         </w:rPr>
-        <w:t>මත්පැන් බීලා රිය පදවන එකට දඩයක් නෙවෙයි තියෙන්නේ — ඒක තහනම්. එහෙම තමයි අපි වෙහෙසට සලකන්නේ.</w:t>
+        <w:t>Drink-driving does not carry a fine you can pay to proceed — it is forbidden. Tiredness is treated the same way here.</w:t>
       </w:r>
     </w:p>
     <w:tbl>
@@ -2317,10 +2655,18 @@
               <w:spacing w:after="40" w:before="40"/>
               <w:shd w:val="clear" w:fill="1F4E79"/>
             </w:pPr>
-            <w:r/>
             <w:r>
               <w:rPr>
-                <w:rFonts w:ascii="Nirmala UI" w:hAnsi="Nirmala UI" w:cs="Nirmala UI"/>
+                <w:rFonts w:ascii="Segoe UI" w:hAnsi="Segoe UI" w:cs="Segoe UI"/>
+                <w:b w:val="0"/>
+                <w:i w:val="0"/>
+                <w:color w:val="1A1A1A"/>
+                <w:sz w:val="20"/>
+              </w:rPr>
+            </w:r>
+            <w:r>
+              <w:rPr>
+                <w:rFonts w:ascii="Segoe UI" w:hAnsi="Segoe UI" w:cs="Segoe UI"/>
                 <w:b/>
                 <w:i w:val="0"/>
                 <w:color w:val="FFFFFF"/>
@@ -2331,7 +2677,7 @@
         </w:tc>
         <w:tc>
           <w:tcPr>
-            <w:tcW w:type="dxa" w:w="2160"/>
+            <w:tcW w:type="dxa" w:w="2016"/>
             <w:shd w:val="clear" w:fill="1F4E79"/>
           </w:tcPr>
           <w:p>
@@ -2339,22 +2685,30 @@
               <w:spacing w:after="40" w:before="40"/>
               <w:shd w:val="clear" w:fill="1F4E79"/>
             </w:pPr>
-            <w:r/>
             <w:r>
               <w:rPr>
-                <w:rFonts w:ascii="Nirmala UI" w:hAnsi="Nirmala UI" w:cs="Nirmala UI"/>
+                <w:rFonts w:ascii="Segoe UI" w:hAnsi="Segoe UI" w:cs="Segoe UI"/>
+                <w:b w:val="0"/>
+                <w:i w:val="0"/>
+                <w:color w:val="1A1A1A"/>
+                <w:sz w:val="20"/>
+              </w:rPr>
+            </w:r>
+            <w:r>
+              <w:rPr>
+                <w:rFonts w:ascii="Segoe UI" w:hAnsi="Segoe UI" w:cs="Segoe UI"/>
                 <w:b/>
                 <w:i w:val="0"/>
                 <w:color w:val="FFFFFF"/>
                 <w:sz w:val="20"/>
               </w:rPr>
-              <w:t>නීතිය</w:t>
+              <w:t>The rule</w:t>
             </w:r>
           </w:p>
         </w:tc>
         <w:tc>
           <w:tcPr>
-            <w:tcW w:type="dxa" w:w="3744"/>
+            <w:tcW w:type="dxa" w:w="3600"/>
             <w:shd w:val="clear" w:fill="1F4E79"/>
           </w:tcPr>
           <w:p>
@@ -2362,22 +2716,30 @@
               <w:spacing w:after="40" w:before="40"/>
               <w:shd w:val="clear" w:fill="1F4E79"/>
             </w:pPr>
-            <w:r/>
             <w:r>
               <w:rPr>
-                <w:rFonts w:ascii="Nirmala UI" w:hAnsi="Nirmala UI" w:cs="Nirmala UI"/>
+                <w:rFonts w:ascii="Segoe UI" w:hAnsi="Segoe UI" w:cs="Segoe UI"/>
+                <w:b w:val="0"/>
+                <w:i w:val="0"/>
+                <w:color w:val="1A1A1A"/>
+                <w:sz w:val="20"/>
+              </w:rPr>
+            </w:r>
+            <w:r>
+              <w:rPr>
+                <w:rFonts w:ascii="Segoe UI" w:hAnsi="Segoe UI" w:cs="Segoe UI"/>
                 <w:b/>
                 <w:i w:val="0"/>
                 <w:color w:val="FFFFFF"/>
                 <w:sz w:val="20"/>
               </w:rPr>
-              <w:t>තේරුම</w:t>
+              <w:t>In plain words</w:t>
             </w:r>
           </w:p>
         </w:tc>
         <w:tc>
           <w:tcPr>
-            <w:tcW w:type="dxa" w:w="2304"/>
+            <w:tcW w:type="dxa" w:w="2592"/>
             <w:shd w:val="clear" w:fill="1F4E79"/>
           </w:tcPr>
           <w:p>
@@ -2385,16 +2747,24 @@
               <w:spacing w:after="40" w:before="40"/>
               <w:shd w:val="clear" w:fill="1F4E79"/>
             </w:pPr>
-            <w:r/>
             <w:r>
               <w:rPr>
-                <w:rFonts w:ascii="Nirmala UI" w:hAnsi="Nirmala UI" w:cs="Nirmala UI"/>
+                <w:rFonts w:ascii="Segoe UI" w:hAnsi="Segoe UI" w:cs="Segoe UI"/>
+                <w:b w:val="0"/>
+                <w:i w:val="0"/>
+                <w:color w:val="1A1A1A"/>
+                <w:sz w:val="20"/>
+              </w:rPr>
+            </w:r>
+            <w:r>
+              <w:rPr>
+                <w:rFonts w:ascii="Segoe UI" w:hAnsi="Segoe UI" w:cs="Segoe UI"/>
                 <w:b/>
                 <w:i w:val="0"/>
                 <w:color w:val="FFFFFF"/>
                 <w:sz w:val="20"/>
               </w:rPr>
-              <w:t>අගය කොහෙන්ද?</w:t>
+              <w:t>Where the number comes from</w:t>
             </w:r>
           </w:p>
         </w:tc>
@@ -2408,10 +2778,18 @@
             <w:pPr>
               <w:spacing w:after="40" w:before="40"/>
             </w:pPr>
-            <w:r/>
             <w:r>
               <w:rPr>
-                <w:rFonts w:ascii="Nirmala UI" w:hAnsi="Nirmala UI" w:cs="Nirmala UI"/>
+                <w:rFonts w:ascii="Segoe UI" w:hAnsi="Segoe UI" w:cs="Segoe UI"/>
+                <w:b w:val="0"/>
+                <w:i w:val="0"/>
+                <w:color w:val="1A1A1A"/>
+                <w:sz w:val="20"/>
+              </w:rPr>
+            </w:r>
+            <w:r>
+              <w:rPr>
+                <w:rFonts w:ascii="Segoe UI" w:hAnsi="Segoe UI" w:cs="Segoe UI"/>
                 <w:b w:val="0"/>
                 <w:i w:val="0"/>
                 <w:color w:val="1A1A1A"/>
@@ -2423,64 +2801,88 @@
         </w:tc>
         <w:tc>
           <w:tcPr>
-            <w:tcW w:type="dxa" w:w="2160"/>
+            <w:tcW w:type="dxa" w:w="2016"/>
           </w:tcPr>
           <w:p>
             <w:pPr>
               <w:spacing w:after="40" w:before="40"/>
             </w:pPr>
-            <w:r/>
             <w:r>
               <w:rPr>
-                <w:rFonts w:ascii="Nirmala UI" w:hAnsi="Nirmala UI" w:cs="Nirmala UI"/>
+                <w:rFonts w:ascii="Segoe UI" w:hAnsi="Segoe UI" w:cs="Segoe UI"/>
                 <w:b w:val="0"/>
                 <w:i w:val="0"/>
                 <w:color w:val="1A1A1A"/>
                 <w:sz w:val="20"/>
               </w:rPr>
-              <w:t>වෙහෙස &lt; 80%</w:t>
+            </w:r>
+            <w:r>
+              <w:rPr>
+                <w:rFonts w:ascii="Segoe UI" w:hAnsi="Segoe UI" w:cs="Segoe UI"/>
+                <w:b w:val="0"/>
+                <w:i w:val="0"/>
+                <w:color w:val="1A1A1A"/>
+                <w:sz w:val="20"/>
+              </w:rPr>
+              <w:t>tiredness &lt; 80%</w:t>
             </w:r>
           </w:p>
         </w:tc>
         <w:tc>
           <w:tcPr>
-            <w:tcW w:type="dxa" w:w="3744"/>
+            <w:tcW w:type="dxa" w:w="3600"/>
           </w:tcPr>
           <w:p>
             <w:pPr>
               <w:spacing w:after="40" w:before="40"/>
             </w:pPr>
-            <w:r/>
             <w:r>
               <w:rPr>
-                <w:rFonts w:ascii="Nirmala UI" w:hAnsi="Nirmala UI" w:cs="Nirmala UI"/>
+                <w:rFonts w:ascii="Segoe UI" w:hAnsi="Segoe UI" w:cs="Segoe UI"/>
                 <w:b w:val="0"/>
                 <w:i w:val="0"/>
                 <w:color w:val="1A1A1A"/>
                 <w:sz w:val="20"/>
               </w:rPr>
-              <w:t>තමන්ගේ සීමාවෙන් 80% පැනීම තහනම්</w:t>
+            </w:r>
+            <w:r>
+              <w:rPr>
+                <w:rFonts w:ascii="Segoe UI" w:hAnsi="Segoe UI" w:cs="Segoe UI"/>
+                <w:b w:val="0"/>
+                <w:i w:val="0"/>
+                <w:color w:val="1A1A1A"/>
+                <w:sz w:val="20"/>
+              </w:rPr>
+              <w:t>cannot go past 80% of your own limit</w:t>
             </w:r>
           </w:p>
         </w:tc>
         <w:tc>
           <w:tcPr>
-            <w:tcW w:type="dxa" w:w="2304"/>
+            <w:tcW w:type="dxa" w:w="2592"/>
           </w:tcPr>
           <w:p>
             <w:pPr>
               <w:spacing w:after="40" w:before="40"/>
             </w:pPr>
-            <w:r/>
             <w:r>
               <w:rPr>
-                <w:rFonts w:ascii="Nirmala UI" w:hAnsi="Nirmala UI" w:cs="Nirmala UI"/>
+                <w:rFonts w:ascii="Segoe UI" w:hAnsi="Segoe UI" w:cs="Segoe UI"/>
                 <w:b w:val="0"/>
                 <w:i w:val="0"/>
                 <w:color w:val="1A1A1A"/>
                 <w:sz w:val="20"/>
               </w:rPr>
-              <w:t>අපේ *</w:t>
+            </w:r>
+            <w:r>
+              <w:rPr>
+                <w:rFonts w:ascii="Segoe UI" w:hAnsi="Segoe UI" w:cs="Segoe UI"/>
+                <w:b w:val="0"/>
+                <w:i w:val="0"/>
+                <w:color w:val="1A1A1A"/>
+                <w:sz w:val="20"/>
+              </w:rPr>
+              <w:t>ours *</w:t>
             </w:r>
           </w:p>
         </w:tc>
@@ -2494,10 +2896,18 @@
             <w:pPr>
               <w:spacing w:after="40" w:before="40"/>
             </w:pPr>
-            <w:r/>
             <w:r>
               <w:rPr>
-                <w:rFonts w:ascii="Nirmala UI" w:hAnsi="Nirmala UI" w:cs="Nirmala UI"/>
+                <w:rFonts w:ascii="Segoe UI" w:hAnsi="Segoe UI" w:cs="Segoe UI"/>
+                <w:b w:val="0"/>
+                <w:i w:val="0"/>
+                <w:color w:val="1A1A1A"/>
+                <w:sz w:val="20"/>
+              </w:rPr>
+            </w:r>
+            <w:r>
+              <w:rPr>
+                <w:rFonts w:ascii="Segoe UI" w:hAnsi="Segoe UI" w:cs="Segoe UI"/>
                 <w:b w:val="0"/>
                 <w:i w:val="0"/>
                 <w:color w:val="1A1A1A"/>
@@ -2509,64 +2919,88 @@
         </w:tc>
         <w:tc>
           <w:tcPr>
-            <w:tcW w:type="dxa" w:w="2160"/>
+            <w:tcW w:type="dxa" w:w="2016"/>
           </w:tcPr>
           <w:p>
             <w:pPr>
               <w:spacing w:after="40" w:before="40"/>
             </w:pPr>
-            <w:r/>
             <w:r>
               <w:rPr>
-                <w:rFonts w:ascii="Nirmala UI" w:hAnsi="Nirmala UI" w:cs="Nirmala UI"/>
+                <w:rFonts w:ascii="Segoe UI" w:hAnsi="Segoe UI" w:cs="Segoe UI"/>
                 <w:b w:val="0"/>
                 <w:i w:val="0"/>
                 <w:color w:val="1A1A1A"/>
                 <w:sz w:val="20"/>
               </w:rPr>
-              <w:t>දක්ෂතාව ≥ 0.40</w:t>
+            </w:r>
+            <w:r>
+              <w:rPr>
+                <w:rFonts w:ascii="Segoe UI" w:hAnsi="Segoe UI" w:cs="Segoe UI"/>
+                <w:b w:val="0"/>
+                <w:i w:val="0"/>
+                <w:color w:val="1A1A1A"/>
+                <w:sz w:val="20"/>
+              </w:rPr>
+              <w:t>skill &gt;= 0.40</w:t>
             </w:r>
           </w:p>
         </w:tc>
         <w:tc>
           <w:tcPr>
-            <w:tcW w:type="dxa" w:w="3744"/>
+            <w:tcW w:type="dxa" w:w="3600"/>
           </w:tcPr>
           <w:p>
             <w:pPr>
               <w:spacing w:after="40" w:before="40"/>
             </w:pPr>
-            <w:r/>
             <w:r>
               <w:rPr>
-                <w:rFonts w:ascii="Nirmala UI" w:hAnsi="Nirmala UI" w:cs="Nirmala UI"/>
+                <w:rFonts w:ascii="Segoe UI" w:hAnsi="Segoe UI" w:cs="Segoe UI"/>
                 <w:b w:val="0"/>
                 <w:i w:val="0"/>
                 <w:color w:val="1A1A1A"/>
                 <w:sz w:val="20"/>
               </w:rPr>
-              <w:t>නොදන්නා වැඩක් දෙන එක තහනම්</w:t>
+            </w:r>
+            <w:r>
+              <w:rPr>
+                <w:rFonts w:ascii="Segoe UI" w:hAnsi="Segoe UI" w:cs="Segoe UI"/>
+                <w:b w:val="0"/>
+                <w:i w:val="0"/>
+                <w:color w:val="1A1A1A"/>
+                <w:sz w:val="20"/>
+              </w:rPr>
+              <w:t>cannot give someone a job they cannot do</w:t>
             </w:r>
           </w:p>
         </w:tc>
         <w:tc>
           <w:tcPr>
-            <w:tcW w:type="dxa" w:w="2304"/>
+            <w:tcW w:type="dxa" w:w="2592"/>
           </w:tcPr>
           <w:p>
             <w:pPr>
               <w:spacing w:after="40" w:before="40"/>
             </w:pPr>
-            <w:r/>
             <w:r>
               <w:rPr>
-                <w:rFonts w:ascii="Nirmala UI" w:hAnsi="Nirmala UI" w:cs="Nirmala UI"/>
+                <w:rFonts w:ascii="Segoe UI" w:hAnsi="Segoe UI" w:cs="Segoe UI"/>
                 <w:b w:val="0"/>
                 <w:i w:val="0"/>
                 <w:color w:val="1A1A1A"/>
                 <w:sz w:val="20"/>
               </w:rPr>
-              <w:t>අපේ</w:t>
+            </w:r>
+            <w:r>
+              <w:rPr>
+                <w:rFonts w:ascii="Segoe UI" w:hAnsi="Segoe UI" w:cs="Segoe UI"/>
+                <w:b w:val="0"/>
+                <w:i w:val="0"/>
+                <w:color w:val="1A1A1A"/>
+                <w:sz w:val="20"/>
+              </w:rPr>
+              <w:t>ours</w:t>
             </w:r>
           </w:p>
         </w:tc>
@@ -2580,10 +3014,18 @@
             <w:pPr>
               <w:spacing w:after="40" w:before="40"/>
             </w:pPr>
-            <w:r/>
             <w:r>
               <w:rPr>
-                <w:rFonts w:ascii="Nirmala UI" w:hAnsi="Nirmala UI" w:cs="Nirmala UI"/>
+                <w:rFonts w:ascii="Segoe UI" w:hAnsi="Segoe UI" w:cs="Segoe UI"/>
+                <w:b w:val="0"/>
+                <w:i w:val="0"/>
+                <w:color w:val="1A1A1A"/>
+                <w:sz w:val="20"/>
+              </w:rPr>
+            </w:r>
+            <w:r>
+              <w:rPr>
+                <w:rFonts w:ascii="Segoe UI" w:hAnsi="Segoe UI" w:cs="Segoe UI"/>
                 <w:b w:val="0"/>
                 <w:i w:val="0"/>
                 <w:color w:val="1A1A1A"/>
@@ -2595,64 +3037,88 @@
         </w:tc>
         <w:tc>
           <w:tcPr>
-            <w:tcW w:type="dxa" w:w="2160"/>
+            <w:tcW w:type="dxa" w:w="2016"/>
           </w:tcPr>
           <w:p>
             <w:pPr>
               <w:spacing w:after="40" w:before="40"/>
             </w:pPr>
-            <w:r/>
             <w:r>
               <w:rPr>
-                <w:rFonts w:ascii="Nirmala UI" w:hAnsi="Nirmala UI" w:cs="Nirmala UI"/>
+                <w:rFonts w:ascii="Segoe UI" w:hAnsi="Segoe UI" w:cs="Segoe UI"/>
                 <w:b w:val="0"/>
                 <w:i w:val="0"/>
                 <w:color w:val="1A1A1A"/>
                 <w:sz w:val="20"/>
               </w:rPr>
-              <w:t>ඉරියව් අවදානම ≤ 5</w:t>
+            </w:r>
+            <w:r>
+              <w:rPr>
+                <w:rFonts w:ascii="Segoe UI" w:hAnsi="Segoe UI" w:cs="Segoe UI"/>
+                <w:b w:val="0"/>
+                <w:i w:val="0"/>
+                <w:color w:val="1A1A1A"/>
+                <w:sz w:val="20"/>
+              </w:rPr>
+              <w:t>posture risk &lt;= 5</w:t>
             </w:r>
           </w:p>
         </w:tc>
         <w:tc>
           <w:tcPr>
-            <w:tcW w:type="dxa" w:w="3744"/>
+            <w:tcW w:type="dxa" w:w="3600"/>
           </w:tcPr>
           <w:p>
             <w:pPr>
               <w:spacing w:after="40" w:before="40"/>
             </w:pPr>
-            <w:r/>
             <w:r>
               <w:rPr>
-                <w:rFonts w:ascii="Nirmala UI" w:hAnsi="Nirmala UI" w:cs="Nirmala UI"/>
+                <w:rFonts w:ascii="Segoe UI" w:hAnsi="Segoe UI" w:cs="Segoe UI"/>
                 <w:b w:val="0"/>
                 <w:i w:val="0"/>
                 <w:color w:val="1A1A1A"/>
                 <w:sz w:val="20"/>
               </w:rPr>
-              <w:t>භයානක ඉරියව්වක් තහනම්</w:t>
+            </w:r>
+            <w:r>
+              <w:rPr>
+                <w:rFonts w:ascii="Segoe UI" w:hAnsi="Segoe UI" w:cs="Segoe UI"/>
+                <w:b w:val="0"/>
+                <w:i w:val="0"/>
+                <w:color w:val="1A1A1A"/>
+                <w:sz w:val="20"/>
+              </w:rPr>
+              <w:t>cannot use a dangerous posture</w:t>
             </w:r>
           </w:p>
         </w:tc>
         <w:tc>
           <w:tcPr>
-            <w:tcW w:type="dxa" w:w="2304"/>
+            <w:tcW w:type="dxa" w:w="2592"/>
           </w:tcPr>
           <w:p>
             <w:pPr>
               <w:spacing w:after="40" w:before="40"/>
             </w:pPr>
-            <w:r/>
             <w:r>
               <w:rPr>
-                <w:rFonts w:ascii="Nirmala UI" w:hAnsi="Nirmala UI" w:cs="Nirmala UI"/>
+                <w:rFonts w:ascii="Segoe UI" w:hAnsi="Segoe UI" w:cs="Segoe UI"/>
                 <w:b w:val="0"/>
                 <w:i w:val="0"/>
                 <w:color w:val="1A1A1A"/>
                 <w:sz w:val="20"/>
               </w:rPr>
-              <w:t>✅ සාහිත්‍යයෙන් (RULA)</w:t>
+            </w:r>
+            <w:r>
+              <w:rPr>
+                <w:rFonts w:ascii="Segoe UI" w:hAnsi="Segoe UI" w:cs="Segoe UI"/>
+                <w:b w:val="0"/>
+                <w:i w:val="0"/>
+                <w:color w:val="1A1A1A"/>
+                <w:sz w:val="20"/>
+              </w:rPr>
+              <w:t>from the literature (RULA)</w:t>
             </w:r>
           </w:p>
         </w:tc>
@@ -2666,10 +3132,18 @@
             <w:pPr>
               <w:spacing w:after="40" w:before="40"/>
             </w:pPr>
-            <w:r/>
             <w:r>
               <w:rPr>
-                <w:rFonts w:ascii="Nirmala UI" w:hAnsi="Nirmala UI" w:cs="Nirmala UI"/>
+                <w:rFonts w:ascii="Segoe UI" w:hAnsi="Segoe UI" w:cs="Segoe UI"/>
+                <w:b w:val="0"/>
+                <w:i w:val="0"/>
+                <w:color w:val="1A1A1A"/>
+                <w:sz w:val="20"/>
+              </w:rPr>
+            </w:r>
+            <w:r>
+              <w:rPr>
+                <w:rFonts w:ascii="Segoe UI" w:hAnsi="Segoe UI" w:cs="Segoe UI"/>
                 <w:b w:val="0"/>
                 <w:i w:val="0"/>
                 <w:color w:val="1A1A1A"/>
@@ -2681,64 +3155,88 @@
         </w:tc>
         <w:tc>
           <w:tcPr>
-            <w:tcW w:type="dxa" w:w="2160"/>
+            <w:tcW w:type="dxa" w:w="2016"/>
           </w:tcPr>
           <w:p>
             <w:pPr>
               <w:spacing w:after="40" w:before="40"/>
             </w:pPr>
-            <w:r/>
             <w:r>
               <w:rPr>
-                <w:rFonts w:ascii="Nirmala UI" w:hAnsi="Nirmala UI" w:cs="Nirmala UI"/>
+                <w:rFonts w:ascii="Segoe UI" w:hAnsi="Segoe UI" w:cs="Segoe UI"/>
                 <w:b w:val="0"/>
                 <w:i w:val="0"/>
                 <w:color w:val="1A1A1A"/>
                 <w:sz w:val="20"/>
               </w:rPr>
-              <w:t>යන්ත්‍ර සෞඛ්‍යය &gt; 0.30</w:t>
+            </w:r>
+            <w:r>
+              <w:rPr>
+                <w:rFonts w:ascii="Segoe UI" w:hAnsi="Segoe UI" w:cs="Segoe UI"/>
+                <w:b w:val="0"/>
+                <w:i w:val="0"/>
+                <w:color w:val="1A1A1A"/>
+                <w:sz w:val="20"/>
+              </w:rPr>
+              <w:t>machine health &gt; 0.30</w:t>
             </w:r>
           </w:p>
         </w:tc>
         <w:tc>
           <w:tcPr>
-            <w:tcW w:type="dxa" w:w="3744"/>
+            <w:tcW w:type="dxa" w:w="3600"/>
           </w:tcPr>
           <w:p>
             <w:pPr>
               <w:spacing w:after="40" w:before="40"/>
             </w:pPr>
-            <w:r/>
             <w:r>
               <w:rPr>
-                <w:rFonts w:ascii="Nirmala UI" w:hAnsi="Nirmala UI" w:cs="Nirmala UI"/>
+                <w:rFonts w:ascii="Segoe UI" w:hAnsi="Segoe UI" w:cs="Segoe UI"/>
                 <w:b w:val="0"/>
                 <w:i w:val="0"/>
                 <w:color w:val="1A1A1A"/>
                 <w:sz w:val="20"/>
               </w:rPr>
-              <w:t>කැඩෙන්න ළං යන්ත්‍රයක් තහනම්</w:t>
+            </w:r>
+            <w:r>
+              <w:rPr>
+                <w:rFonts w:ascii="Segoe UI" w:hAnsi="Segoe UI" w:cs="Segoe UI"/>
+                <w:b w:val="0"/>
+                <w:i w:val="0"/>
+                <w:color w:val="1A1A1A"/>
+                <w:sz w:val="20"/>
+              </w:rPr>
+              <w:t>cannot use a machine about to fail</w:t>
             </w:r>
           </w:p>
         </w:tc>
         <w:tc>
           <w:tcPr>
-            <w:tcW w:type="dxa" w:w="2304"/>
+            <w:tcW w:type="dxa" w:w="2592"/>
           </w:tcPr>
           <w:p>
             <w:pPr>
               <w:spacing w:after="40" w:before="40"/>
             </w:pPr>
-            <w:r/>
             <w:r>
               <w:rPr>
-                <w:rFonts w:ascii="Nirmala UI" w:hAnsi="Nirmala UI" w:cs="Nirmala UI"/>
+                <w:rFonts w:ascii="Segoe UI" w:hAnsi="Segoe UI" w:cs="Segoe UI"/>
                 <w:b w:val="0"/>
                 <w:i w:val="0"/>
                 <w:color w:val="1A1A1A"/>
                 <w:sz w:val="20"/>
               </w:rPr>
-              <w:t>අපේ</w:t>
+            </w:r>
+            <w:r>
+              <w:rPr>
+                <w:rFonts w:ascii="Segoe UI" w:hAnsi="Segoe UI" w:cs="Segoe UI"/>
+                <w:b w:val="0"/>
+                <w:i w:val="0"/>
+                <w:color w:val="1A1A1A"/>
+                <w:sz w:val="20"/>
+              </w:rPr>
+              <w:t>ours</w:t>
             </w:r>
           </w:p>
         </w:tc>
@@ -2755,13 +3253,13 @@
       </w:pPr>
       <w:r>
         <w:rPr>
-          <w:rFonts w:ascii="Nirmala UI" w:hAnsi="Nirmala UI" w:cs="Nirmala UI"/>
+          <w:rFonts w:ascii="Segoe UI" w:hAnsi="Segoe UI" w:cs="Segoe UI"/>
           <w:b w:val="0"/>
           <w:i/>
           <w:color w:val="555555"/>
           <w:sz w:val="20"/>
         </w:rPr>
-        <w:t>* “80%” කියන අංකය අපේ. ඒත් 80% කුමකින්ද කියන එක සාහිත්‍යයෙන් — ඒක “දිගටම දරාගන්න පුළුවන් උපරිමයෙන්” 80%. වේග සීමාව 60 km/h කියලා දාන එක තෝරාගැනීමක්; ඒත් “km/h” කියන මිනුම තෝරාගැනීමක් නෙවෙයි.</w:t>
+        <w:t>* The number 80% is ours. But what it is 80% of comes from the literature — it is 80% of the rate that person can sustain all day. Setting a speed limit at 60 km/h is a choice; the unit “km/h” is not.</w:t>
       </w:r>
     </w:p>
     <w:p>
@@ -2770,13 +3268,13 @@
       </w:pPr>
       <w:r>
         <w:rPr>
-          <w:rFonts w:ascii="Nirmala UI" w:hAnsi="Nirmala UI" w:cs="Nirmala UI"/>
+          <w:rFonts w:ascii="Segoe UI" w:hAnsi="Segoe UI" w:cs="Segoe UI"/>
           <w:b w:val="0"/>
           <w:i/>
           <w:color w:val="555555"/>
           <w:sz w:val="20"/>
         </w:rPr>
-        <w:t>සහ අපි ඒවා පරීක්ෂා කළා: HC1 එක 0.70 · 0.80 · 0.90 කරලා බැලුවා — තුනේම එකම නිගමනය. HC4 එක අයින් කළත් කිසිම වෙනසක් නෑ. HC1 සහ HC3 අයින් කළොත් ඇත්තටම මිනිසුන්ට හානි වෙනවා.</w:t>
+        <w:t>And they were tested. HC1 was rerun at 0.70, 0.80 and 0.90 — the same conclusion every time. Removing HC4 changed nothing at all. Removing HC1 or HC3 caused real harm to the workers.</w:t>
       </w:r>
     </w:p>
     <w:p>
@@ -2785,28 +3283,28 @@
       </w:pPr>
       <w:r>
         <w:rPr>
-          <w:rFonts w:ascii="Nirmala UI" w:hAnsi="Nirmala UI" w:cs="Nirmala UI"/>
+          <w:rFonts w:ascii="Segoe UI" w:hAnsi="Segoe UI" w:cs="Segoe UI"/>
           <w:b/>
           <w:i w:val="0"/>
           <w:color w:val="1F4E79"/>
           <w:sz w:val="32"/>
         </w:rPr>
-        <w:t xml:space="preserve">6️⃣   </w:t>
+        <w:t xml:space="preserve">6   </w:t>
       </w:r>
       <w:r>
         <w:rPr>
-          <w:rFonts w:ascii="Nirmala UI" w:hAnsi="Nirmala UI" w:cs="Nirmala UI"/>
+          <w:rFonts w:ascii="Segoe UI" w:hAnsi="Segoe UI" w:cs="Segoe UI"/>
           <w:b/>
           <w:i w:val="0"/>
           <w:color w:val="1F4E79"/>
           <w:sz w:val="30"/>
         </w:rPr>
-        <w:t>පරීක්ෂා කරපු විදිහ</w:t>
+        <w:t>How it was tested</w:t>
       </w:r>
     </w:p>
     <w:p>
       <w:pPr>
-        <w:spacing w:after="160" w:before="0"/>
+        <w:spacing w:after="160"/>
         <w:pBdr>
           <w:bottom w:val="single" w:sz="6" w:color="1F4E79"/>
         </w:pBdr>
@@ -2818,13 +3316,13 @@
       </w:pPr>
       <w:r>
         <w:rPr>
-          <w:rFonts w:ascii="Nirmala UI" w:hAnsi="Nirmala UI" w:cs="Nirmala UI"/>
+          <w:rFonts w:ascii="Segoe UI" w:hAnsi="Segoe UI" w:cs="Segoe UI"/>
           <w:b w:val="0"/>
           <w:i w:val="0"/>
           <w:color w:val="1A1A1A"/>
           <w:sz w:val="22"/>
         </w:rPr>
-        <w:t>ප්‍රශ්නය: ලෝකයේ යන්ත්‍ර දත්තත් මිනිස් දත්තත් එකට තියෙන කර්මාන්තශාලා dataset එකක් නෑ.</w:t>
+        <w:t>The obstacle: no public dataset in the world contains machine data and human data from the same factory.</w:t>
       </w:r>
     </w:p>
     <w:p>
@@ -2833,13 +3331,13 @@
       </w:pPr>
       <w:r>
         <w:rPr>
-          <w:rFonts w:ascii="Nirmala UI" w:hAnsi="Nirmala UI" w:cs="Nirmala UI"/>
+          <w:rFonts w:ascii="Segoe UI" w:hAnsi="Segoe UI" w:cs="Segoe UI"/>
           <w:b w:val="0"/>
           <w:i w:val="0"/>
           <w:color w:val="1A1A1A"/>
           <w:sz w:val="22"/>
         </w:rPr>
-        <w:t>විසඳුම: simulation එකක් (පරිගණකයේ කර්මාන්තශාලාවක්) — ඒත් සංඛ්‍යා ඇත්ත දත්තවලින්:</w:t>
+        <w:t>The answer: a simulation — a factory inside the computer — but with every number taken from real data:</w:t>
       </w:r>
     </w:p>
     <w:p>
@@ -2856,7 +3354,7 @@
           <w:color w:val="222222"/>
           <w:sz w:val="19"/>
         </w:rPr>
-        <w:t>යන්ත්‍රයේ ආයුෂ     ←  ඇත්ත maintenance dataset එකකින්</w:t>
+        <w:t>machine lifetime      &lt;-  a real maintenance dataset</w:t>
       </w:r>
     </w:p>
     <w:p>
@@ -2873,7 +3371,7 @@
           <w:color w:val="222222"/>
           <w:sz w:val="19"/>
         </w:rPr>
-        <w:t>විදුලි පරිභෝජනය    ←  ඇත්ත වානේ කර්මාන්තශාලාවක දත්තවලින්</w:t>
+        <w:t>electricity use       &lt;-  a real steel plant's records</w:t>
       </w:r>
     </w:p>
     <w:p>
@@ -2890,7 +3388,7 @@
           <w:color w:val="222222"/>
           <w:sz w:val="19"/>
         </w:rPr>
-        <w:t>දෝෂ අනුපාතය       ←  ඇත්ත semiconductor නිෂ්පාදන දත්තවලින්</w:t>
+        <w:t>defect rate           &lt;-  a real semiconductor production line</w:t>
       </w:r>
     </w:p>
     <w:p>
@@ -2907,7 +3405,7 @@
           <w:color w:val="222222"/>
           <w:sz w:val="19"/>
         </w:rPr>
-        <w:t>මිනිසාගේ ශරීරය     ←  ප්‍රකාශිත වෛද්‍ය සමීකරණවලින්</w:t>
+        <w:t>the human body        &lt;-  published medical equations</w:t>
       </w:r>
     </w:p>
     <w:tbl>
@@ -2939,16 +3437,24 @@
               <w:spacing w:after="40" w:before="40"/>
               <w:shd w:val="clear" w:fill="1F4E79"/>
             </w:pPr>
-            <w:r/>
             <w:r>
               <w:rPr>
-                <w:rFonts w:ascii="Nirmala UI" w:hAnsi="Nirmala UI" w:cs="Nirmala UI"/>
+                <w:rFonts w:ascii="Segoe UI" w:hAnsi="Segoe UI" w:cs="Segoe UI"/>
+                <w:b w:val="0"/>
+                <w:i w:val="0"/>
+                <w:color w:val="1A1A1A"/>
+                <w:sz w:val="20"/>
+              </w:rPr>
+            </w:r>
+            <w:r>
+              <w:rPr>
+                <w:rFonts w:ascii="Segoe UI" w:hAnsi="Segoe UI" w:cs="Segoe UI"/>
                 <w:b/>
                 <w:i w:val="0"/>
                 <w:color w:val="FFFFFF"/>
                 <w:sz w:val="20"/>
               </w:rPr>
-              <w:t>ක්‍රමය</w:t>
+              <w:t>Method</w:t>
             </w:r>
           </w:p>
         </w:tc>
@@ -2962,16 +3468,24 @@
               <w:spacing w:after="40" w:before="40"/>
               <w:shd w:val="clear" w:fill="1F4E79"/>
             </w:pPr>
-            <w:r/>
             <w:r>
               <w:rPr>
-                <w:rFonts w:ascii="Nirmala UI" w:hAnsi="Nirmala UI" w:cs="Nirmala UI"/>
+                <w:rFonts w:ascii="Segoe UI" w:hAnsi="Segoe UI" w:cs="Segoe UI"/>
+                <w:b w:val="0"/>
+                <w:i w:val="0"/>
+                <w:color w:val="1A1A1A"/>
+                <w:sz w:val="20"/>
+              </w:rPr>
+            </w:r>
+            <w:r>
+              <w:rPr>
+                <w:rFonts w:ascii="Segoe UI" w:hAnsi="Segoe UI" w:cs="Segoe UI"/>
                 <w:b/>
                 <w:i w:val="0"/>
                 <w:color w:val="FFFFFF"/>
                 <w:sz w:val="20"/>
               </w:rPr>
-              <w:t>විස්තරය</w:t>
+              <w:t>What it does</w:t>
             </w:r>
           </w:p>
         </w:tc>
@@ -2985,10 +3499,18 @@
             <w:pPr>
               <w:spacing w:after="40" w:before="40"/>
             </w:pPr>
-            <w:r/>
             <w:r>
               <w:rPr>
-                <w:rFonts w:ascii="Nirmala UI" w:hAnsi="Nirmala UI" w:cs="Nirmala UI"/>
+                <w:rFonts w:ascii="Segoe UI" w:hAnsi="Segoe UI" w:cs="Segoe UI"/>
+                <w:b w:val="0"/>
+                <w:i w:val="0"/>
+                <w:color w:val="1A1A1A"/>
+                <w:sz w:val="20"/>
+              </w:rPr>
+            </w:r>
+            <w:r>
+              <w:rPr>
+                <w:rFonts w:ascii="Segoe UI" w:hAnsi="Segoe UI" w:cs="Segoe UI"/>
                 <w:b w:val="0"/>
                 <w:i w:val="0"/>
                 <w:color w:val="1A1A1A"/>
@@ -3006,16 +3528,24 @@
             <w:pPr>
               <w:spacing w:after="40" w:before="40"/>
             </w:pPr>
-            <w:r/>
             <w:r>
               <w:rPr>
-                <w:rFonts w:ascii="Nirmala UI" w:hAnsi="Nirmala UI" w:cs="Nirmala UI"/>
+                <w:rFonts w:ascii="Segoe UI" w:hAnsi="Segoe UI" w:cs="Segoe UI"/>
                 <w:b w:val="0"/>
                 <w:i w:val="0"/>
                 <w:color w:val="1A1A1A"/>
                 <w:sz w:val="20"/>
               </w:rPr>
-              <w:t>අහඹු ලෙස වැඩ බෙදනවා (පහළම මට්ටම)</w:t>
+            </w:r>
+            <w:r>
+              <w:rPr>
+                <w:rFonts w:ascii="Segoe UI" w:hAnsi="Segoe UI" w:cs="Segoe UI"/>
+                <w:b w:val="0"/>
+                <w:i w:val="0"/>
+                <w:color w:val="1A1A1A"/>
+                <w:sz w:val="20"/>
+              </w:rPr>
+              <w:t>assigns work at random (a floor, for sanity)</w:t>
             </w:r>
           </w:p>
         </w:tc>
@@ -3029,10 +3559,18 @@
             <w:pPr>
               <w:spacing w:after="40" w:before="40"/>
             </w:pPr>
-            <w:r/>
             <w:r>
               <w:rPr>
-                <w:rFonts w:ascii="Nirmala UI" w:hAnsi="Nirmala UI" w:cs="Nirmala UI"/>
+                <w:rFonts w:ascii="Segoe UI" w:hAnsi="Segoe UI" w:cs="Segoe UI"/>
+                <w:b w:val="0"/>
+                <w:i w:val="0"/>
+                <w:color w:val="1A1A1A"/>
+                <w:sz w:val="20"/>
+              </w:rPr>
+            </w:r>
+            <w:r>
+              <w:rPr>
+                <w:rFonts w:ascii="Segoe UI" w:hAnsi="Segoe UI" w:cs="Segoe UI"/>
                 <w:b w:val="0"/>
                 <w:i w:val="0"/>
                 <w:color w:val="1A1A1A"/>
@@ -3050,16 +3588,24 @@
             <w:pPr>
               <w:spacing w:after="40" w:before="40"/>
             </w:pPr>
-            <w:r/>
             <w:r>
               <w:rPr>
-                <w:rFonts w:ascii="Nirmala UI" w:hAnsi="Nirmala UI" w:cs="Nirmala UI"/>
+                <w:rFonts w:ascii="Segoe UI" w:hAnsi="Segoe UI" w:cs="Segoe UI"/>
                 <w:b w:val="0"/>
                 <w:i w:val="0"/>
                 <w:color w:val="1A1A1A"/>
                 <w:sz w:val="20"/>
               </w:rPr>
-              <w:t>Industry 4.0 — යන්ත්‍ර twin එක පූර්ණ බලයෙන්, ඒත් මිනිසා ගැන බලන්නේ නෑ</w:t>
+            </w:r>
+            <w:r>
+              <w:rPr>
+                <w:rFonts w:ascii="Segoe UI" w:hAnsi="Segoe UI" w:cs="Segoe UI"/>
+                <w:b w:val="0"/>
+                <w:i w:val="0"/>
+                <w:color w:val="1A1A1A"/>
+                <w:sz w:val="20"/>
+              </w:rPr>
+              <w:t>Industry 4.0 — full machine twin, but blind to the person</w:t>
             </w:r>
           </w:p>
         </w:tc>
@@ -3073,10 +3619,18 @@
             <w:pPr>
               <w:spacing w:after="40" w:before="40"/>
             </w:pPr>
-            <w:r/>
             <w:r>
               <w:rPr>
-                <w:rFonts w:ascii="Nirmala UI" w:hAnsi="Nirmala UI" w:cs="Nirmala UI"/>
+                <w:rFonts w:ascii="Segoe UI" w:hAnsi="Segoe UI" w:cs="Segoe UI"/>
+                <w:b w:val="0"/>
+                <w:i w:val="0"/>
+                <w:color w:val="1A1A1A"/>
+                <w:sz w:val="20"/>
+              </w:rPr>
+            </w:r>
+            <w:r>
+              <w:rPr>
+                <w:rFonts w:ascii="Segoe UI" w:hAnsi="Segoe UI" w:cs="Segoe UI"/>
                 <w:b w:val="0"/>
                 <w:i w:val="0"/>
                 <w:color w:val="1A1A1A"/>
@@ -3094,16 +3648,24 @@
             <w:pPr>
               <w:spacing w:after="40" w:before="40"/>
             </w:pPr>
-            <w:r/>
             <w:r>
               <w:rPr>
-                <w:rFonts w:ascii="Nirmala UI" w:hAnsi="Nirmala UI" w:cs="Nirmala UI"/>
+                <w:rFonts w:ascii="Segoe UI" w:hAnsi="Segoe UI" w:cs="Segoe UI"/>
                 <w:b w:val="0"/>
                 <w:i w:val="0"/>
                 <w:color w:val="1A1A1A"/>
                 <w:sz w:val="20"/>
               </w:rPr>
-              <w:t>අපේ එක — twin දෙකම + තහනම් නීති</w:t>
+            </w:r>
+            <w:r>
+              <w:rPr>
+                <w:rFonts w:ascii="Segoe UI" w:hAnsi="Segoe UI" w:cs="Segoe UI"/>
+                <w:b w:val="0"/>
+                <w:i w:val="0"/>
+                <w:color w:val="1A1A1A"/>
+                <w:sz w:val="20"/>
+              </w:rPr>
+              <w:t>this research — both twins, plus the forbidden rules</w:t>
             </w:r>
           </w:p>
         </w:tc>
@@ -3128,7 +3690,7 @@
           <w:color w:val="222222"/>
           <w:sz w:val="19"/>
         </w:rPr>
-        <w:t>තත්ත්ව 3ක් :  සාමාන්‍ය  ·  ඉල්ලුම 150%  ·  යන්ත්‍ර කැඩීම</w:t>
+        <w:t>three situations :  normal  ·  demand at 150%  ·  machines break</w:t>
       </w:r>
     </w:p>
     <w:p>
@@ -3145,7 +3707,7 @@
           <w:color w:val="222222"/>
           <w:sz w:val="19"/>
         </w:rPr>
-        <w:t>ධාවනය      :  3 × 3 × seeds 30  =  runs 270</w:t>
+        <w:t>runs             :  3 x 3 x 30 random seeds  =  270 runs</w:t>
       </w:r>
     </w:p>
     <w:p>
@@ -3156,13 +3718,13 @@
       </w:pPr>
       <w:r>
         <w:rPr>
-          <w:rFonts w:ascii="Nirmala UI" w:hAnsi="Nirmala UI" w:cs="Nirmala UI"/>
+          <w:rFonts w:ascii="Segoe UI" w:hAnsi="Segoe UI" w:cs="Segoe UI"/>
           <w:b/>
           <w:i w:val="0"/>
           <w:color w:val="1F4E79"/>
           <w:sz w:val="22"/>
         </w:rPr>
-        <w:t>B2 එක දුර්වල කරන්න බෑ.</w:t>
+        <w:t>B2 was not allowed to be weak.</w:t>
       </w:r>
     </w:p>
     <w:p>
@@ -3173,13 +3735,13 @@
       </w:pPr>
       <w:r>
         <w:rPr>
-          <w:rFonts w:ascii="Nirmala UI" w:hAnsi="Nirmala UI" w:cs="Nirmala UI"/>
+          <w:rFonts w:ascii="Segoe UI" w:hAnsi="Segoe UI" w:cs="Segoe UI"/>
           <w:b w:val="0"/>
           <w:i w:val="0"/>
           <w:color w:val="1F4E79"/>
           <w:sz w:val="22"/>
         </w:rPr>
-        <w:t>ඒක “පිදුරු මිනිසෙක්” නම් ඒක වංචාවක්. ඒ නිසා B2 එකට යන්ත්‍ර twin එකේ සම්පූර්ණ බලය දුන්නා. එකම වෙනස: මිනිසා ගැන හිතන්නේ නෑ.</w:t>
+        <w:t>A straw opponent would make the whole comparison worthless. B2 keeps the machine twin at full strength. The only difference is that it does not think about the person.</w:t>
       </w:r>
     </w:p>
     <w:p>
@@ -3188,28 +3750,28 @@
       </w:pPr>
       <w:r>
         <w:rPr>
-          <w:rFonts w:ascii="Nirmala UI" w:hAnsi="Nirmala UI" w:cs="Nirmala UI"/>
+          <w:rFonts w:ascii="Segoe UI" w:hAnsi="Segoe UI" w:cs="Segoe UI"/>
           <w:b/>
           <w:i w:val="0"/>
           <w:color w:val="1F4E79"/>
           <w:sz w:val="32"/>
         </w:rPr>
-        <w:t xml:space="preserve">7️⃣   </w:t>
+        <w:t xml:space="preserve">7   </w:t>
       </w:r>
       <w:r>
         <w:rPr>
-          <w:rFonts w:ascii="Nirmala UI" w:hAnsi="Nirmala UI" w:cs="Nirmala UI"/>
+          <w:rFonts w:ascii="Segoe UI" w:hAnsi="Segoe UI" w:cs="Segoe UI"/>
           <w:b/>
           <w:i w:val="0"/>
           <w:color w:val="1F4E79"/>
           <w:sz w:val="30"/>
         </w:rPr>
-        <w:t>ප්‍රතිඵල — එකින් එක</w:t>
+        <w:t>The results, one by one</w:t>
       </w:r>
     </w:p>
     <w:p>
       <w:pPr>
-        <w:spacing w:after="160" w:before="0"/>
+        <w:spacing w:after="160"/>
         <w:pBdr>
           <w:bottom w:val="single" w:sz="6" w:color="1F4E79"/>
         </w:pBdr>
@@ -3221,13 +3783,13 @@
       </w:pPr>
       <w:r>
         <w:rPr>
-          <w:rFonts w:ascii="Nirmala UI" w:hAnsi="Nirmala UI" w:cs="Nirmala UI"/>
+          <w:rFonts w:ascii="Segoe UI" w:hAnsi="Segoe UI" w:cs="Segoe UI"/>
           <w:b/>
           <w:i w:val="0"/>
           <w:color w:val="1A1A1A"/>
           <w:sz w:val="22"/>
         </w:rPr>
-        <w:t>ඉල්ලුම වැඩි තත්ත්වයේ, අපේ එක vs Industry 4.0:</w:t>
+        <w:t>Under high demand, this research against Industry 4.0:</w:t>
       </w:r>
     </w:p>
     <w:tbl>
@@ -3261,16 +3823,24 @@
               <w:spacing w:after="40" w:before="40"/>
               <w:shd w:val="clear" w:fill="1F4E79"/>
             </w:pPr>
-            <w:r/>
             <w:r>
               <w:rPr>
-                <w:rFonts w:ascii="Nirmala UI" w:hAnsi="Nirmala UI" w:cs="Nirmala UI"/>
+                <w:rFonts w:ascii="Segoe UI" w:hAnsi="Segoe UI" w:cs="Segoe UI"/>
+                <w:b w:val="0"/>
+                <w:i w:val="0"/>
+                <w:color w:val="1A1A1A"/>
+                <w:sz w:val="20"/>
+              </w:rPr>
+            </w:r>
+            <w:r>
+              <w:rPr>
+                <w:rFonts w:ascii="Segoe UI" w:hAnsi="Segoe UI" w:cs="Segoe UI"/>
                 <w:b/>
                 <w:i w:val="0"/>
                 <w:color w:val="FFFFFF"/>
                 <w:sz w:val="20"/>
               </w:rPr>
-              <w:t>ප්‍රතිඵලය</w:t>
+              <w:t>Measure</w:t>
             </w:r>
           </w:p>
         </w:tc>
@@ -3284,10 +3854,18 @@
               <w:spacing w:after="40" w:before="40"/>
               <w:shd w:val="clear" w:fill="1F4E79"/>
             </w:pPr>
-            <w:r/>
             <w:r>
               <w:rPr>
-                <w:rFonts w:ascii="Nirmala UI" w:hAnsi="Nirmala UI" w:cs="Nirmala UI"/>
+                <w:rFonts w:ascii="Segoe UI" w:hAnsi="Segoe UI" w:cs="Segoe UI"/>
+                <w:b w:val="0"/>
+                <w:i w:val="0"/>
+                <w:color w:val="1A1A1A"/>
+                <w:sz w:val="20"/>
+              </w:rPr>
+            </w:r>
+            <w:r>
+              <w:rPr>
+                <w:rFonts w:ascii="Segoe UI" w:hAnsi="Segoe UI" w:cs="Segoe UI"/>
                 <w:b/>
                 <w:i w:val="0"/>
                 <w:color w:val="FFFFFF"/>
@@ -3307,16 +3885,24 @@
               <w:spacing w:after="40" w:before="40"/>
               <w:shd w:val="clear" w:fill="1F4E79"/>
             </w:pPr>
-            <w:r/>
             <w:r>
               <w:rPr>
-                <w:rFonts w:ascii="Nirmala UI" w:hAnsi="Nirmala UI" w:cs="Nirmala UI"/>
+                <w:rFonts w:ascii="Segoe UI" w:hAnsi="Segoe UI" w:cs="Segoe UI"/>
+                <w:b w:val="0"/>
+                <w:i w:val="0"/>
+                <w:color w:val="1A1A1A"/>
+                <w:sz w:val="20"/>
+              </w:rPr>
+            </w:r>
+            <w:r>
+              <w:rPr>
+                <w:rFonts w:ascii="Segoe UI" w:hAnsi="Segoe UI" w:cs="Segoe UI"/>
                 <w:b/>
                 <w:i w:val="0"/>
                 <w:color w:val="FFFFFF"/>
                 <w:sz w:val="20"/>
               </w:rPr>
-              <w:t>අපේ එක</w:t>
+              <w:t>This work</w:t>
             </w:r>
           </w:p>
         </w:tc>
@@ -3330,16 +3916,24 @@
               <w:spacing w:after="40" w:before="40"/>
               <w:shd w:val="clear" w:fill="1F4E79"/>
             </w:pPr>
-            <w:r/>
             <w:r>
               <w:rPr>
-                <w:rFonts w:ascii="Nirmala UI" w:hAnsi="Nirmala UI" w:cs="Nirmala UI"/>
+                <w:rFonts w:ascii="Segoe UI" w:hAnsi="Segoe UI" w:cs="Segoe UI"/>
+                <w:b w:val="0"/>
+                <w:i w:val="0"/>
+                <w:color w:val="1A1A1A"/>
+                <w:sz w:val="20"/>
+              </w:rPr>
+            </w:r>
+            <w:r>
+              <w:rPr>
+                <w:rFonts w:ascii="Segoe UI" w:hAnsi="Segoe UI" w:cs="Segoe UI"/>
                 <w:b/>
                 <w:i w:val="0"/>
                 <w:color w:val="FFFFFF"/>
                 <w:sz w:val="20"/>
               </w:rPr>
-              <w:t>වෙනස</w:t>
+              <w:t>Change</w:t>
             </w:r>
           </w:p>
         </w:tc>
@@ -3353,16 +3947,24 @@
             <w:pPr>
               <w:spacing w:after="40" w:before="40"/>
             </w:pPr>
-            <w:r/>
             <w:r>
               <w:rPr>
-                <w:rFonts w:ascii="Nirmala UI" w:hAnsi="Nirmala UI" w:cs="Nirmala UI"/>
+                <w:rFonts w:ascii="Segoe UI" w:hAnsi="Segoe UI" w:cs="Segoe UI"/>
                 <w:b w:val="0"/>
                 <w:i w:val="0"/>
                 <w:color w:val="1A1A1A"/>
                 <w:sz w:val="20"/>
               </w:rPr>
-              <w:t>වෙහෙස</w:t>
+            </w:r>
+            <w:r>
+              <w:rPr>
+                <w:rFonts w:ascii="Segoe UI" w:hAnsi="Segoe UI" w:cs="Segoe UI"/>
+                <w:b w:val="0"/>
+                <w:i w:val="0"/>
+                <w:color w:val="1A1A1A"/>
+                <w:sz w:val="20"/>
+              </w:rPr>
+              <w:t>Tiredness</w:t>
             </w:r>
           </w:p>
         </w:tc>
@@ -3374,10 +3976,18 @@
             <w:pPr>
               <w:spacing w:after="40" w:before="40"/>
             </w:pPr>
-            <w:r/>
             <w:r>
               <w:rPr>
-                <w:rFonts w:ascii="Nirmala UI" w:hAnsi="Nirmala UI" w:cs="Nirmala UI"/>
+                <w:rFonts w:ascii="Segoe UI" w:hAnsi="Segoe UI" w:cs="Segoe UI"/>
+                <w:b w:val="0"/>
+                <w:i w:val="0"/>
+                <w:color w:val="1A1A1A"/>
+                <w:sz w:val="20"/>
+              </w:rPr>
+            </w:r>
+            <w:r>
+              <w:rPr>
+                <w:rFonts w:ascii="Segoe UI" w:hAnsi="Segoe UI" w:cs="Segoe UI"/>
                 <w:b w:val="0"/>
                 <w:i w:val="0"/>
                 <w:color w:val="1A1A1A"/>
@@ -3395,10 +4005,18 @@
             <w:pPr>
               <w:spacing w:after="40" w:before="40"/>
             </w:pPr>
-            <w:r/>
             <w:r>
               <w:rPr>
-                <w:rFonts w:ascii="Nirmala UI" w:hAnsi="Nirmala UI" w:cs="Nirmala UI"/>
+                <w:rFonts w:ascii="Segoe UI" w:hAnsi="Segoe UI" w:cs="Segoe UI"/>
+                <w:b w:val="0"/>
+                <w:i w:val="0"/>
+                <w:color w:val="1A1A1A"/>
+                <w:sz w:val="20"/>
+              </w:rPr>
+            </w:r>
+            <w:r>
+              <w:rPr>
+                <w:rFonts w:ascii="Segoe UI" w:hAnsi="Segoe UI" w:cs="Segoe UI"/>
                 <w:b w:val="0"/>
                 <w:i w:val="0"/>
                 <w:color w:val="1A1A1A"/>
@@ -3416,16 +4034,24 @@
             <w:pPr>
               <w:spacing w:after="40" w:before="40"/>
             </w:pPr>
-            <w:r/>
             <w:r>
               <w:rPr>
-                <w:rFonts w:ascii="Nirmala UI" w:hAnsi="Nirmala UI" w:cs="Nirmala UI"/>
+                <w:rFonts w:ascii="Segoe UI" w:hAnsi="Segoe UI" w:cs="Segoe UI"/>
                 <w:b w:val="0"/>
                 <w:i w:val="0"/>
                 <w:color w:val="1A1A1A"/>
                 <w:sz w:val="20"/>
               </w:rPr>
-              <w:t>▼ 27%</w:t>
+            </w:r>
+            <w:r>
+              <w:rPr>
+                <w:rFonts w:ascii="Segoe UI" w:hAnsi="Segoe UI" w:cs="Segoe UI"/>
+                <w:b w:val="0"/>
+                <w:i w:val="0"/>
+                <w:color w:val="1A1A1A"/>
+                <w:sz w:val="20"/>
+              </w:rPr>
+              <w:t>down 27%</w:t>
             </w:r>
           </w:p>
         </w:tc>
@@ -3439,16 +4065,24 @@
             <w:pPr>
               <w:spacing w:after="40" w:before="40"/>
             </w:pPr>
-            <w:r/>
             <w:r>
               <w:rPr>
-                <w:rFonts w:ascii="Nirmala UI" w:hAnsi="Nirmala UI" w:cs="Nirmala UI"/>
+                <w:rFonts w:ascii="Segoe UI" w:hAnsi="Segoe UI" w:cs="Segoe UI"/>
                 <w:b w:val="0"/>
                 <w:i w:val="0"/>
                 <w:color w:val="1A1A1A"/>
                 <w:sz w:val="20"/>
               </w:rPr>
-              <w:t>නීති කැඩීම (shift එකකට)</w:t>
+            </w:r>
+            <w:r>
+              <w:rPr>
+                <w:rFonts w:ascii="Segoe UI" w:hAnsi="Segoe UI" w:cs="Segoe UI"/>
+                <w:b w:val="0"/>
+                <w:i w:val="0"/>
+                <w:color w:val="1A1A1A"/>
+                <w:sz w:val="20"/>
+              </w:rPr>
+              <w:t>Rules broken (per shift)</w:t>
             </w:r>
           </w:p>
         </w:tc>
@@ -3460,10 +4094,18 @@
             <w:pPr>
               <w:spacing w:after="40" w:before="40"/>
             </w:pPr>
-            <w:r/>
             <w:r>
               <w:rPr>
-                <w:rFonts w:ascii="Nirmala UI" w:hAnsi="Nirmala UI" w:cs="Nirmala UI"/>
+                <w:rFonts w:ascii="Segoe UI" w:hAnsi="Segoe UI" w:cs="Segoe UI"/>
+                <w:b w:val="0"/>
+                <w:i w:val="0"/>
+                <w:color w:val="1A1A1A"/>
+                <w:sz w:val="20"/>
+              </w:rPr>
+            </w:r>
+            <w:r>
+              <w:rPr>
+                <w:rFonts w:ascii="Segoe UI" w:hAnsi="Segoe UI" w:cs="Segoe UI"/>
                 <w:b w:val="0"/>
                 <w:i w:val="0"/>
                 <w:color w:val="1A1A1A"/>
@@ -3481,10 +4123,18 @@
             <w:pPr>
               <w:spacing w:after="40" w:before="40"/>
             </w:pPr>
-            <w:r/>
             <w:r>
               <w:rPr>
-                <w:rFonts w:ascii="Nirmala UI" w:hAnsi="Nirmala UI" w:cs="Nirmala UI"/>
+                <w:rFonts w:ascii="Segoe UI" w:hAnsi="Segoe UI" w:cs="Segoe UI"/>
+                <w:b w:val="0"/>
+                <w:i w:val="0"/>
+                <w:color w:val="1A1A1A"/>
+                <w:sz w:val="20"/>
+              </w:rPr>
+            </w:r>
+            <w:r>
+              <w:rPr>
+                <w:rFonts w:ascii="Segoe UI" w:hAnsi="Segoe UI" w:cs="Segoe UI"/>
                 <w:b w:val="0"/>
                 <w:i w:val="0"/>
                 <w:color w:val="1A1A1A"/>
@@ -3502,16 +4152,24 @@
             <w:pPr>
               <w:spacing w:after="40" w:before="40"/>
             </w:pPr>
-            <w:r/>
             <w:r>
               <w:rPr>
-                <w:rFonts w:ascii="Nirmala UI" w:hAnsi="Nirmala UI" w:cs="Nirmala UI"/>
+                <w:rFonts w:ascii="Segoe UI" w:hAnsi="Segoe UI" w:cs="Segoe UI"/>
                 <w:b w:val="0"/>
                 <w:i w:val="0"/>
                 <w:color w:val="1A1A1A"/>
                 <w:sz w:val="20"/>
               </w:rPr>
-              <w:t>▼ 100%</w:t>
+            </w:r>
+            <w:r>
+              <w:rPr>
+                <w:rFonts w:ascii="Segoe UI" w:hAnsi="Segoe UI" w:cs="Segoe UI"/>
+                <w:b w:val="0"/>
+                <w:i w:val="0"/>
+                <w:color w:val="1A1A1A"/>
+                <w:sz w:val="20"/>
+              </w:rPr>
+              <w:t>down 100%</w:t>
             </w:r>
           </w:p>
         </w:tc>
@@ -3525,16 +4183,24 @@
             <w:pPr>
               <w:spacing w:after="40" w:before="40"/>
             </w:pPr>
-            <w:r/>
             <w:r>
               <w:rPr>
-                <w:rFonts w:ascii="Nirmala UI" w:hAnsi="Nirmala UI" w:cs="Nirmala UI"/>
+                <w:rFonts w:ascii="Segoe UI" w:hAnsi="Segoe UI" w:cs="Segoe UI"/>
                 <w:b w:val="0"/>
                 <w:i w:val="0"/>
                 <w:color w:val="1A1A1A"/>
                 <w:sz w:val="20"/>
               </w:rPr>
-              <w:t>විදුලිය ඒකකයකට</w:t>
+            </w:r>
+            <w:r>
+              <w:rPr>
+                <w:rFonts w:ascii="Segoe UI" w:hAnsi="Segoe UI" w:cs="Segoe UI"/>
+                <w:b w:val="0"/>
+                <w:i w:val="0"/>
+                <w:color w:val="1A1A1A"/>
+                <w:sz w:val="20"/>
+              </w:rPr>
+              <w:t>Electricity per unit</w:t>
             </w:r>
           </w:p>
         </w:tc>
@@ -3546,10 +4212,18 @@
             <w:pPr>
               <w:spacing w:after="40" w:before="40"/>
             </w:pPr>
-            <w:r/>
             <w:r>
               <w:rPr>
-                <w:rFonts w:ascii="Nirmala UI" w:hAnsi="Nirmala UI" w:cs="Nirmala UI"/>
+                <w:rFonts w:ascii="Segoe UI" w:hAnsi="Segoe UI" w:cs="Segoe UI"/>
+                <w:b w:val="0"/>
+                <w:i w:val="0"/>
+                <w:color w:val="1A1A1A"/>
+                <w:sz w:val="20"/>
+              </w:rPr>
+            </w:r>
+            <w:r>
+              <w:rPr>
+                <w:rFonts w:ascii="Segoe UI" w:hAnsi="Segoe UI" w:cs="Segoe UI"/>
                 <w:b w:val="0"/>
                 <w:i w:val="0"/>
                 <w:color w:val="1A1A1A"/>
@@ -3567,10 +4241,18 @@
             <w:pPr>
               <w:spacing w:after="40" w:before="40"/>
             </w:pPr>
-            <w:r/>
             <w:r>
               <w:rPr>
-                <w:rFonts w:ascii="Nirmala UI" w:hAnsi="Nirmala UI" w:cs="Nirmala UI"/>
+                <w:rFonts w:ascii="Segoe UI" w:hAnsi="Segoe UI" w:cs="Segoe UI"/>
+                <w:b w:val="0"/>
+                <w:i w:val="0"/>
+                <w:color w:val="1A1A1A"/>
+                <w:sz w:val="20"/>
+              </w:rPr>
+            </w:r>
+            <w:r>
+              <w:rPr>
+                <w:rFonts w:ascii="Segoe UI" w:hAnsi="Segoe UI" w:cs="Segoe UI"/>
                 <w:b w:val="0"/>
                 <w:i w:val="0"/>
                 <w:color w:val="1A1A1A"/>
@@ -3588,16 +4270,24 @@
             <w:pPr>
               <w:spacing w:after="40" w:before="40"/>
             </w:pPr>
-            <w:r/>
             <w:r>
               <w:rPr>
-                <w:rFonts w:ascii="Nirmala UI" w:hAnsi="Nirmala UI" w:cs="Nirmala UI"/>
+                <w:rFonts w:ascii="Segoe UI" w:hAnsi="Segoe UI" w:cs="Segoe UI"/>
                 <w:b w:val="0"/>
                 <w:i w:val="0"/>
                 <w:color w:val="1A1A1A"/>
                 <w:sz w:val="20"/>
               </w:rPr>
-              <w:t>▼ 31%</w:t>
+            </w:r>
+            <w:r>
+              <w:rPr>
+                <w:rFonts w:ascii="Segoe UI" w:hAnsi="Segoe UI" w:cs="Segoe UI"/>
+                <w:b w:val="0"/>
+                <w:i w:val="0"/>
+                <w:color w:val="1A1A1A"/>
+                <w:sz w:val="20"/>
+              </w:rPr>
+              <w:t>down 31%</w:t>
             </w:r>
           </w:p>
         </w:tc>
@@ -3611,16 +4301,24 @@
             <w:pPr>
               <w:spacing w:after="40" w:before="40"/>
             </w:pPr>
-            <w:r/>
             <w:r>
               <w:rPr>
-                <w:rFonts w:ascii="Nirmala UI" w:hAnsi="Nirmala UI" w:cs="Nirmala UI"/>
+                <w:rFonts w:ascii="Segoe UI" w:hAnsi="Segoe UI" w:cs="Segoe UI"/>
                 <w:b w:val="0"/>
                 <w:i w:val="0"/>
                 <w:color w:val="1A1A1A"/>
                 <w:sz w:val="20"/>
               </w:rPr>
-              <w:t>CO₂</w:t>
+            </w:r>
+            <w:r>
+              <w:rPr>
+                <w:rFonts w:ascii="Segoe UI" w:hAnsi="Segoe UI" w:cs="Segoe UI"/>
+                <w:b w:val="0"/>
+                <w:i w:val="0"/>
+                <w:color w:val="1A1A1A"/>
+                <w:sz w:val="20"/>
+              </w:rPr>
+              <w:t>Carbon</w:t>
             </w:r>
           </w:p>
         </w:tc>
@@ -3632,10 +4330,18 @@
             <w:pPr>
               <w:spacing w:after="40" w:before="40"/>
             </w:pPr>
-            <w:r/>
             <w:r>
               <w:rPr>
-                <w:rFonts w:ascii="Nirmala UI" w:hAnsi="Nirmala UI" w:cs="Nirmala UI"/>
+                <w:rFonts w:ascii="Segoe UI" w:hAnsi="Segoe UI" w:cs="Segoe UI"/>
+                <w:b w:val="0"/>
+                <w:i w:val="0"/>
+                <w:color w:val="1A1A1A"/>
+                <w:sz w:val="20"/>
+              </w:rPr>
+            </w:r>
+            <w:r>
+              <w:rPr>
+                <w:rFonts w:ascii="Segoe UI" w:hAnsi="Segoe UI" w:cs="Segoe UI"/>
                 <w:b w:val="0"/>
                 <w:i w:val="0"/>
                 <w:color w:val="1A1A1A"/>
@@ -3653,10 +4359,18 @@
             <w:pPr>
               <w:spacing w:after="40" w:before="40"/>
             </w:pPr>
-            <w:r/>
             <w:r>
               <w:rPr>
-                <w:rFonts w:ascii="Nirmala UI" w:hAnsi="Nirmala UI" w:cs="Nirmala UI"/>
+                <w:rFonts w:ascii="Segoe UI" w:hAnsi="Segoe UI" w:cs="Segoe UI"/>
+                <w:b w:val="0"/>
+                <w:i w:val="0"/>
+                <w:color w:val="1A1A1A"/>
+                <w:sz w:val="20"/>
+              </w:rPr>
+            </w:r>
+            <w:r>
+              <w:rPr>
+                <w:rFonts w:ascii="Segoe UI" w:hAnsi="Segoe UI" w:cs="Segoe UI"/>
                 <w:b w:val="0"/>
                 <w:i w:val="0"/>
                 <w:color w:val="1A1A1A"/>
@@ -3674,16 +4388,24 @@
             <w:pPr>
               <w:spacing w:after="40" w:before="40"/>
             </w:pPr>
-            <w:r/>
             <w:r>
               <w:rPr>
-                <w:rFonts w:ascii="Nirmala UI" w:hAnsi="Nirmala UI" w:cs="Nirmala UI"/>
+                <w:rFonts w:ascii="Segoe UI" w:hAnsi="Segoe UI" w:cs="Segoe UI"/>
                 <w:b w:val="0"/>
                 <w:i w:val="0"/>
                 <w:color w:val="1A1A1A"/>
                 <w:sz w:val="20"/>
               </w:rPr>
-              <w:t>▼ 32%</w:t>
+            </w:r>
+            <w:r>
+              <w:rPr>
+                <w:rFonts w:ascii="Segoe UI" w:hAnsi="Segoe UI" w:cs="Segoe UI"/>
+                <w:b w:val="0"/>
+                <w:i w:val="0"/>
+                <w:color w:val="1A1A1A"/>
+                <w:sz w:val="20"/>
+              </w:rPr>
+              <w:t>down 32%</w:t>
             </w:r>
           </w:p>
         </w:tc>
@@ -3697,16 +4419,24 @@
             <w:pPr>
               <w:spacing w:after="40" w:before="40"/>
             </w:pPr>
-            <w:r/>
             <w:r>
               <w:rPr>
-                <w:rFonts w:ascii="Nirmala UI" w:hAnsi="Nirmala UI" w:cs="Nirmala UI"/>
+                <w:rFonts w:ascii="Segoe UI" w:hAnsi="Segoe UI" w:cs="Segoe UI"/>
                 <w:b w:val="0"/>
                 <w:i w:val="0"/>
                 <w:color w:val="1A1A1A"/>
                 <w:sz w:val="20"/>
               </w:rPr>
-              <w:t>යන්ත්‍ර නැවතුම්</w:t>
+            </w:r>
+            <w:r>
+              <w:rPr>
+                <w:rFonts w:ascii="Segoe UI" w:hAnsi="Segoe UI" w:cs="Segoe UI"/>
+                <w:b w:val="0"/>
+                <w:i w:val="0"/>
+                <w:color w:val="1A1A1A"/>
+                <w:sz w:val="20"/>
+              </w:rPr>
+              <w:t>Machine stoppages</w:t>
             </w:r>
           </w:p>
         </w:tc>
@@ -3718,10 +4448,18 @@
             <w:pPr>
               <w:spacing w:after="40" w:before="40"/>
             </w:pPr>
-            <w:r/>
             <w:r>
               <w:rPr>
-                <w:rFonts w:ascii="Nirmala UI" w:hAnsi="Nirmala UI" w:cs="Nirmala UI"/>
+                <w:rFonts w:ascii="Segoe UI" w:hAnsi="Segoe UI" w:cs="Segoe UI"/>
+                <w:b w:val="0"/>
+                <w:i w:val="0"/>
+                <w:color w:val="1A1A1A"/>
+                <w:sz w:val="20"/>
+              </w:rPr>
+            </w:r>
+            <w:r>
+              <w:rPr>
+                <w:rFonts w:ascii="Segoe UI" w:hAnsi="Segoe UI" w:cs="Segoe UI"/>
                 <w:b w:val="0"/>
                 <w:i w:val="0"/>
                 <w:color w:val="1A1A1A"/>
@@ -3739,10 +4477,18 @@
             <w:pPr>
               <w:spacing w:after="40" w:before="40"/>
             </w:pPr>
-            <w:r/>
             <w:r>
               <w:rPr>
-                <w:rFonts w:ascii="Nirmala UI" w:hAnsi="Nirmala UI" w:cs="Nirmala UI"/>
+                <w:rFonts w:ascii="Segoe UI" w:hAnsi="Segoe UI" w:cs="Segoe UI"/>
+                <w:b w:val="0"/>
+                <w:i w:val="0"/>
+                <w:color w:val="1A1A1A"/>
+                <w:sz w:val="20"/>
+              </w:rPr>
+            </w:r>
+            <w:r>
+              <w:rPr>
+                <w:rFonts w:ascii="Segoe UI" w:hAnsi="Segoe UI" w:cs="Segoe UI"/>
                 <w:b w:val="0"/>
                 <w:i w:val="0"/>
                 <w:color w:val="1A1A1A"/>
@@ -3760,16 +4506,24 @@
             <w:pPr>
               <w:spacing w:after="40" w:before="40"/>
             </w:pPr>
-            <w:r/>
             <w:r>
               <w:rPr>
-                <w:rFonts w:ascii="Nirmala UI" w:hAnsi="Nirmala UI" w:cs="Nirmala UI"/>
+                <w:rFonts w:ascii="Segoe UI" w:hAnsi="Segoe UI" w:cs="Segoe UI"/>
                 <w:b w:val="0"/>
                 <w:i w:val="0"/>
                 <w:color w:val="1A1A1A"/>
                 <w:sz w:val="20"/>
               </w:rPr>
-              <w:t>▼ 27%</w:t>
+            </w:r>
+            <w:r>
+              <w:rPr>
+                <w:rFonts w:ascii="Segoe UI" w:hAnsi="Segoe UI" w:cs="Segoe UI"/>
+                <w:b w:val="0"/>
+                <w:i w:val="0"/>
+                <w:color w:val="1A1A1A"/>
+                <w:sz w:val="20"/>
+              </w:rPr>
+              <w:t>down 27%</w:t>
             </w:r>
           </w:p>
         </w:tc>
@@ -3783,16 +4537,24 @@
             <w:pPr>
               <w:spacing w:after="40" w:before="40"/>
             </w:pPr>
-            <w:r/>
             <w:r>
               <w:rPr>
-                <w:rFonts w:ascii="Nirmala UI" w:hAnsi="Nirmala UI" w:cs="Nirmala UI"/>
+                <w:rFonts w:ascii="Segoe UI" w:hAnsi="Segoe UI" w:cs="Segoe UI"/>
                 <w:b w:val="0"/>
                 <w:i w:val="0"/>
                 <w:color w:val="1A1A1A"/>
                 <w:sz w:val="20"/>
               </w:rPr>
-              <w:t>නිෂ්පාදනය</w:t>
+            </w:r>
+            <w:r>
+              <w:rPr>
+                <w:rFonts w:ascii="Segoe UI" w:hAnsi="Segoe UI" w:cs="Segoe UI"/>
+                <w:b w:val="0"/>
+                <w:i w:val="0"/>
+                <w:color w:val="1A1A1A"/>
+                <w:sz w:val="20"/>
+              </w:rPr>
+              <w:t>Output</w:t>
             </w:r>
           </w:p>
         </w:tc>
@@ -3804,10 +4566,18 @@
             <w:pPr>
               <w:spacing w:after="40" w:before="40"/>
             </w:pPr>
-            <w:r/>
             <w:r>
               <w:rPr>
-                <w:rFonts w:ascii="Nirmala UI" w:hAnsi="Nirmala UI" w:cs="Nirmala UI"/>
+                <w:rFonts w:ascii="Segoe UI" w:hAnsi="Segoe UI" w:cs="Segoe UI"/>
+                <w:b w:val="0"/>
+                <w:i w:val="0"/>
+                <w:color w:val="1A1A1A"/>
+                <w:sz w:val="20"/>
+              </w:rPr>
+            </w:r>
+            <w:r>
+              <w:rPr>
+                <w:rFonts w:ascii="Segoe UI" w:hAnsi="Segoe UI" w:cs="Segoe UI"/>
                 <w:b w:val="0"/>
                 <w:i w:val="0"/>
                 <w:color w:val="1A1A1A"/>
@@ -3825,10 +4595,18 @@
             <w:pPr>
               <w:spacing w:after="40" w:before="40"/>
             </w:pPr>
-            <w:r/>
             <w:r>
               <w:rPr>
-                <w:rFonts w:ascii="Nirmala UI" w:hAnsi="Nirmala UI" w:cs="Nirmala UI"/>
+                <w:rFonts w:ascii="Segoe UI" w:hAnsi="Segoe UI" w:cs="Segoe UI"/>
+                <w:b w:val="0"/>
+                <w:i w:val="0"/>
+                <w:color w:val="1A1A1A"/>
+                <w:sz w:val="20"/>
+              </w:rPr>
+            </w:r>
+            <w:r>
+              <w:rPr>
+                <w:rFonts w:ascii="Segoe UI" w:hAnsi="Segoe UI" w:cs="Segoe UI"/>
                 <w:b w:val="0"/>
                 <w:i w:val="0"/>
                 <w:color w:val="1A1A1A"/>
@@ -3846,16 +4624,24 @@
             <w:pPr>
               <w:spacing w:after="40" w:before="40"/>
             </w:pPr>
-            <w:r/>
             <w:r>
               <w:rPr>
-                <w:rFonts w:ascii="Nirmala UI" w:hAnsi="Nirmala UI" w:cs="Nirmala UI"/>
+                <w:rFonts w:ascii="Segoe UI" w:hAnsi="Segoe UI" w:cs="Segoe UI"/>
                 <w:b w:val="0"/>
                 <w:i w:val="0"/>
                 <w:color w:val="1A1A1A"/>
                 <w:sz w:val="20"/>
               </w:rPr>
-              <w:t>▼ 1.8%  ← වැදගත්</w:t>
+            </w:r>
+            <w:r>
+              <w:rPr>
+                <w:rFonts w:ascii="Segoe UI" w:hAnsi="Segoe UI" w:cs="Segoe UI"/>
+                <w:b w:val="0"/>
+                <w:i w:val="0"/>
+                <w:color w:val="1A1A1A"/>
+                <w:sz w:val="20"/>
+              </w:rPr>
+              <w:t>down 1.8%  &lt;- the key one</w:t>
             </w:r>
           </w:p>
         </w:tc>
@@ -3874,13 +4660,13 @@
       </w:pPr>
       <w:r>
         <w:rPr>
-          <w:rFonts w:ascii="Nirmala UI" w:hAnsi="Nirmala UI" w:cs="Nirmala UI"/>
+          <w:rFonts w:ascii="Segoe UI" w:hAnsi="Segoe UI" w:cs="Segoe UI"/>
           <w:b/>
           <w:i w:val="0"/>
           <w:color w:val="1E7A3C"/>
           <w:sz w:val="22"/>
         </w:rPr>
-        <w:t>★★★  පත්‍රිකාවේ ප්‍රධානම වාක්‍යය</w:t>
+        <w:t>The single most important sentence in the paper</w:t>
       </w:r>
     </w:p>
     <w:p>
@@ -3891,13 +4677,13 @@
       </w:pPr>
       <w:r>
         <w:rPr>
-          <w:rFonts w:ascii="Nirmala UI" w:hAnsi="Nirmala UI" w:cs="Nirmala UI"/>
+          <w:rFonts w:ascii="Segoe UI" w:hAnsi="Segoe UI" w:cs="Segoe UI"/>
           <w:b w:val="0"/>
           <w:i w:val="0"/>
           <w:color w:val="1E7A3C"/>
           <w:sz w:val="22"/>
         </w:rPr>
-        <w:t>ඉල්ලුම වැඩිම වෙලාවේ — Industry 4.0 ක්‍රමය මිනිසාව වැඩිපුරම හිර කරන වෙලාවේ — මිනිසා රැක ගැනීමට මනින්න පුළුවන් නිෂ්පාදන අලාභයක් වුණේ නෑ.</w:t>
+        <w:t>At the moment of highest demand — exactly when a throughput-driven scheduler pushes people hardest — protecting the workers cost no measurable production.</w:t>
       </w:r>
     </w:p>
     <w:p>
@@ -3908,13 +4694,13 @@
       </w:pPr>
       <w:r>
         <w:rPr>
-          <w:rFonts w:ascii="Nirmala UI" w:hAnsi="Nirmala UI" w:cs="Nirmala UI"/>
+          <w:rFonts w:ascii="Segoe UI" w:hAnsi="Segoe UI" w:cs="Segoe UI"/>
           <w:b w:val="0"/>
           <w:i w:val="0"/>
           <w:color w:val="1E7A3C"/>
           <w:sz w:val="22"/>
         </w:rPr>
-        <w:t>ඒ 1.8% අඩුවීමේ p = 0.148. ඒ කියන්නේ ඒක අහම්බයකින් වෙන්න පුළුවන් — ඇත්ත වෙනසක් නොවෙන්න පුළුවන්.</w:t>
+        <w:t>That 1.8% has p = 0.148, which means it could easily be chance rather than a real difference.</w:t>
       </w:r>
     </w:p>
     <w:p>
@@ -3923,13 +4709,13 @@
       </w:pPr>
       <w:r>
         <w:rPr>
-          <w:rFonts w:ascii="Nirmala UI" w:hAnsi="Nirmala UI" w:cs="Nirmala UI"/>
+          <w:rFonts w:ascii="Segoe UI" w:hAnsi="Segoe UI" w:cs="Segoe UI"/>
           <w:b w:val="0"/>
           <w:i w:val="0"/>
           <w:color w:val="1A1A1A"/>
           <w:sz w:val="22"/>
         </w:rPr>
-        <w:t>සහ තවත් එකක්: යන්ත්‍රත් අඩුවෙන් නවතිනවා (−27%). ඒ කියන්නේ “මිනිසාට හොඳ දේ යන්ත්‍රයටත් හොඳයි”. වෙහෙසුණු කෙනා වැරදි කරනවා → යන්ත්‍රයට බර වැඩියි.</w:t>
+        <w:t>And one more: the machines stopped less often too (down 27%). What is good for the person turns out to be good for the equipment — a tired worker makes mistakes, and the machine absorbs the consequences.</w:t>
       </w:r>
     </w:p>
     <w:p>
@@ -3938,28 +4724,28 @@
       </w:pPr>
       <w:r>
         <w:rPr>
-          <w:rFonts w:ascii="Nirmala UI" w:hAnsi="Nirmala UI" w:cs="Nirmala UI"/>
+          <w:rFonts w:ascii="Segoe UI" w:hAnsi="Segoe UI" w:cs="Segoe UI"/>
           <w:b/>
           <w:i w:val="0"/>
           <w:color w:val="1F4E79"/>
           <w:sz w:val="32"/>
         </w:rPr>
-        <w:t xml:space="preserve">8️⃣   </w:t>
+        <w:t xml:space="preserve">8   </w:t>
       </w:r>
       <w:r>
         <w:rPr>
-          <w:rFonts w:ascii="Nirmala UI" w:hAnsi="Nirmala UI" w:cs="Nirmala UI"/>
+          <w:rFonts w:ascii="Segoe UI" w:hAnsi="Segoe UI" w:cs="Segoe UI"/>
           <w:b/>
           <w:i w:val="0"/>
           <w:color w:val="1F4E79"/>
           <w:sz w:val="30"/>
         </w:rPr>
-        <w:t>බලාපොරොත්තු නොවූ ලොකුම සොයාගැනීම</w:t>
+        <w:t>The most surprising finding</w:t>
       </w:r>
     </w:p>
     <w:p>
       <w:pPr>
-        <w:spacing w:after="160" w:before="0"/>
+        <w:spacing w:after="160"/>
         <w:pBdr>
           <w:bottom w:val="single" w:sz="6" w:color="1F4E79"/>
         </w:pBdr>
@@ -3971,13 +4757,13 @@
       </w:pPr>
       <w:r>
         <w:rPr>
-          <w:rFonts w:ascii="Nirmala UI" w:hAnsi="Nirmala UI" w:cs="Nirmala UI"/>
+          <w:rFonts w:ascii="Segoe UI" w:hAnsi="Segoe UI" w:cs="Segoe UI"/>
           <w:b w:val="0"/>
           <w:i w:val="0"/>
           <w:color w:val="1A1A1A"/>
           <w:sz w:val="22"/>
         </w:rPr>
-        <w:t>අපි “ප්‍රමුඛතා” 4ක් හැදුවා — මිනිසාට, පරිසරයට, ලාභයට, සමානව. ඒවා හතර හාත්පසින්ම වෙනස්.</w:t>
+        <w:t>Four different sets of priorities were tried — favouring the person, the planet, profit, and a balance. They differ enormously.</w:t>
       </w:r>
     </w:p>
     <w:p>
@@ -3994,7 +4780,7 @@
           <w:color w:val="222222"/>
           <w:sz w:val="19"/>
         </w:rPr>
-        <w:t>W-Balanced :  වෙහෙස 0.541      නිෂ්පාදනය 90.2</w:t>
+        <w:t>balanced     :  tiredness 0.541      output 90.2</w:t>
       </w:r>
     </w:p>
     <w:p>
@@ -4011,7 +4797,7 @@
           <w:color w:val="222222"/>
           <w:sz w:val="19"/>
         </w:rPr>
-        <w:t>W-Human    :  වෙහෙස 0.541      නිෂ්පාදනය 90.3</w:t>
+        <w:t>people first :  tiredness 0.541      output 90.3</w:t>
       </w:r>
     </w:p>
     <w:p>
@@ -4028,7 +4814,7 @@
           <w:color w:val="222222"/>
           <w:sz w:val="19"/>
         </w:rPr>
-        <w:t>W-Green    :  වෙහෙස 0.542      නිෂ්පාදනය 90.3</w:t>
+        <w:t>planet first :  tiredness 0.542      output 90.3</w:t>
       </w:r>
     </w:p>
     <w:p>
@@ -4045,7 +4831,7 @@
           <w:color w:val="222222"/>
           <w:sz w:val="19"/>
         </w:rPr>
-        <w:t>W-Profit   :  වෙහෙස 0.542      නිෂ්පාදනය 90.3</w:t>
+        <w:t>profit first :  tiredness 0.542      output 90.3</w:t>
       </w:r>
     </w:p>
     <w:p>
@@ -4062,7 +4848,7 @@
           <w:color w:val="222222"/>
           <w:sz w:val="19"/>
         </w:rPr>
-        <w:t xml:space="preserve">                 ↑                    ↑</w:t>
+        <w:t xml:space="preserve">                    ^                    ^</w:t>
       </w:r>
     </w:p>
     <w:p>
@@ -4079,7 +4865,7 @@
           <w:color w:val="222222"/>
           <w:sz w:val="19"/>
         </w:rPr>
-        <w:t xml:space="preserve">             හතරම එකයි!          හතරම එකයි!</w:t>
+        <w:t xml:space="preserve">                 identical            identical</w:t>
       </w:r>
     </w:p>
     <w:p>
@@ -4088,13 +4874,13 @@
       </w:pPr>
       <w:r>
         <w:rPr>
-          <w:rFonts w:ascii="Nirmala UI" w:hAnsi="Nirmala UI" w:cs="Nirmala UI"/>
+          <w:rFonts w:ascii="Segoe UI" w:hAnsi="Segoe UI" w:cs="Segoe UI"/>
           <w:b/>
           <w:i w:val="0"/>
           <w:color w:val="1A1A1A"/>
           <w:sz w:val="22"/>
         </w:rPr>
-        <w:t>ඇයි? ගණන් කරලා බැලුවා:</w:t>
+        <w:t>Why? Measuring it gave the answer:</w:t>
       </w:r>
     </w:p>
     <w:p>
@@ -4111,7 +4897,7 @@
           <w:color w:val="222222"/>
           <w:sz w:val="19"/>
         </w:rPr>
-        <w:t>තහනම් නීති පෙරලාට පස්සේ...</w:t>
+        <w:t>after the forbidden rules filter the options...</w:t>
       </w:r>
     </w:p>
     <w:p>
@@ -4128,7 +4914,7 @@
           <w:color w:val="222222"/>
           <w:sz w:val="19"/>
         </w:rPr>
-        <w:t>තීරණ 45,754න්  →  95.7%ට  ඉතුරු වෙන්නේ  විකල්ප 0 හෝ 1යි!</w:t>
+        <w:t>in 95.7% of 45,754 decisions, either 0 or 1 option is left</w:t>
       </w:r>
     </w:p>
     <w:p>
@@ -4139,13 +4925,13 @@
       </w:pPr>
       <w:r>
         <w:rPr>
-          <w:rFonts w:ascii="Nirmala UI" w:hAnsi="Nirmala UI" w:cs="Nirmala UI"/>
+          <w:rFonts w:ascii="Segoe UI" w:hAnsi="Segoe UI" w:cs="Segoe UI"/>
           <w:b/>
           <w:i w:val="0"/>
           <w:color w:val="1F4E79"/>
           <w:sz w:val="22"/>
         </w:rPr>
-        <w:t>උපමාව — කෑම කඩේ</w:t>
+        <w:t>An analogy — the restaurant</w:t>
       </w:r>
     </w:p>
     <w:p>
@@ -4156,13 +4942,13 @@
       </w:pPr>
       <w:r>
         <w:rPr>
-          <w:rFonts w:ascii="Nirmala UI" w:hAnsi="Nirmala UI" w:cs="Nirmala UI"/>
+          <w:rFonts w:ascii="Segoe UI" w:hAnsi="Segoe UI" w:cs="Segoe UI"/>
           <w:b w:val="0"/>
           <w:i w:val="0"/>
           <w:color w:val="1F4E79"/>
           <w:sz w:val="22"/>
         </w:rPr>
-        <w:t>ඔබට කුකුල් මස් ආසයි, මාළු එපා. ඒත් කඩේ නීති යෙදුවම menu එකේ ඉතුරු වෙන්නේ එක් කෑමක් විතරයි.</w:t>
+        <w:t>You love chicken and hate fish. But by the time the kitchen's rules are applied, one dish is left on the menu.</w:t>
       </w:r>
     </w:p>
     <w:p>
@@ -4173,13 +4959,13 @@
       </w:pPr>
       <w:r>
         <w:rPr>
-          <w:rFonts w:ascii="Nirmala UI" w:hAnsi="Nirmala UI" w:cs="Nirmala UI"/>
+          <w:rFonts w:ascii="Segoe UI" w:hAnsi="Segoe UI" w:cs="Segoe UI"/>
           <w:b w:val="0"/>
           <w:i w:val="0"/>
           <w:color w:val="1F4E79"/>
           <w:sz w:val="22"/>
         </w:rPr>
-        <w:t>දැන් ඔබේ කැමැත්තෙන් වැඩක් තියෙනවද? නෑ. තියෙන්නේ එකයි.</w:t>
+        <w:t>Do your preferences matter now? No. There is only one thing to order.</w:t>
       </w:r>
     </w:p>
     <w:p>
@@ -4190,13 +4976,13 @@
       </w:pPr>
       <w:r>
         <w:rPr>
-          <w:rFonts w:ascii="Nirmala UI" w:hAnsi="Nirmala UI" w:cs="Nirmala UI"/>
+          <w:rFonts w:ascii="Segoe UI" w:hAnsi="Segoe UI" w:cs="Segoe UI"/>
           <w:b w:val="0"/>
           <w:i w:val="0"/>
           <w:color w:val="1F4E79"/>
           <w:sz w:val="22"/>
         </w:rPr>
-        <w:t>තෝරන්න දෙයක් නෑ නම්, කැමැත්තෙන් වැඩක් නෑ.</w:t>
+        <w:t>When there is nothing to choose between, preferences change nothing.</w:t>
       </w:r>
     </w:p>
     <w:p>
@@ -4207,13 +4993,13 @@
       </w:pPr>
       <w:r>
         <w:rPr>
-          <w:rFonts w:ascii="Nirmala UI" w:hAnsi="Nirmala UI" w:cs="Nirmala UI"/>
+          <w:rFonts w:ascii="Segoe UI" w:hAnsi="Segoe UI" w:cs="Segoe UI"/>
           <w:b/>
           <w:i w:val="0"/>
           <w:color w:val="1E7A3C"/>
           <w:sz w:val="22"/>
         </w:rPr>
-        <w:t>මේක හොඳ ආරංචියක් — නරක එකක් නෙවෙයි</w:t>
+        <w:t>This is good news, not bad</w:t>
       </w:r>
     </w:p>
     <w:p>
@@ -4224,13 +5010,13 @@
       </w:pPr>
       <w:r>
         <w:rPr>
-          <w:rFonts w:ascii="Nirmala UI" w:hAnsi="Nirmala UI" w:cs="Nirmala UI"/>
+          <w:rFonts w:ascii="Segoe UI" w:hAnsi="Segoe UI" w:cs="Segoe UI"/>
           <w:b w:val="0"/>
           <w:i w:val="0"/>
           <w:color w:val="1E7A3C"/>
           <w:sz w:val="22"/>
         </w:rPr>
-        <w:t>ප්‍රමුඛතාවක් වෙනස් කරලා මිනිසාගේ ආරක්ෂාව අයින් කරන්න බෑ. ලාභයට 100% ප්‍රමුඛතාවය දුන්නත් වෙහෙසේ තහනම තාමත් තියෙනවා.</w:t>
+        <w:t>It means no change of priorities can strip the protection away. Even with profit weighted at 100%, the ban on exceeding the tiredness limit is still there.</w:t>
       </w:r>
     </w:p>
     <w:p>
@@ -4241,13 +5027,13 @@
       </w:pPr>
       <w:r>
         <w:rPr>
-          <w:rFonts w:ascii="Nirmala UI" w:hAnsi="Nirmala UI" w:cs="Nirmala UI"/>
+          <w:rFonts w:ascii="Segoe UI" w:hAnsi="Segoe UI" w:cs="Segoe UI"/>
           <w:b w:val="0"/>
           <w:i w:val="0"/>
           <w:color w:val="1E7A3C"/>
           <w:sz w:val="22"/>
         </w:rPr>
-        <w:t>“මේ framework එක මෙහෙයවන්නේ තහනම් නීතියි — ප්‍රමුඛතා නෙවෙයි.”</w:t>
+        <w:t>“This framework is steered by its constraints — not by its priorities.”</w:t>
       </w:r>
     </w:p>
     <w:p>
@@ -4256,28 +5042,28 @@
       </w:pPr>
       <w:r>
         <w:rPr>
-          <w:rFonts w:ascii="Nirmala UI" w:hAnsi="Nirmala UI" w:cs="Nirmala UI"/>
+          <w:rFonts w:ascii="Segoe UI" w:hAnsi="Segoe UI" w:cs="Segoe UI"/>
           <w:b/>
           <w:i w:val="0"/>
           <w:color w:val="1F4E79"/>
           <w:sz w:val="32"/>
         </w:rPr>
-        <w:t xml:space="preserve">9️⃣   </w:t>
+        <w:t xml:space="preserve">9   </w:t>
       </w:r>
       <w:r>
         <w:rPr>
-          <w:rFonts w:ascii="Nirmala UI" w:hAnsi="Nirmala UI" w:cs="Nirmala UI"/>
+          <w:rFonts w:ascii="Segoe UI" w:hAnsi="Segoe UI" w:cs="Segoe UI"/>
           <w:b/>
           <w:i w:val="0"/>
           <w:color w:val="1F4E79"/>
           <w:sz w:val="30"/>
         </w:rPr>
-        <w:t>අවංකව කිව්ව දුර්වලතා</w:t>
+        <w:t>The weaknesses, stated honestly</w:t>
       </w:r>
     </w:p>
     <w:p>
       <w:pPr>
-        <w:spacing w:after="160" w:before="0"/>
+        <w:spacing w:after="160"/>
         <w:pBdr>
           <w:bottom w:val="single" w:sz="6" w:color="1F4E79"/>
         </w:pBdr>
@@ -4289,13 +5075,13 @@
       </w:pPr>
       <w:r>
         <w:rPr>
-          <w:rFonts w:ascii="Nirmala UI" w:hAnsi="Nirmala UI" w:cs="Nirmala UI"/>
+          <w:rFonts w:ascii="Segoe UI" w:hAnsi="Segoe UI" w:cs="Segoe UI"/>
           <w:b w:val="0"/>
           <w:i/>
           <w:color w:val="555555"/>
           <w:sz w:val="22"/>
         </w:rPr>
-        <w:t>මේකයි හොඳ පර්යේෂණයක ලකුණ — අඩුපාඩු හංගන්නේ නෑ.</w:t>
+        <w:t>This is what makes it real research — nothing is hidden.</w:t>
       </w:r>
     </w:p>
     <w:tbl>
@@ -4328,10 +5114,18 @@
               <w:spacing w:after="40" w:before="40"/>
               <w:shd w:val="clear" w:fill="1F4E79"/>
             </w:pPr>
-            <w:r/>
             <w:r>
               <w:rPr>
-                <w:rFonts w:ascii="Nirmala UI" w:hAnsi="Nirmala UI" w:cs="Nirmala UI"/>
+                <w:rFonts w:ascii="Segoe UI" w:hAnsi="Segoe UI" w:cs="Segoe UI"/>
+                <w:b w:val="0"/>
+                <w:i w:val="0"/>
+                <w:color w:val="1A1A1A"/>
+                <w:sz w:val="20"/>
+              </w:rPr>
+            </w:r>
+            <w:r>
+              <w:rPr>
+                <w:rFonts w:ascii="Segoe UI" w:hAnsi="Segoe UI" w:cs="Segoe UI"/>
                 <w:b/>
                 <w:i w:val="0"/>
                 <w:color w:val="FFFFFF"/>
@@ -4351,16 +5145,24 @@
               <w:spacing w:after="40" w:before="40"/>
               <w:shd w:val="clear" w:fill="1F4E79"/>
             </w:pPr>
-            <w:r/>
             <w:r>
               <w:rPr>
-                <w:rFonts w:ascii="Nirmala UI" w:hAnsi="Nirmala UI" w:cs="Nirmala UI"/>
+                <w:rFonts w:ascii="Segoe UI" w:hAnsi="Segoe UI" w:cs="Segoe UI"/>
+                <w:b w:val="0"/>
+                <w:i w:val="0"/>
+                <w:color w:val="1A1A1A"/>
+                <w:sz w:val="20"/>
+              </w:rPr>
+            </w:r>
+            <w:r>
+              <w:rPr>
+                <w:rFonts w:ascii="Segoe UI" w:hAnsi="Segoe UI" w:cs="Segoe UI"/>
                 <w:b/>
                 <w:i w:val="0"/>
                 <w:color w:val="FFFFFF"/>
                 <w:sz w:val="20"/>
               </w:rPr>
-              <w:t>දුර්වලතාව</w:t>
+              <w:t>Weakness</w:t>
             </w:r>
           </w:p>
         </w:tc>
@@ -4374,16 +5176,24 @@
               <w:spacing w:after="40" w:before="40"/>
               <w:shd w:val="clear" w:fill="1F4E79"/>
             </w:pPr>
-            <w:r/>
             <w:r>
               <w:rPr>
-                <w:rFonts w:ascii="Nirmala UI" w:hAnsi="Nirmala UI" w:cs="Nirmala UI"/>
+                <w:rFonts w:ascii="Segoe UI" w:hAnsi="Segoe UI" w:cs="Segoe UI"/>
+                <w:b w:val="0"/>
+                <w:i w:val="0"/>
+                <w:color w:val="1A1A1A"/>
+                <w:sz w:val="20"/>
+              </w:rPr>
+            </w:r>
+            <w:r>
+              <w:rPr>
+                <w:rFonts w:ascii="Segoe UI" w:hAnsi="Segoe UI" w:cs="Segoe UI"/>
                 <w:b/>
                 <w:i w:val="0"/>
                 <w:color w:val="FFFFFF"/>
                 <w:sz w:val="20"/>
               </w:rPr>
-              <w:t>ඇයි ලිව්වේ</w:t>
+              <w:t>Why it is written down</w:t>
             </w:r>
           </w:p>
         </w:tc>
@@ -4397,10 +5207,18 @@
             <w:pPr>
               <w:spacing w:after="40" w:before="40"/>
             </w:pPr>
-            <w:r/>
             <w:r>
               <w:rPr>
-                <w:rFonts w:ascii="Nirmala UI" w:hAnsi="Nirmala UI" w:cs="Nirmala UI"/>
+                <w:rFonts w:ascii="Segoe UI" w:hAnsi="Segoe UI" w:cs="Segoe UI"/>
+                <w:b w:val="0"/>
+                <w:i w:val="0"/>
+                <w:color w:val="1A1A1A"/>
+                <w:sz w:val="20"/>
+              </w:rPr>
+            </w:r>
+            <w:r>
+              <w:rPr>
+                <w:rFonts w:ascii="Segoe UI" w:hAnsi="Segoe UI" w:cs="Segoe UI"/>
                 <w:b w:val="0"/>
                 <w:i w:val="0"/>
                 <w:color w:val="1A1A1A"/>
@@ -4418,16 +5236,24 @@
             <w:pPr>
               <w:spacing w:after="40" w:before="40"/>
             </w:pPr>
-            <w:r/>
             <w:r>
               <w:rPr>
-                <w:rFonts w:ascii="Nirmala UI" w:hAnsi="Nirmala UI" w:cs="Nirmala UI"/>
+                <w:rFonts w:ascii="Segoe UI" w:hAnsi="Segoe UI" w:cs="Segoe UI"/>
                 <w:b w:val="0"/>
                 <w:i w:val="0"/>
                 <w:color w:val="1A1A1A"/>
                 <w:sz w:val="20"/>
               </w:rPr>
-              <w:t>ඉරියව් අවදානම 20%කින් අඩු වුණේ නෑ (13–15% විතරයි)</w:t>
+            </w:r>
+            <w:r>
+              <w:rPr>
+                <w:rFonts w:ascii="Segoe UI" w:hAnsi="Segoe UI" w:cs="Segoe UI"/>
+                <w:b w:val="0"/>
+                <w:i w:val="0"/>
+                <w:color w:val="1A1A1A"/>
+                <w:sz w:val="20"/>
+              </w:rPr>
+              <w:t>Posture risk fell only 13–15%, not the 20% predicted</w:t>
             </w:r>
           </w:p>
         </w:tc>
@@ -4439,16 +5265,24 @@
             <w:pPr>
               <w:spacing w:after="40" w:before="40"/>
             </w:pPr>
-            <w:r/>
             <w:r>
               <w:rPr>
-                <w:rFonts w:ascii="Nirmala UI" w:hAnsi="Nirmala UI" w:cs="Nirmala UI"/>
+                <w:rFonts w:ascii="Segoe UI" w:hAnsi="Segoe UI" w:cs="Segoe UI"/>
                 <w:b w:val="0"/>
                 <w:i w:val="0"/>
                 <w:color w:val="1A1A1A"/>
                 <w:sz w:val="20"/>
               </w:rPr>
-              <w:t>අපේම උපකල්පනය සම්පූර්ණ වුණේ නෑ — ඒත් ඒකට ගණිතමය හේතුවක් තියෙනවා</w:t>
+            </w:r>
+            <w:r>
+              <w:rPr>
+                <w:rFonts w:ascii="Segoe UI" w:hAnsi="Segoe UI" w:cs="Segoe UI"/>
+                <w:b w:val="0"/>
+                <w:i w:val="0"/>
+                <w:color w:val="1A1A1A"/>
+                <w:sz w:val="20"/>
+              </w:rPr>
+              <w:t>our own prediction was not met — but there is an arithmetic reason</w:t>
             </w:r>
           </w:p>
         </w:tc>
@@ -4462,10 +5296,18 @@
             <w:pPr>
               <w:spacing w:after="40" w:before="40"/>
             </w:pPr>
-            <w:r/>
             <w:r>
               <w:rPr>
-                <w:rFonts w:ascii="Nirmala UI" w:hAnsi="Nirmala UI" w:cs="Nirmala UI"/>
+                <w:rFonts w:ascii="Segoe UI" w:hAnsi="Segoe UI" w:cs="Segoe UI"/>
+                <w:b w:val="0"/>
+                <w:i w:val="0"/>
+                <w:color w:val="1A1A1A"/>
+                <w:sz w:val="20"/>
+              </w:rPr>
+            </w:r>
+            <w:r>
+              <w:rPr>
+                <w:rFonts w:ascii="Segoe UI" w:hAnsi="Segoe UI" w:cs="Segoe UI"/>
                 <w:b w:val="0"/>
                 <w:i w:val="0"/>
                 <w:color w:val="1A1A1A"/>
@@ -4483,16 +5325,24 @@
             <w:pPr>
               <w:spacing w:after="40" w:before="40"/>
             </w:pPr>
-            <w:r/>
             <w:r>
               <w:rPr>
-                <w:rFonts w:ascii="Nirmala UI" w:hAnsi="Nirmala UI" w:cs="Nirmala UI"/>
+                <w:rFonts w:ascii="Segoe UI" w:hAnsi="Segoe UI" w:cs="Segoe UI"/>
                 <w:b w:val="0"/>
                 <w:i w:val="0"/>
                 <w:color w:val="1A1A1A"/>
                 <w:sz w:val="20"/>
               </w:rPr>
-              <w:t>වැඩ බෙදීම අසමානයි</w:t>
+            </w:r>
+            <w:r>
+              <w:rPr>
+                <w:rFonts w:ascii="Segoe UI" w:hAnsi="Segoe UI" w:cs="Segoe UI"/>
+                <w:b w:val="0"/>
+                <w:i w:val="0"/>
+                <w:color w:val="1A1A1A"/>
+                <w:sz w:val="20"/>
+              </w:rPr>
+              <w:t>Work was shared out less evenly</w:t>
             </w:r>
           </w:p>
         </w:tc>
@@ -4504,16 +5354,24 @@
             <w:pPr>
               <w:spacing w:after="40" w:before="40"/>
             </w:pPr>
-            <w:r/>
             <w:r>
               <w:rPr>
-                <w:rFonts w:ascii="Nirmala UI" w:hAnsi="Nirmala UI" w:cs="Nirmala UI"/>
+                <w:rFonts w:ascii="Segoe UI" w:hAnsi="Segoe UI" w:cs="Segoe UI"/>
                 <w:b w:val="0"/>
                 <w:i w:val="0"/>
                 <w:color w:val="1A1A1A"/>
                 <w:sz w:val="20"/>
               </w:rPr>
-              <w:t>අපිට විරුද්ධ ප්‍රතිඵලයක් — ඒත් හංගන්නේ නෑ</w:t>
+            </w:r>
+            <w:r>
+              <w:rPr>
+                <w:rFonts w:ascii="Segoe UI" w:hAnsi="Segoe UI" w:cs="Segoe UI"/>
+                <w:b w:val="0"/>
+                <w:i w:val="0"/>
+                <w:color w:val="1A1A1A"/>
+                <w:sz w:val="20"/>
+              </w:rPr>
+              <w:t>a result against us — reported in full anyway</w:t>
             </w:r>
           </w:p>
         </w:tc>
@@ -4527,10 +5385,18 @@
             <w:pPr>
               <w:spacing w:after="40" w:before="40"/>
             </w:pPr>
-            <w:r/>
             <w:r>
               <w:rPr>
-                <w:rFonts w:ascii="Nirmala UI" w:hAnsi="Nirmala UI" w:cs="Nirmala UI"/>
+                <w:rFonts w:ascii="Segoe UI" w:hAnsi="Segoe UI" w:cs="Segoe UI"/>
+                <w:b w:val="0"/>
+                <w:i w:val="0"/>
+                <w:color w:val="1A1A1A"/>
+                <w:sz w:val="20"/>
+              </w:rPr>
+            </w:r>
+            <w:r>
+              <w:rPr>
+                <w:rFonts w:ascii="Segoe UI" w:hAnsi="Segoe UI" w:cs="Segoe UI"/>
                 <w:b w:val="0"/>
                 <w:i w:val="0"/>
                 <w:color w:val="1A1A1A"/>
@@ -4548,16 +5414,24 @@
             <w:pPr>
               <w:spacing w:after="40" w:before="40"/>
             </w:pPr>
-            <w:r/>
             <w:r>
               <w:rPr>
-                <w:rFonts w:ascii="Nirmala UI" w:hAnsi="Nirmala UI" w:cs="Nirmala UI"/>
+                <w:rFonts w:ascii="Segoe UI" w:hAnsi="Segoe UI" w:cs="Segoe UI"/>
                 <w:b w:val="0"/>
                 <w:i w:val="0"/>
                 <w:color w:val="1A1A1A"/>
                 <w:sz w:val="20"/>
               </w:rPr>
-              <w:t>වේග දෙකක් (λ, μ) මනිලා නෑ, කැලිබ්‍රේට් කරලා</w:t>
+            </w:r>
+            <w:r>
+              <w:rPr>
+                <w:rFonts w:ascii="Segoe UI" w:hAnsi="Segoe UI" w:cs="Segoe UI"/>
+                <w:b w:val="0"/>
+                <w:i w:val="0"/>
+                <w:color w:val="1A1A1A"/>
+                <w:sz w:val="20"/>
+              </w:rPr>
+              <w:t>Two rates were calibrated, not measured</w:t>
             </w:r>
           </w:p>
         </w:tc>
@@ -4569,16 +5443,24 @@
             <w:pPr>
               <w:spacing w:after="40" w:before="40"/>
             </w:pPr>
-            <w:r/>
             <w:r>
               <w:rPr>
-                <w:rFonts w:ascii="Nirmala UI" w:hAnsi="Nirmala UI" w:cs="Nirmala UI"/>
+                <w:rFonts w:ascii="Segoe UI" w:hAnsi="Segoe UI" w:cs="Segoe UI"/>
                 <w:b w:val="0"/>
                 <w:i w:val="0"/>
                 <w:color w:val="1A1A1A"/>
                 <w:sz w:val="20"/>
               </w:rPr>
-              <w:t>0.5×–2× කරලා නිගමනය වෙනස් වෙන්නේ නෑ කියලා පෙන්නලා</w:t>
+            </w:r>
+            <w:r>
+              <w:rPr>
+                <w:rFonts w:ascii="Segoe UI" w:hAnsi="Segoe UI" w:cs="Segoe UI"/>
+                <w:b w:val="0"/>
+                <w:i w:val="0"/>
+                <w:color w:val="1A1A1A"/>
+                <w:sz w:val="20"/>
+              </w:rPr>
+              <w:t>varied from half to double; the conclusion did not change</w:t>
             </w:r>
           </w:p>
         </w:tc>
@@ -4592,10 +5474,18 @@
             <w:pPr>
               <w:spacing w:after="40" w:before="40"/>
             </w:pPr>
-            <w:r/>
             <w:r>
               <w:rPr>
-                <w:rFonts w:ascii="Nirmala UI" w:hAnsi="Nirmala UI" w:cs="Nirmala UI"/>
+                <w:rFonts w:ascii="Segoe UI" w:hAnsi="Segoe UI" w:cs="Segoe UI"/>
+                <w:b w:val="0"/>
+                <w:i w:val="0"/>
+                <w:color w:val="1A1A1A"/>
+                <w:sz w:val="20"/>
+              </w:rPr>
+            </w:r>
+            <w:r>
+              <w:rPr>
+                <w:rFonts w:ascii="Segoe UI" w:hAnsi="Segoe UI" w:cs="Segoe UI"/>
                 <w:b w:val="0"/>
                 <w:i w:val="0"/>
                 <w:color w:val="1A1A1A"/>
@@ -4613,16 +5503,24 @@
             <w:pPr>
               <w:spacing w:after="40" w:before="40"/>
             </w:pPr>
-            <w:r/>
             <w:r>
               <w:rPr>
-                <w:rFonts w:ascii="Nirmala UI" w:hAnsi="Nirmala UI" w:cs="Nirmala UI"/>
+                <w:rFonts w:ascii="Segoe UI" w:hAnsi="Segoe UI" w:cs="Segoe UI"/>
                 <w:b w:val="0"/>
                 <w:i w:val="0"/>
                 <w:color w:val="1A1A1A"/>
                 <w:sz w:val="20"/>
               </w:rPr>
-              <w:t>පැහැදිලි කිරීමේ ස්ථරය (L5) ලියලා නෑ</w:t>
+            </w:r>
+            <w:r>
+              <w:rPr>
+                <w:rFonts w:ascii="Segoe UI" w:hAnsi="Segoe UI" w:cs="Segoe UI"/>
+                <w:b w:val="0"/>
+                <w:i w:val="0"/>
+                <w:color w:val="1A1A1A"/>
+                <w:sz w:val="20"/>
+              </w:rPr>
+              <w:t>The explanation layer was not built</w:t>
             </w:r>
           </w:p>
         </w:tc>
@@ -4634,16 +5532,24 @@
             <w:pPr>
               <w:spacing w:after="40" w:before="40"/>
             </w:pPr>
-            <w:r/>
             <w:r>
               <w:rPr>
-                <w:rFonts w:ascii="Nirmala UI" w:hAnsi="Nirmala UI" w:cs="Nirmala UI"/>
+                <w:rFonts w:ascii="Segoe UI" w:hAnsi="Segoe UI" w:cs="Segoe UI"/>
                 <w:b w:val="0"/>
                 <w:i w:val="0"/>
                 <w:color w:val="1A1A1A"/>
                 <w:sz w:val="20"/>
               </w:rPr>
-              <w:t>Architecture එකේ තියෙනවා, ලියලා නෑ — ඒක කියලා තියෙනවා</w:t>
+            </w:r>
+            <w:r>
+              <w:rPr>
+                <w:rFonts w:ascii="Segoe UI" w:hAnsi="Segoe UI" w:cs="Segoe UI"/>
+                <w:b w:val="0"/>
+                <w:i w:val="0"/>
+                <w:color w:val="1A1A1A"/>
+                <w:sz w:val="20"/>
+              </w:rPr>
+              <w:t>it is in the design, not in the code — and the paper says so</w:t>
             </w:r>
           </w:p>
         </w:tc>
@@ -4657,10 +5563,18 @@
             <w:pPr>
               <w:spacing w:after="40" w:before="40"/>
             </w:pPr>
-            <w:r/>
             <w:r>
               <w:rPr>
-                <w:rFonts w:ascii="Nirmala UI" w:hAnsi="Nirmala UI" w:cs="Nirmala UI"/>
+                <w:rFonts w:ascii="Segoe UI" w:hAnsi="Segoe UI" w:cs="Segoe UI"/>
+                <w:b w:val="0"/>
+                <w:i w:val="0"/>
+                <w:color w:val="1A1A1A"/>
+                <w:sz w:val="20"/>
+              </w:rPr>
+            </w:r>
+            <w:r>
+              <w:rPr>
+                <w:rFonts w:ascii="Segoe UI" w:hAnsi="Segoe UI" w:cs="Segoe UI"/>
                 <w:b w:val="0"/>
                 <w:i w:val="0"/>
                 <w:color w:val="1A1A1A"/>
@@ -4678,16 +5592,24 @@
             <w:pPr>
               <w:spacing w:after="40" w:before="40"/>
             </w:pPr>
-            <w:r/>
             <w:r>
               <w:rPr>
-                <w:rFonts w:ascii="Nirmala UI" w:hAnsi="Nirmala UI" w:cs="Nirmala UI"/>
+                <w:rFonts w:ascii="Segoe UI" w:hAnsi="Segoe UI" w:cs="Segoe UI"/>
                 <w:b w:val="0"/>
                 <w:i w:val="0"/>
                 <w:color w:val="1A1A1A"/>
                 <w:sz w:val="20"/>
               </w:rPr>
-              <w:t>ඇත්ත කර්මාන්තශාලාවක පරීක්ෂා කරලා නෑ</w:t>
+            </w:r>
+            <w:r>
+              <w:rPr>
+                <w:rFonts w:ascii="Segoe UI" w:hAnsi="Segoe UI" w:cs="Segoe UI"/>
+                <w:b w:val="0"/>
+                <w:i w:val="0"/>
+                <w:color w:val="1A1A1A"/>
+                <w:sz w:val="20"/>
+              </w:rPr>
+              <w:t>Never tested in a real factory</w:t>
             </w:r>
           </w:p>
         </w:tc>
@@ -4699,16 +5621,24 @@
             <w:pPr>
               <w:spacing w:after="40" w:before="40"/>
             </w:pPr>
-            <w:r/>
             <w:r>
               <w:rPr>
-                <w:rFonts w:ascii="Nirmala UI" w:hAnsi="Nirmala UI" w:cs="Nirmala UI"/>
+                <w:rFonts w:ascii="Segoe UI" w:hAnsi="Segoe UI" w:cs="Segoe UI"/>
                 <w:b w:val="0"/>
                 <w:i w:val="0"/>
                 <w:color w:val="1A1A1A"/>
                 <w:sz w:val="20"/>
               </w:rPr>
-              <w:t>Simulation එකක් — ඒක පැහැදිලිව කියනවා</w:t>
+            </w:r>
+            <w:r>
+              <w:rPr>
+                <w:rFonts w:ascii="Segoe UI" w:hAnsi="Segoe UI" w:cs="Segoe UI"/>
+                <w:b w:val="0"/>
+                <w:i w:val="0"/>
+                <w:color w:val="1A1A1A"/>
+                <w:sz w:val="20"/>
+              </w:rPr>
+              <w:t>it is a simulation, and that is stated plainly</w:t>
             </w:r>
           </w:p>
         </w:tc>
@@ -4727,13 +5657,13 @@
       </w:pPr>
       <w:r>
         <w:rPr>
-          <w:rFonts w:ascii="Nirmala UI" w:hAnsi="Nirmala UI" w:cs="Nirmala UI"/>
+          <w:rFonts w:ascii="Segoe UI" w:hAnsi="Segoe UI" w:cs="Segoe UI"/>
           <w:b/>
           <w:i w:val="0"/>
           <w:color w:val="1F4E79"/>
           <w:sz w:val="22"/>
         </w:rPr>
-        <w:t>#2 එකේ ලස්සන දෙයක් තියෙනවා</w:t>
+        <w:t>There is something good hidden in #2</w:t>
       </w:r>
     </w:p>
     <w:p>
@@ -4744,13 +5674,13 @@
       </w:pPr>
       <w:r>
         <w:rPr>
-          <w:rFonts w:ascii="Nirmala UI" w:hAnsi="Nirmala UI" w:cs="Nirmala UI"/>
+          <w:rFonts w:ascii="Segoe UI" w:hAnsi="Segoe UI" w:cs="Segoe UI"/>
           <w:b w:val="0"/>
           <w:i w:val="0"/>
           <w:color w:val="1F4E79"/>
           <w:sz w:val="22"/>
         </w:rPr>
-        <w:t>වැඩ අසමානව බෙදෙන්නේ ඇයි කියලා හෙව්වම හම්බුණේ: OP1 (ශක්තිමත්ම කෙනා) ට බර වැඩ තහනම් — ඔහුගේ දක්ෂතාව 0.30, සීමාව 0.40. ඒ නිසා බර වැඩ යන්නේ දරාගන්න අඩුම හැකියාව ඇති දෙන්නාට.</w:t>
+        <w:t>Asking why the work was shared unevenly gave the answer: OP1, the strongest worker, is the only one barred from heavy jobs — his skill there is 0.30 against a floor of 0.40. So heavy work falls to the two least able to sustain it.</w:t>
       </w:r>
     </w:p>
     <w:p>
@@ -4761,13 +5691,13 @@
       </w:pPr>
       <w:r>
         <w:rPr>
-          <w:rFonts w:ascii="Nirmala UI" w:hAnsi="Nirmala UI" w:cs="Nirmala UI"/>
+          <w:rFonts w:ascii="Segoe UI" w:hAnsi="Segoe UI" w:cs="Segoe UI"/>
           <w:b w:val="0"/>
           <w:i w:val="0"/>
           <w:color w:val="1F4E79"/>
           <w:sz w:val="22"/>
         </w:rPr>
-        <w:t>ඒ එක දක්ෂතාව පුහුණු කළොත් පරතරයෙන් 2/3ක් වැහෙනවා, නිෂ්පාදනයත් වැඩි වෙනවා.</w:t>
+        <w:t>Training that one skill closes about two thirds of the gap and raises output as well.</w:t>
       </w:r>
     </w:p>
     <w:p>
@@ -4778,13 +5708,13 @@
       </w:pPr>
       <w:r>
         <w:rPr>
-          <w:rFonts w:ascii="Nirmala UI" w:hAnsi="Nirmala UI" w:cs="Nirmala UI"/>
+          <w:rFonts w:ascii="Segoe UI" w:hAnsi="Segoe UI" w:cs="Segoe UI"/>
           <w:b w:val="0"/>
           <w:i w:val="0"/>
           <w:color w:val="1F4E79"/>
           <w:sz w:val="22"/>
         </w:rPr>
-        <w:t>යන්ත්‍රය විතරක් බලන system එකකට මේ ප්‍රශ්නය අහන්නවත් බෑ — ඒකේ මිනිසාගේ ආකෘතියක්ම නෑ.</w:t>
+        <w:t>A machine-only system could not even ask this question — it has no model of the person to ask it about.</w:t>
       </w:r>
     </w:p>
     <w:p>
@@ -4793,28 +5723,28 @@
       </w:pPr>
       <w:r>
         <w:rPr>
-          <w:rFonts w:ascii="Nirmala UI" w:hAnsi="Nirmala UI" w:cs="Nirmala UI"/>
+          <w:rFonts w:ascii="Segoe UI" w:hAnsi="Segoe UI" w:cs="Segoe UI"/>
           <w:b/>
           <w:i w:val="0"/>
           <w:color w:val="1F4E79"/>
           <w:sz w:val="32"/>
         </w:rPr>
-        <w:t xml:space="preserve">🔟   </w:t>
+        <w:t xml:space="preserve">10   </w:t>
       </w:r>
       <w:r>
         <w:rPr>
-          <w:rFonts w:ascii="Nirmala UI" w:hAnsi="Nirmala UI" w:cs="Nirmala UI"/>
+          <w:rFonts w:ascii="Segoe UI" w:hAnsi="Segoe UI" w:cs="Segoe UI"/>
           <w:b/>
           <w:i w:val="0"/>
           <w:color w:val="1F4E79"/>
           <w:sz w:val="30"/>
         </w:rPr>
-        <w:t>මුළු දේම — වාක්‍ය 3කින්</w:t>
+        <w:t>The whole thing in three sentences</w:t>
       </w:r>
     </w:p>
     <w:p>
       <w:pPr>
-        <w:spacing w:after="160" w:before="0"/>
+        <w:spacing w:after="160"/>
         <w:pBdr>
           <w:bottom w:val="single" w:sz="6" w:color="1F4E79"/>
         </w:pBdr>
@@ -4827,7 +5757,7 @@
       </w:pPr>
       <w:r>
         <w:rPr>
-          <w:rFonts w:ascii="Nirmala UI" w:hAnsi="Nirmala UI" w:cs="Nirmala UI"/>
+          <w:rFonts w:ascii="Segoe UI" w:hAnsi="Segoe UI" w:cs="Segoe UI"/>
           <w:b/>
           <w:i w:val="0"/>
           <w:color w:val="1F4E79"/>
@@ -4837,13 +5767,13 @@
       </w:r>
       <w:r>
         <w:rPr>
-          <w:rFonts w:ascii="Nirmala UI" w:hAnsi="Nirmala UI" w:cs="Nirmala UI"/>
+          <w:rFonts w:ascii="Segoe UI" w:hAnsi="Segoe UI" w:cs="Segoe UI"/>
           <w:b w:val="0"/>
           <w:i w:val="0"/>
           <w:color w:val="1A1A1A"/>
           <w:sz w:val="24"/>
         </w:rPr>
-        <w:t>Industry 5.0 මිනිසා මධ්‍යයට ගෙන එනවා. ඒත් digital twins තවම යන්ත්‍ර ගැන විතරයි. මිනිසා ස්ථිතික දත්තයක් විතරයි.</w:t>
+        <w:t>Industry 5.0 puts the person at the centre. But digital twins are still about machines; the person is only static data.</w:t>
       </w:r>
     </w:p>
     <w:p>
@@ -4853,7 +5783,7 @@
       </w:pPr>
       <w:r>
         <w:rPr>
-          <w:rFonts w:ascii="Nirmala UI" w:hAnsi="Nirmala UI" w:cs="Nirmala UI"/>
+          <w:rFonts w:ascii="Segoe UI" w:hAnsi="Segoe UI" w:cs="Segoe UI"/>
           <w:b/>
           <w:i w:val="0"/>
           <w:color w:val="1F4E79"/>
@@ -4863,13 +5793,13 @@
       </w:r>
       <w:r>
         <w:rPr>
-          <w:rFonts w:ascii="Nirmala UI" w:hAnsi="Nirmala UI" w:cs="Nirmala UI"/>
+          <w:rFonts w:ascii="Segoe UI" w:hAnsi="Segoe UI" w:cs="Segoe UI"/>
           <w:b w:val="0"/>
           <w:i w:val="0"/>
           <w:color w:val="1A1A1A"/>
           <w:sz w:val="24"/>
         </w:rPr>
-        <w:t>අපි මිනිසාගේ වෙහෙස සජීවී තත්ත්වයක් කරලා, යන්ත්‍රයේ twin එකට සම්බන්ධ කරලා, මිනිසාගේ සීමා “දඩයක්” නොව “තහනමක්” කළා.</w:t>
+        <w:t>This work makes tiredness a live state, connects it to the machine's twin, and turns human limits from a “fine” into a “ban”.</w:t>
       </w:r>
     </w:p>
     <w:p>
@@ -4879,7 +5809,7 @@
       </w:pPr>
       <w:r>
         <w:rPr>
-          <w:rFonts w:ascii="Nirmala UI" w:hAnsi="Nirmala UI" w:cs="Nirmala UI"/>
+          <w:rFonts w:ascii="Segoe UI" w:hAnsi="Segoe UI" w:cs="Segoe UI"/>
           <w:b/>
           <w:i w:val="0"/>
           <w:color w:val="1F4E79"/>
@@ -4889,13 +5819,13 @@
       </w:r>
       <w:r>
         <w:rPr>
-          <w:rFonts w:ascii="Nirmala UI" w:hAnsi="Nirmala UI" w:cs="Nirmala UI"/>
+          <w:rFonts w:ascii="Segoe UI" w:hAnsi="Segoe UI" w:cs="Segoe UI"/>
           <w:b w:val="0"/>
           <w:i w:val="0"/>
           <w:color w:val="1A1A1A"/>
           <w:sz w:val="24"/>
         </w:rPr>
-        <w:t>ප්‍රතිඵලය: වෙහෙස −27%, විදුලිය −31%, නීති කැඩීම 79.5 → 0 — මනින්න පුළුවන් නිෂ්පාදන අලාභයක් නැතුව.</w:t>
+        <w:t>The result: tiredness down 27%, electricity down 31%, rules broken from 79.5 to zero — with no measurable loss of output.</w:t>
       </w:r>
     </w:p>
     <w:p/>
@@ -4907,13 +5837,13 @@
       </w:pPr>
       <w:r>
         <w:rPr>
-          <w:rFonts w:ascii="Nirmala UI" w:hAnsi="Nirmala UI" w:cs="Nirmala UI"/>
+          <w:rFonts w:ascii="Segoe UI" w:hAnsi="Segoe UI" w:cs="Segoe UI"/>
           <w:b/>
           <w:i w:val="0"/>
           <w:color w:val="555555"/>
           <w:sz w:val="20"/>
         </w:rPr>
-        <w:t>තව දැනගන්න:</w:t>
+        <w:t>Where to look next:</w:t>
       </w:r>
     </w:p>
     <w:p>
@@ -4924,13 +5854,13 @@
       </w:pPr>
       <w:r>
         <w:rPr>
-          <w:rFonts w:ascii="Nirmala UI" w:hAnsi="Nirmala UI" w:cs="Nirmala UI"/>
+          <w:rFonts w:ascii="Segoe UI" w:hAnsi="Segoe UI" w:cs="Segoe UI"/>
           <w:b w:val="0"/>
           <w:i w:val="0"/>
           <w:color w:val="555555"/>
           <w:sz w:val="20"/>
         </w:rPr>
-        <w:t>paper.docx — සම්පූර්ණ පත්‍රිකාව  ·  docs/14-demo-guide.md — supervisor ට පෙන්නන හැටි  ·  docs/12-paper-blueprint.md — හැම විස්තරයක්ම</w:t>
+        <w:t>paper.docx — the full paper  ·  docs/14-demo-guide.md — how to demonstrate it  ·  docs/12-paper-blueprint.md — every detail</w:t>
       </w:r>
     </w:p>
     <w:sectPr>

</xml_diff>